<commit_message>
Module prompts: Word guides open with the example queries; Appendix A the long prompt, Appendix B the setup guide; repo in brief
Co-Authored-By: Claude Opus 5.5 <noreply@anthropic.com>
Claude-Session: https://claude.ai/code/session_01VSHkeJ4eFkKsk4vddYXphE
</commit_message>
<xml_diff>
--- a/excel_ai/plans/prompts/CPAT-AI_Prompt_TransportCobenefits.docx
+++ b/excel_ai/plans/prompts/CPAT-AI_Prompt_TransportCobenefits.docx
@@ -46,7 +46,1389 @@
           <w:sz w:val="30"/>
           <w:szCs w:val="30"/>
         </w:rPr>
-        <w:t xml:space="preserve">1. What this does</w:t>
+        <w:t xml:space="preserve">1. Example queries</w:t>
+      </w:r>
+    </w:p>
+    <w:p>
+      <w:pPr>
+        <w:spacing w:after="120"/>
+      </w:pPr>
+      <w:r>
+        <w:rPr>
+          <w:rFonts w:ascii="Arial" w:cs="Arial" w:eastAsia="Arial" w:hAnsi="Arial"/>
+          <w:sz w:val="21"/>
+          <w:szCs w:val="21"/>
+        </w:rPr>
+        <w:t xml:space="preserve">Short prompts to type into GitHub Copilot (Current checkout, Claude Opus, Interactive). The long instructions are in </w:t>
+      </w:r>
+      <w:r>
+        <w:rPr>
+          <w:rFonts w:ascii="Consolas" w:cs="Consolas" w:eastAsia="Consolas" w:hAnsi="Consolas"/>
+          <w:sz w:val="19"/>
+          <w:szCs w:val="19"/>
+        </w:rPr>
+        <w:t xml:space="preserve">TCB_module_prompt.md</w:t>
+      </w:r>
+      <w:r>
+        <w:rPr>
+          <w:rFonts w:ascii="Arial" w:cs="Arial" w:eastAsia="Arial" w:hAnsi="Arial"/>
+          <w:sz w:val="21"/>
+          <w:szCs w:val="21"/>
+        </w:rPr>
+        <w:t xml:space="preserve">; Copilot reads them from the repo, so you never paste them. Send one prompt, read the report, then send the next.</w:t>
+      </w:r>
+    </w:p>
+    <w:p>
+      <w:pPr>
+        <w:pStyle w:val="Heading2"/>
+        <w:spacing w:after="100" w:before="200"/>
+      </w:pPr>
+      <w:r>
+        <w:rPr>
+          <w:rFonts w:ascii="Arial" w:cs="Arial" w:eastAsia="Arial" w:hAnsi="Arial"/>
+          <w:b/>
+          <w:bCs/>
+          <w:sz w:val="24"/>
+          <w:szCs w:val="24"/>
+        </w:rPr>
+        <w:t xml:space="preserve">Starter (new session)</w:t>
+      </w:r>
+    </w:p>
+    <w:p>
+      <w:pPr>
+        <w:spacing w:after="120"/>
+      </w:pPr>
+      <w:r>
+        <w:rPr>
+          <w:rFonts w:ascii="Arial" w:cs="Arial" w:eastAsia="Arial" w:hAnsi="Arial"/>
+          <w:sz w:val="21"/>
+          <w:szCs w:val="21"/>
+        </w:rPr>
+        <w:t xml:space="preserve">Type </w:t>
+      </w:r>
+      <w:r>
+        <w:rPr>
+          <w:rFonts w:ascii="Consolas" w:cs="Consolas" w:eastAsia="Consolas" w:hAnsi="Consolas"/>
+          <w:sz w:val="19"/>
+          <w:szCs w:val="19"/>
+        </w:rPr>
+        <w:t xml:space="preserve">@</w:t>
+      </w:r>
+      <w:r>
+        <w:rPr>
+          <w:rFonts w:ascii="Arial" w:cs="Arial" w:eastAsia="Arial" w:hAnsi="Arial"/>
+          <w:sz w:val="21"/>
+          <w:szCs w:val="21"/>
+        </w:rPr>
+        <w:t xml:space="preserve"> to attach the two files, then:</w:t>
+      </w:r>
+    </w:p>
+    <w:tbl>
+      <w:tblPr>
+        <w:tblW w:type="dxa" w:w="9360"/>
+        <w:tblBorders>
+          <w:top w:val="single" w:color="auto" w:sz="4"/>
+          <w:left w:val="single" w:color="auto" w:sz="4"/>
+          <w:bottom w:val="single" w:color="auto" w:sz="4"/>
+          <w:right w:val="single" w:color="auto" w:sz="4"/>
+          <w:insideH w:val="single" w:color="auto" w:sz="4"/>
+          <w:insideV w:val="single" w:color="auto" w:sz="4"/>
+        </w:tblBorders>
+      </w:tblPr>
+      <w:tblGrid>
+        <w:gridCol w:w="9360"/>
+      </w:tblGrid>
+      <w:tr>
+        <w:tc>
+          <w:tcPr>
+            <w:tcW w:type="dxa" w:w="9360"/>
+            <w:tcBorders>
+              <w:top w:val="single" w:color="BFBFBF" w:sz="6"/>
+              <w:left w:val="single" w:color="BFBFBF" w:sz="6"/>
+              <w:bottom w:val="single" w:color="BFBFBF" w:sz="6"/>
+              <w:right w:val="single" w:color="BFBFBF" w:sz="6"/>
+            </w:tcBorders>
+            <w:shd w:fill="F2F2F2" w:color="auto" w:val="clear"/>
+            <w:tcMar>
+              <w:top w:type="dxa" w:w="100"/>
+              <w:left w:type="dxa" w:w="140"/>
+              <w:bottom w:type="dxa" w:w="100"/>
+              <w:right w:type="dxa" w:w="140"/>
+            </w:tcMar>
+          </w:tcPr>
+          <w:p>
+            <w:pPr>
+              <w:spacing w:after="0"/>
+            </w:pPr>
+            <w:r>
+              <w:rPr>
+                <w:rFonts w:ascii="Consolas" w:cs="Consolas" w:eastAsia="Consolas" w:hAnsi="Consolas"/>
+                <w:sz w:val="18"/>
+                <w:szCs w:val="18"/>
+              </w:rPr>
+              <w:t xml:space="preserve">@AGENTS.md @excel_ai/plans/prompts/TCB_module_prompt.md Follow these files. Do phase 0 only, then stop and report.</w:t>
+            </w:r>
+          </w:p>
+        </w:tc>
+      </w:tr>
+    </w:tbl>
+    <w:p>
+      <w:pPr>
+        <w:spacing w:after="80"/>
+      </w:pPr>
+    </w:p>
+    <w:p>
+      <w:pPr>
+        <w:spacing w:after="120"/>
+      </w:pPr>
+      <w:r>
+        <w:rPr>
+          <w:rFonts w:ascii="Arial" w:cs="Arial" w:eastAsia="Arial" w:hAnsi="Arial"/>
+          <w:sz w:val="21"/>
+          <w:szCs w:val="21"/>
+        </w:rPr>
+        <w:t xml:space="preserve">If </w:t>
+      </w:r>
+      <w:r>
+        <w:rPr>
+          <w:rFonts w:ascii="Consolas" w:cs="Consolas" w:eastAsia="Consolas" w:hAnsi="Consolas"/>
+          <w:sz w:val="19"/>
+          <w:szCs w:val="19"/>
+        </w:rPr>
+        <w:t xml:space="preserve">excel_ai/plans/prompts/</w:t>
+      </w:r>
+      <w:r>
+        <w:rPr>
+          <w:rFonts w:ascii="Arial" w:cs="Arial" w:eastAsia="Arial" w:hAnsi="Arial"/>
+          <w:sz w:val="21"/>
+          <w:szCs w:val="21"/>
+        </w:rPr>
+        <w:t xml:space="preserve"> is not in your checkout, double-click </w:t>
+      </w:r>
+      <w:r>
+        <w:rPr>
+          <w:rFonts w:ascii="Consolas" w:cs="Consolas" w:eastAsia="Consolas" w:hAnsi="Consolas"/>
+          <w:sz w:val="19"/>
+          <w:szCs w:val="19"/>
+        </w:rPr>
+        <w:t xml:space="preserve">SyncRepo.bat</w:t>
+      </w:r>
+      <w:r>
+        <w:rPr>
+          <w:rFonts w:ascii="Arial" w:cs="Arial" w:eastAsia="Arial" w:hAnsi="Arial"/>
+          <w:sz w:val="21"/>
+          <w:szCs w:val="21"/>
+        </w:rPr>
+        <w:t xml:space="preserve"> first; if it is still missing, paste the whole of </w:t>
+      </w:r>
+      <w:r>
+        <w:rPr>
+          <w:rFonts w:ascii="Consolas" w:cs="Consolas" w:eastAsia="Consolas" w:hAnsi="Consolas"/>
+          <w:sz w:val="19"/>
+          <w:szCs w:val="19"/>
+        </w:rPr>
+        <w:t xml:space="preserve">TCB_module_prompt.md</w:t>
+      </w:r>
+      <w:r>
+        <w:rPr>
+          <w:rFonts w:ascii="Arial" w:cs="Arial" w:eastAsia="Arial" w:hAnsi="Arial"/>
+          <w:sz w:val="21"/>
+          <w:szCs w:val="21"/>
+        </w:rPr>
+        <w:t xml:space="preserve"> instead (Appendix A of the Word guide).</w:t>
+      </w:r>
+    </w:p>
+    <w:p>
+      <w:pPr>
+        <w:pStyle w:val="Heading2"/>
+        <w:spacing w:after="100" w:before="200"/>
+      </w:pPr>
+      <w:r>
+        <w:rPr>
+          <w:rFonts w:ascii="Arial" w:cs="Arial" w:eastAsia="Arial" w:hAnsi="Arial"/>
+          <w:b/>
+          <w:bCs/>
+          <w:sz w:val="24"/>
+          <w:szCs w:val="24"/>
+        </w:rPr>
+        <w:t xml:space="preserve">Starter queries</w:t>
+      </w:r>
+    </w:p>
+    <w:p>
+      <w:pPr>
+        <w:spacing w:after="120"/>
+      </w:pPr>
+      <w:r>
+        <w:rPr>
+          <w:rFonts w:ascii="Arial" w:cs="Arial" w:eastAsia="Arial" w:hAnsi="Arial"/>
+          <w:sz w:val="21"/>
+          <w:szCs w:val="21"/>
+        </w:rPr>
+        <w:t xml:space="preserve">One at a time, after the starter (or in a new session with the two files attached):</w:t>
+      </w:r>
+    </w:p>
+    <w:p>
+      <w:pPr>
+        <w:pStyle w:val="ListParagraph"/>
+        <w:numPr>
+          <w:ilvl w:val="0"/>
+          <w:numId w:val="2"/>
+        </w:numPr>
+        <w:spacing w:after="60"/>
+      </w:pPr>
+      <w:r>
+        <w:rPr>
+          <w:rFonts w:ascii="Arial" w:cs="Arial" w:eastAsia="Arial" w:hAnsi="Arial"/>
+          <w:sz w:val="21"/>
+          <w:szCs w:val="21"/>
+        </w:rPr>
+        <w:t xml:space="preserve">Build it, starting from what already exists</w:t>
+      </w:r>
+    </w:p>
+    <w:tbl>
+      <w:tblPr>
+        <w:tblW w:type="dxa" w:w="9360"/>
+        <w:tblBorders>
+          <w:top w:val="single" w:color="auto" w:sz="4"/>
+          <w:left w:val="single" w:color="auto" w:sz="4"/>
+          <w:bottom w:val="single" w:color="auto" w:sz="4"/>
+          <w:right w:val="single" w:color="auto" w:sz="4"/>
+          <w:insideH w:val="single" w:color="auto" w:sz="4"/>
+          <w:insideV w:val="single" w:color="auto" w:sz="4"/>
+        </w:tblBorders>
+      </w:tblPr>
+      <w:tblGrid>
+        <w:gridCol w:w="9360"/>
+      </w:tblGrid>
+      <w:tr>
+        <w:tc>
+          <w:tcPr>
+            <w:tcW w:type="dxa" w:w="9360"/>
+            <w:tcBorders>
+              <w:top w:val="single" w:color="BFBFBF" w:sz="6"/>
+              <w:left w:val="single" w:color="BFBFBF" w:sz="6"/>
+              <w:bottom w:val="single" w:color="BFBFBF" w:sz="6"/>
+              <w:right w:val="single" w:color="BFBFBF" w:sz="6"/>
+            </w:tcBorders>
+            <w:shd w:fill="F2F2F2" w:color="auto" w:val="clear"/>
+            <w:tcMar>
+              <w:top w:type="dxa" w:w="100"/>
+              <w:left w:type="dxa" w:w="140"/>
+              <w:bottom w:type="dxa" w:w="100"/>
+              <w:right w:type="dxa" w:w="140"/>
+            </w:tcMar>
+          </w:tcPr>
+          <w:p>
+            <w:pPr>
+              <w:spacing w:after="0"/>
+            </w:pPr>
+            <w:r>
+              <w:rPr>
+                <w:rFonts w:ascii="Consolas" w:cs="Consolas" w:eastAsia="Consolas" w:hAnsi="Consolas"/>
+                <w:sz w:val="18"/>
+                <w:szCs w:val="18"/>
+              </w:rPr>
+              <w:t xml:space="preserve">@AGENTS.md @excel_ai/plans/prompts/TCB_module_prompt.md Build the module, starting from what already exists: the plan `excel_ai/plans/Transport_cobenefits.md`, the legacy extracts in `data/mvp_legacy_extracts/`, `transport_model_ref.py`, the typed values of Mitigation's tab FromTransportCB and the distribution module's patterns. Do phase 0 only, then stop and report.</w:t>
+            </w:r>
+          </w:p>
+        </w:tc>
+      </w:tr>
+    </w:tbl>
+    <w:p>
+      <w:pPr>
+        <w:spacing w:after="80"/>
+      </w:pPr>
+    </w:p>
+    <w:p>
+      <w:pPr>
+        <w:pStyle w:val="ListParagraph"/>
+        <w:numPr>
+          <w:ilvl w:val="0"/>
+          <w:numId w:val="2"/>
+        </w:numPr>
+        <w:spacing w:after="60"/>
+      </w:pPr>
+      <w:r>
+        <w:rPr>
+          <w:rFonts w:ascii="Arial" w:cs="Arial" w:eastAsia="Arial" w:hAnsi="Arial"/>
+          <w:sz w:val="21"/>
+          <w:szCs w:val="21"/>
+        </w:rPr>
+        <w:t xml:space="preserve">Check it against legacy outputs</w:t>
+      </w:r>
+    </w:p>
+    <w:tbl>
+      <w:tblPr>
+        <w:tblW w:type="dxa" w:w="9360"/>
+        <w:tblBorders>
+          <w:top w:val="single" w:color="auto" w:sz="4"/>
+          <w:left w:val="single" w:color="auto" w:sz="4"/>
+          <w:bottom w:val="single" w:color="auto" w:sz="4"/>
+          <w:right w:val="single" w:color="auto" w:sz="4"/>
+          <w:insideH w:val="single" w:color="auto" w:sz="4"/>
+          <w:insideV w:val="single" w:color="auto" w:sz="4"/>
+        </w:tblBorders>
+      </w:tblPr>
+      <w:tblGrid>
+        <w:gridCol w:w="9360"/>
+      </w:tblGrid>
+      <w:tr>
+        <w:tc>
+          <w:tcPr>
+            <w:tcW w:type="dxa" w:w="9360"/>
+            <w:tcBorders>
+              <w:top w:val="single" w:color="BFBFBF" w:sz="6"/>
+              <w:left w:val="single" w:color="BFBFBF" w:sz="6"/>
+              <w:bottom w:val="single" w:color="BFBFBF" w:sz="6"/>
+              <w:right w:val="single" w:color="BFBFBF" w:sz="6"/>
+            </w:tcBorders>
+            <w:shd w:fill="F2F2F2" w:color="auto" w:val="clear"/>
+            <w:tcMar>
+              <w:top w:type="dxa" w:w="100"/>
+              <w:left w:type="dxa" w:w="140"/>
+              <w:bottom w:type="dxa" w:w="100"/>
+              <w:right w:type="dxa" w:w="140"/>
+            </w:tcMar>
+          </w:tcPr>
+          <w:p>
+            <w:pPr>
+              <w:spacing w:after="0"/>
+            </w:pPr>
+            <w:r>
+              <w:rPr>
+                <w:rFonts w:ascii="Consolas" w:cs="Consolas" w:eastAsia="Consolas" w:hAnsi="Consolas"/>
+                <w:sz w:val="18"/>
+                <w:szCs w:val="18"/>
+              </w:rPr>
+              <w:t xml:space="preserve">Check it against legacy outputs: compare the transport co-benefits module's results for Egypt with legacy 465's cached values, year by year, both scenarios. List every difference above 0.1% with its cause: a registered bug fix, a replicated issue, or unexplained (then find the cause).</w:t>
+            </w:r>
+          </w:p>
+        </w:tc>
+      </w:tr>
+    </w:tbl>
+    <w:p>
+      <w:pPr>
+        <w:spacing w:after="80"/>
+      </w:pPr>
+    </w:p>
+    <w:p>
+      <w:pPr>
+        <w:pStyle w:val="ListParagraph"/>
+        <w:numPr>
+          <w:ilvl w:val="0"/>
+          <w:numId w:val="2"/>
+        </w:numPr>
+        <w:spacing w:after="60"/>
+      </w:pPr>
+      <w:r>
+        <w:rPr>
+          <w:rFonts w:ascii="Arial" w:cs="Arial" w:eastAsia="Arial" w:hAnsi="Arial"/>
+          <w:sz w:val="21"/>
+          <w:szCs w:val="21"/>
+        </w:rPr>
+        <w:t xml:space="preserve">Produce a short PowerPoint, following the norms of the other documents</w:t>
+      </w:r>
+    </w:p>
+    <w:tbl>
+      <w:tblPr>
+        <w:tblW w:type="dxa" w:w="9360"/>
+        <w:tblBorders>
+          <w:top w:val="single" w:color="auto" w:sz="4"/>
+          <w:left w:val="single" w:color="auto" w:sz="4"/>
+          <w:bottom w:val="single" w:color="auto" w:sz="4"/>
+          <w:right w:val="single" w:color="auto" w:sz="4"/>
+          <w:insideH w:val="single" w:color="auto" w:sz="4"/>
+          <w:insideV w:val="single" w:color="auto" w:sz="4"/>
+        </w:tblBorders>
+      </w:tblPr>
+      <w:tblGrid>
+        <w:gridCol w:w="9360"/>
+      </w:tblGrid>
+      <w:tr>
+        <w:tc>
+          <w:tcPr>
+            <w:tcW w:type="dxa" w:w="9360"/>
+            <w:tcBorders>
+              <w:top w:val="single" w:color="BFBFBF" w:sz="6"/>
+              <w:left w:val="single" w:color="BFBFBF" w:sz="6"/>
+              <w:bottom w:val="single" w:color="BFBFBF" w:sz="6"/>
+              <w:right w:val="single" w:color="BFBFBF" w:sz="6"/>
+            </w:tcBorders>
+            <w:shd w:fill="F2F2F2" w:color="auto" w:val="clear"/>
+            <w:tcMar>
+              <w:top w:type="dxa" w:w="100"/>
+              <w:left w:type="dxa" w:w="140"/>
+              <w:bottom w:type="dxa" w:w="100"/>
+              <w:right w:type="dxa" w:w="140"/>
+            </w:tcMar>
+          </w:tcPr>
+          <w:p>
+            <w:pPr>
+              <w:spacing w:after="0"/>
+            </w:pPr>
+            <w:r>
+              <w:rPr>
+                <w:rFonts w:ascii="Consolas" w:cs="Consolas" w:eastAsia="Consolas" w:hAnsi="Consolas"/>
+                <w:sz w:val="18"/>
+                <w:szCs w:val="18"/>
+              </w:rPr>
+              <w:t xml:space="preserve">Produce a short PowerPoint (about 6 slides) on the transport co-benefits module: what it does, how it links to the other modules, the results for Egypt against legacy, the bugs fixed and issues replicated (codes), open decisions. Follow the norms of the other documents: the CPAT-AI Overview deck (`excel_ai/CPAT-AI_Overview_v&lt;version&gt;.pptx`, builder `excel_ai/mitigation/presentation/build_deck.js`), counts taken from the register, `NORMS.md` 5. Save it as `excel_ai/CPAT-AI_TransportCobenefits_Overview_v&lt;version&gt;.pptx`.</w:t>
+            </w:r>
+          </w:p>
+        </w:tc>
+      </w:tr>
+    </w:tbl>
+    <w:p>
+      <w:pPr>
+        <w:spacing w:after="80"/>
+      </w:pPr>
+    </w:p>
+    <w:p>
+      <w:pPr>
+        <w:pStyle w:val="ListParagraph"/>
+        <w:numPr>
+          <w:ilvl w:val="0"/>
+          <w:numId w:val="2"/>
+        </w:numPr>
+        <w:spacing w:after="60"/>
+      </w:pPr>
+      <w:r>
+        <w:rPr>
+          <w:rFonts w:ascii="Arial" w:cs="Arial" w:eastAsia="Arial" w:hAnsi="Arial"/>
+          <w:sz w:val="21"/>
+          <w:szCs w:val="21"/>
+        </w:rPr>
+        <w:t xml:space="preserve">Check that every bug found is in the registers</w:t>
+      </w:r>
+    </w:p>
+    <w:tbl>
+      <w:tblPr>
+        <w:tblW w:type="dxa" w:w="9360"/>
+        <w:tblBorders>
+          <w:top w:val="single" w:color="auto" w:sz="4"/>
+          <w:left w:val="single" w:color="auto" w:sz="4"/>
+          <w:bottom w:val="single" w:color="auto" w:sz="4"/>
+          <w:right w:val="single" w:color="auto" w:sz="4"/>
+          <w:insideH w:val="single" w:color="auto" w:sz="4"/>
+          <w:insideV w:val="single" w:color="auto" w:sz="4"/>
+        </w:tblBorders>
+      </w:tblPr>
+      <w:tblGrid>
+        <w:gridCol w:w="9360"/>
+      </w:tblGrid>
+      <w:tr>
+        <w:tc>
+          <w:tcPr>
+            <w:tcW w:type="dxa" w:w="9360"/>
+            <w:tcBorders>
+              <w:top w:val="single" w:color="BFBFBF" w:sz="6"/>
+              <w:left w:val="single" w:color="BFBFBF" w:sz="6"/>
+              <w:bottom w:val="single" w:color="BFBFBF" w:sz="6"/>
+              <w:right w:val="single" w:color="BFBFBF" w:sz="6"/>
+            </w:tcBorders>
+            <w:shd w:fill="F2F2F2" w:color="auto" w:val="clear"/>
+            <w:tcMar>
+              <w:top w:type="dxa" w:w="100"/>
+              <w:left w:type="dxa" w:w="140"/>
+              <w:bottom w:type="dxa" w:w="100"/>
+              <w:right w:type="dxa" w:w="140"/>
+            </w:tcMar>
+          </w:tcPr>
+          <w:p>
+            <w:pPr>
+              <w:spacing w:after="0"/>
+            </w:pPr>
+            <w:r>
+              <w:rPr>
+                <w:rFonts w:ascii="Consolas" w:cs="Consolas" w:eastAsia="Consolas" w:hAnsi="Consolas"/>
+                <w:sz w:val="18"/>
+                <w:szCs w:val="18"/>
+              </w:rPr>
+              <w:t xml:space="preserve">Check that every bug and issue you found is in the register (`excel_ai/mitigation/issues_register.py`, `make_legacy_fixes.py`), with its code, legacy cells and cross-references; regenerate `excel_ai/BUGS.md`, `excel_ai/ISSUES.md` and the tracker, and list what you added.</w:t>
+            </w:r>
+          </w:p>
+        </w:tc>
+      </w:tr>
+    </w:tbl>
+    <w:p>
+      <w:pPr>
+        <w:spacing w:after="80"/>
+      </w:pPr>
+    </w:p>
+    <w:p>
+      <w:pPr>
+        <w:pStyle w:val="ListParagraph"/>
+        <w:numPr>
+          <w:ilvl w:val="0"/>
+          <w:numId w:val="2"/>
+        </w:numPr>
+        <w:spacing w:after="60"/>
+      </w:pPr>
+      <w:r>
+        <w:rPr>
+          <w:rFonts w:ascii="Arial" w:cs="Arial" w:eastAsia="Arial" w:hAnsi="Arial"/>
+          <w:sz w:val="21"/>
+          <w:szCs w:val="21"/>
+        </w:rPr>
+        <w:t xml:space="preserve">Adjust what you do not like or what is missing</w:t>
+      </w:r>
+    </w:p>
+    <w:tbl>
+      <w:tblPr>
+        <w:tblW w:type="dxa" w:w="9360"/>
+        <w:tblBorders>
+          <w:top w:val="single" w:color="auto" w:sz="4"/>
+          <w:left w:val="single" w:color="auto" w:sz="4"/>
+          <w:bottom w:val="single" w:color="auto" w:sz="4"/>
+          <w:right w:val="single" w:color="auto" w:sz="4"/>
+          <w:insideH w:val="single" w:color="auto" w:sz="4"/>
+          <w:insideV w:val="single" w:color="auto" w:sz="4"/>
+        </w:tblBorders>
+      </w:tblPr>
+      <w:tblGrid>
+        <w:gridCol w:w="9360"/>
+      </w:tblGrid>
+      <w:tr>
+        <w:tc>
+          <w:tcPr>
+            <w:tcW w:type="dxa" w:w="9360"/>
+            <w:tcBorders>
+              <w:top w:val="single" w:color="BFBFBF" w:sz="6"/>
+              <w:left w:val="single" w:color="BFBFBF" w:sz="6"/>
+              <w:bottom w:val="single" w:color="BFBFBF" w:sz="6"/>
+              <w:right w:val="single" w:color="BFBFBF" w:sz="6"/>
+            </w:tcBorders>
+            <w:shd w:fill="F2F2F2" w:color="auto" w:val="clear"/>
+            <w:tcMar>
+              <w:top w:type="dxa" w:w="100"/>
+              <w:left w:type="dxa" w:w="140"/>
+              <w:bottom w:type="dxa" w:w="100"/>
+              <w:right w:type="dxa" w:w="140"/>
+            </w:tcMar>
+          </w:tcPr>
+          <w:p>
+            <w:pPr>
+              <w:spacing w:after="0"/>
+            </w:pPr>
+            <w:r>
+              <w:rPr>
+                <w:rFonts w:ascii="Consolas" w:cs="Consolas" w:eastAsia="Consolas" w:hAnsi="Consolas"/>
+                <w:sz w:val="18"/>
+                <w:szCs w:val="18"/>
+              </w:rPr>
+              <w:t xml:space="preserve">I found I don't like format (x) / you are lacking output (y): please adjust. Change the builder, not the built workbook; rebuild, rerun the check and show me the result.</w:t>
+            </w:r>
+          </w:p>
+        </w:tc>
+      </w:tr>
+    </w:tbl>
+    <w:p>
+      <w:pPr>
+        <w:spacing w:after="80"/>
+      </w:pPr>
+    </w:p>
+    <w:p>
+      <w:pPr>
+        <w:pStyle w:val="Heading2"/>
+        <w:spacing w:after="100" w:before="200"/>
+      </w:pPr>
+      <w:r>
+        <w:rPr>
+          <w:rFonts w:ascii="Arial" w:cs="Arial" w:eastAsia="Arial" w:hAnsi="Arial"/>
+          <w:b/>
+          <w:bCs/>
+          <w:sz w:val="24"/>
+          <w:szCs w:val="24"/>
+        </w:rPr>
+        <w:t xml:space="preserve">Next phases</w:t>
+      </w:r>
+    </w:p>
+    <w:tbl>
+      <w:tblPr>
+        <w:tblW w:type="dxa" w:w="9360"/>
+        <w:tblBorders>
+          <w:top w:val="single" w:color="auto" w:sz="4"/>
+          <w:left w:val="single" w:color="auto" w:sz="4"/>
+          <w:bottom w:val="single" w:color="auto" w:sz="4"/>
+          <w:right w:val="single" w:color="auto" w:sz="4"/>
+          <w:insideH w:val="single" w:color="auto" w:sz="4"/>
+          <w:insideV w:val="single" w:color="auto" w:sz="4"/>
+        </w:tblBorders>
+      </w:tblPr>
+      <w:tblGrid>
+        <w:gridCol w:w="9360"/>
+      </w:tblGrid>
+      <w:tr>
+        <w:tc>
+          <w:tcPr>
+            <w:tcW w:type="dxa" w:w="9360"/>
+            <w:tcBorders>
+              <w:top w:val="single" w:color="BFBFBF" w:sz="6"/>
+              <w:left w:val="single" w:color="BFBFBF" w:sz="6"/>
+              <w:bottom w:val="single" w:color="BFBFBF" w:sz="6"/>
+              <w:right w:val="single" w:color="BFBFBF" w:sz="6"/>
+            </w:tcBorders>
+            <w:shd w:fill="F2F2F2" w:color="auto" w:val="clear"/>
+            <w:tcMar>
+              <w:top w:type="dxa" w:w="100"/>
+              <w:left w:type="dxa" w:w="140"/>
+              <w:bottom w:type="dxa" w:w="100"/>
+              <w:right w:type="dxa" w:w="140"/>
+            </w:tcMar>
+          </w:tcPr>
+          <w:p>
+            <w:pPr>
+              <w:spacing w:after="0"/>
+            </w:pPr>
+            <w:r>
+              <w:rPr>
+                <w:rFonts w:ascii="Consolas" w:cs="Consolas" w:eastAsia="Consolas" w:hAnsi="Consolas"/>
+                <w:sz w:val="18"/>
+                <w:szCs w:val="18"/>
+              </w:rPr>
+              <w:t xml:space="preserve">Go ahead with phase 1.</w:t>
+            </w:r>
+          </w:p>
+        </w:tc>
+      </w:tr>
+    </w:tbl>
+    <w:p>
+      <w:pPr>
+        <w:spacing w:after="80"/>
+      </w:pPr>
+    </w:p>
+    <w:tbl>
+      <w:tblPr>
+        <w:tblW w:type="dxa" w:w="9360"/>
+        <w:tblBorders>
+          <w:top w:val="single" w:color="auto" w:sz="4"/>
+          <w:left w:val="single" w:color="auto" w:sz="4"/>
+          <w:bottom w:val="single" w:color="auto" w:sz="4"/>
+          <w:right w:val="single" w:color="auto" w:sz="4"/>
+          <w:insideH w:val="single" w:color="auto" w:sz="4"/>
+          <w:insideV w:val="single" w:color="auto" w:sz="4"/>
+        </w:tblBorders>
+      </w:tblPr>
+      <w:tblGrid>
+        <w:gridCol w:w="9360"/>
+      </w:tblGrid>
+      <w:tr>
+        <w:tc>
+          <w:tcPr>
+            <w:tcW w:type="dxa" w:w="9360"/>
+            <w:tcBorders>
+              <w:top w:val="single" w:color="BFBFBF" w:sz="6"/>
+              <w:left w:val="single" w:color="BFBFBF" w:sz="6"/>
+              <w:bottom w:val="single" w:color="BFBFBF" w:sz="6"/>
+              <w:right w:val="single" w:color="BFBFBF" w:sz="6"/>
+            </w:tcBorders>
+            <w:shd w:fill="F2F2F2" w:color="auto" w:val="clear"/>
+            <w:tcMar>
+              <w:top w:type="dxa" w:w="100"/>
+              <w:left w:type="dxa" w:w="140"/>
+              <w:bottom w:type="dxa" w:w="100"/>
+              <w:right w:type="dxa" w:w="140"/>
+            </w:tcMar>
+          </w:tcPr>
+          <w:p>
+            <w:pPr>
+              <w:spacing w:after="0"/>
+            </w:pPr>
+            <w:r>
+              <w:rPr>
+                <w:rFonts w:ascii="Consolas" w:cs="Consolas" w:eastAsia="Consolas" w:hAnsi="Consolas"/>
+                <w:sz w:val="18"/>
+                <w:szCs w:val="18"/>
+              </w:rPr>
+              <w:t xml:space="preserve">Go ahead with phase 2.</w:t>
+            </w:r>
+          </w:p>
+        </w:tc>
+      </w:tr>
+    </w:tbl>
+    <w:p>
+      <w:pPr>
+        <w:spacing w:after="80"/>
+      </w:pPr>
+    </w:p>
+    <w:tbl>
+      <w:tblPr>
+        <w:tblW w:type="dxa" w:w="9360"/>
+        <w:tblBorders>
+          <w:top w:val="single" w:color="auto" w:sz="4"/>
+          <w:left w:val="single" w:color="auto" w:sz="4"/>
+          <w:bottom w:val="single" w:color="auto" w:sz="4"/>
+          <w:right w:val="single" w:color="auto" w:sz="4"/>
+          <w:insideH w:val="single" w:color="auto" w:sz="4"/>
+          <w:insideV w:val="single" w:color="auto" w:sz="4"/>
+        </w:tblBorders>
+      </w:tblPr>
+      <w:tblGrid>
+        <w:gridCol w:w="9360"/>
+      </w:tblGrid>
+      <w:tr>
+        <w:tc>
+          <w:tcPr>
+            <w:tcW w:type="dxa" w:w="9360"/>
+            <w:tcBorders>
+              <w:top w:val="single" w:color="BFBFBF" w:sz="6"/>
+              <w:left w:val="single" w:color="BFBFBF" w:sz="6"/>
+              <w:bottom w:val="single" w:color="BFBFBF" w:sz="6"/>
+              <w:right w:val="single" w:color="BFBFBF" w:sz="6"/>
+            </w:tcBorders>
+            <w:shd w:fill="F2F2F2" w:color="auto" w:val="clear"/>
+            <w:tcMar>
+              <w:top w:type="dxa" w:w="100"/>
+              <w:left w:type="dxa" w:w="140"/>
+              <w:bottom w:type="dxa" w:w="100"/>
+              <w:right w:type="dxa" w:w="140"/>
+            </w:tcMar>
+          </w:tcPr>
+          <w:p>
+            <w:pPr>
+              <w:spacing w:after="0"/>
+            </w:pPr>
+            <w:r>
+              <w:rPr>
+                <w:rFonts w:ascii="Consolas" w:cs="Consolas" w:eastAsia="Consolas" w:hAnsi="Consolas"/>
+                <w:sz w:val="18"/>
+                <w:szCs w:val="18"/>
+              </w:rPr>
+              <w:t xml:space="preserve">Go ahead with phase 3.</w:t>
+            </w:r>
+          </w:p>
+        </w:tc>
+      </w:tr>
+    </w:tbl>
+    <w:p>
+      <w:pPr>
+        <w:spacing w:after="80"/>
+      </w:pPr>
+    </w:p>
+    <w:tbl>
+      <w:tblPr>
+        <w:tblW w:type="dxa" w:w="9360"/>
+        <w:tblBorders>
+          <w:top w:val="single" w:color="auto" w:sz="4"/>
+          <w:left w:val="single" w:color="auto" w:sz="4"/>
+          <w:bottom w:val="single" w:color="auto" w:sz="4"/>
+          <w:right w:val="single" w:color="auto" w:sz="4"/>
+          <w:insideH w:val="single" w:color="auto" w:sz="4"/>
+          <w:insideV w:val="single" w:color="auto" w:sz="4"/>
+        </w:tblBorders>
+      </w:tblPr>
+      <w:tblGrid>
+        <w:gridCol w:w="9360"/>
+      </w:tblGrid>
+      <w:tr>
+        <w:tc>
+          <w:tcPr>
+            <w:tcW w:type="dxa" w:w="9360"/>
+            <w:tcBorders>
+              <w:top w:val="single" w:color="BFBFBF" w:sz="6"/>
+              <w:left w:val="single" w:color="BFBFBF" w:sz="6"/>
+              <w:bottom w:val="single" w:color="BFBFBF" w:sz="6"/>
+              <w:right w:val="single" w:color="BFBFBF" w:sz="6"/>
+            </w:tcBorders>
+            <w:shd w:fill="F2F2F2" w:color="auto" w:val="clear"/>
+            <w:tcMar>
+              <w:top w:type="dxa" w:w="100"/>
+              <w:left w:type="dxa" w:w="140"/>
+              <w:bottom w:type="dxa" w:w="100"/>
+              <w:right w:type="dxa" w:w="140"/>
+            </w:tcMar>
+          </w:tcPr>
+          <w:p>
+            <w:pPr>
+              <w:spacing w:after="0"/>
+            </w:pPr>
+            <w:r>
+              <w:rPr>
+                <w:rFonts w:ascii="Consolas" w:cs="Consolas" w:eastAsia="Consolas" w:hAnsi="Consolas"/>
+                <w:sz w:val="18"/>
+                <w:szCs w:val="18"/>
+              </w:rPr>
+              <w:t xml:space="preserve">Go ahead with phase 4.</w:t>
+            </w:r>
+          </w:p>
+        </w:tc>
+      </w:tr>
+    </w:tbl>
+    <w:p>
+      <w:pPr>
+        <w:spacing w:after="80"/>
+      </w:pPr>
+    </w:p>
+    <w:tbl>
+      <w:tblPr>
+        <w:tblW w:type="dxa" w:w="9360"/>
+        <w:tblBorders>
+          <w:top w:val="single" w:color="auto" w:sz="4"/>
+          <w:left w:val="single" w:color="auto" w:sz="4"/>
+          <w:bottom w:val="single" w:color="auto" w:sz="4"/>
+          <w:right w:val="single" w:color="auto" w:sz="4"/>
+          <w:insideH w:val="single" w:color="auto" w:sz="4"/>
+          <w:insideV w:val="single" w:color="auto" w:sz="4"/>
+        </w:tblBorders>
+      </w:tblPr>
+      <w:tblGrid>
+        <w:gridCol w:w="9360"/>
+      </w:tblGrid>
+      <w:tr>
+        <w:tc>
+          <w:tcPr>
+            <w:tcW w:type="dxa" w:w="9360"/>
+            <w:tcBorders>
+              <w:top w:val="single" w:color="BFBFBF" w:sz="6"/>
+              <w:left w:val="single" w:color="BFBFBF" w:sz="6"/>
+              <w:bottom w:val="single" w:color="BFBFBF" w:sz="6"/>
+              <w:right w:val="single" w:color="BFBFBF" w:sz="6"/>
+            </w:tcBorders>
+            <w:shd w:fill="F2F2F2" w:color="auto" w:val="clear"/>
+            <w:tcMar>
+              <w:top w:type="dxa" w:w="100"/>
+              <w:left w:type="dxa" w:w="140"/>
+              <w:bottom w:type="dxa" w:w="100"/>
+              <w:right w:type="dxa" w:w="140"/>
+            </w:tcMar>
+          </w:tcPr>
+          <w:p>
+            <w:pPr>
+              <w:spacing w:after="0"/>
+            </w:pPr>
+            <w:r>
+              <w:rPr>
+                <w:rFonts w:ascii="Consolas" w:cs="Consolas" w:eastAsia="Consolas" w:hAnsi="Consolas"/>
+                <w:sz w:val="18"/>
+                <w:szCs w:val="18"/>
+              </w:rPr>
+              <w:t xml:space="preserve">Go ahead with phase 5.</w:t>
+            </w:r>
+          </w:p>
+        </w:tc>
+      </w:tr>
+    </w:tbl>
+    <w:p>
+      <w:pPr>
+        <w:spacing w:after="80"/>
+      </w:pPr>
+    </w:p>
+    <w:p>
+      <w:pPr>
+        <w:pStyle w:val="Heading2"/>
+        <w:spacing w:after="100" w:before="200"/>
+      </w:pPr>
+      <w:r>
+        <w:rPr>
+          <w:rFonts w:ascii="Arial" w:cs="Arial" w:eastAsia="Arial" w:hAnsi="Arial"/>
+          <w:b/>
+          <w:bCs/>
+          <w:sz w:val="24"/>
+          <w:szCs w:val="24"/>
+        </w:rPr>
+        <w:t xml:space="preserve">Example follow-ups</w:t>
+      </w:r>
+    </w:p>
+    <w:p>
+      <w:pPr>
+        <w:spacing w:after="120"/>
+      </w:pPr>
+      <w:r>
+        <w:rPr>
+          <w:rFonts w:ascii="Arial" w:cs="Arial" w:eastAsia="Arial" w:hAnsi="Arial"/>
+          <w:sz w:val="21"/>
+          <w:szCs w:val="21"/>
+        </w:rPr>
+        <w:t xml:space="preserve">Answer the decisions it asks for (example only: use your own decisions):</w:t>
+      </w:r>
+    </w:p>
+    <w:tbl>
+      <w:tblPr>
+        <w:tblW w:type="dxa" w:w="9360"/>
+        <w:tblBorders>
+          <w:top w:val="single" w:color="auto" w:sz="4"/>
+          <w:left w:val="single" w:color="auto" w:sz="4"/>
+          <w:bottom w:val="single" w:color="auto" w:sz="4"/>
+          <w:right w:val="single" w:color="auto" w:sz="4"/>
+          <w:insideH w:val="single" w:color="auto" w:sz="4"/>
+          <w:insideV w:val="single" w:color="auto" w:sz="4"/>
+        </w:tblBorders>
+      </w:tblPr>
+      <w:tblGrid>
+        <w:gridCol w:w="9360"/>
+      </w:tblGrid>
+      <w:tr>
+        <w:tc>
+          <w:tcPr>
+            <w:tcW w:type="dxa" w:w="9360"/>
+            <w:tcBorders>
+              <w:top w:val="single" w:color="BFBFBF" w:sz="6"/>
+              <w:left w:val="single" w:color="BFBFBF" w:sz="6"/>
+              <w:bottom w:val="single" w:color="BFBFBF" w:sz="6"/>
+              <w:right w:val="single" w:color="BFBFBF" w:sz="6"/>
+            </w:tcBorders>
+            <w:shd w:fill="F2F2F2" w:color="auto" w:val="clear"/>
+            <w:tcMar>
+              <w:top w:type="dxa" w:w="100"/>
+              <w:left w:type="dxa" w:w="140"/>
+              <w:bottom w:type="dxa" w:w="100"/>
+              <w:right w:type="dxa" w:w="140"/>
+            </w:tcMar>
+          </w:tcPr>
+          <w:p>
+            <w:pPr>
+              <w:spacing w:after="0"/>
+            </w:pPr>
+            <w:r>
+              <w:rPr>
+                <w:rFonts w:ascii="Consolas" w:cs="Consolas" w:eastAsia="Consolas" w:hAnsi="Consolas"/>
+                <w:sz w:val="18"/>
+                <w:szCs w:val="18"/>
+              </w:rPr>
+              <w:t xml:space="preserve">Decisions: B-c replicate as an issue (legacy uses 100% of the after-tax wage); B-d fix as a bug; B-e replicate as an issue. D5: gasoline and diesel only. D7: charts of vehicle-km, deaths, congestion and road damage; skip the historical scatter. D8: import the whole Tran_Elast table. Record these in the register, then go ahead with phase 1.</w:t>
+            </w:r>
+          </w:p>
+        </w:tc>
+      </w:tr>
+    </w:tbl>
+    <w:p>
+      <w:pPr>
+        <w:spacing w:after="80"/>
+      </w:pPr>
+    </w:p>
+    <w:p>
+      <w:pPr>
+        <w:spacing w:after="120"/>
+      </w:pPr>
+      <w:r>
+        <w:rPr>
+          <w:rFonts w:ascii="Arial" w:cs="Arial" w:eastAsia="Arial" w:hAnsi="Arial"/>
+          <w:sz w:val="21"/>
+          <w:szCs w:val="21"/>
+        </w:rPr>
+        <w:t xml:space="preserve">Ask for an explanation:</w:t>
+      </w:r>
+    </w:p>
+    <w:tbl>
+      <w:tblPr>
+        <w:tblW w:type="dxa" w:w="9360"/>
+        <w:tblBorders>
+          <w:top w:val="single" w:color="auto" w:sz="4"/>
+          <w:left w:val="single" w:color="auto" w:sz="4"/>
+          <w:bottom w:val="single" w:color="auto" w:sz="4"/>
+          <w:right w:val="single" w:color="auto" w:sz="4"/>
+          <w:insideH w:val="single" w:color="auto" w:sz="4"/>
+          <w:insideV w:val="single" w:color="auto" w:sz="4"/>
+        </w:tblBorders>
+      </w:tblPr>
+      <w:tblGrid>
+        <w:gridCol w:w="9360"/>
+      </w:tblGrid>
+      <w:tr>
+        <w:tc>
+          <w:tcPr>
+            <w:tcW w:type="dxa" w:w="9360"/>
+            <w:tcBorders>
+              <w:top w:val="single" w:color="BFBFBF" w:sz="6"/>
+              <w:left w:val="single" w:color="BFBFBF" w:sz="6"/>
+              <w:bottom w:val="single" w:color="BFBFBF" w:sz="6"/>
+              <w:right w:val="single" w:color="BFBFBF" w:sz="6"/>
+            </w:tcBorders>
+            <w:shd w:fill="F2F2F2" w:color="auto" w:val="clear"/>
+            <w:tcMar>
+              <w:top w:type="dxa" w:w="100"/>
+              <w:left w:type="dxa" w:w="140"/>
+              <w:bottom w:type="dxa" w:w="100"/>
+              <w:right w:type="dxa" w:w="140"/>
+            </w:tcMar>
+          </w:tcPr>
+          <w:p>
+            <w:pPr>
+              <w:spacing w:after="0"/>
+            </w:pPr>
+            <w:r>
+              <w:rPr>
+                <w:rFonts w:ascii="Consolas" w:cs="Consolas" w:eastAsia="Consolas" w:hAnsi="Consolas"/>
+                <w:sz w:val="18"/>
+                <w:szCs w:val="18"/>
+              </w:rPr>
+              <w:t xml:space="preserve">Explain in plain words, with the Egypt numbers for 2030, how the Legacy and Engineer modes differ and why legacy is inconsistent.</w:t>
+            </w:r>
+          </w:p>
+        </w:tc>
+      </w:tr>
+    </w:tbl>
+    <w:p>
+      <w:pPr>
+        <w:spacing w:after="80"/>
+      </w:pPr>
+    </w:p>
+    <w:p>
+      <w:pPr>
+        <w:spacing w:after="120"/>
+      </w:pPr>
+      <w:r>
+        <w:rPr>
+          <w:rFonts w:ascii="Arial" w:cs="Arial" w:eastAsia="Arial" w:hAnsi="Arial"/>
+          <w:sz w:val="21"/>
+          <w:szCs w:val="21"/>
+        </w:rPr>
+        <w:t xml:space="preserve">When a check fails:</w:t>
+      </w:r>
+    </w:p>
+    <w:tbl>
+      <w:tblPr>
+        <w:tblW w:type="dxa" w:w="9360"/>
+        <w:tblBorders>
+          <w:top w:val="single" w:color="auto" w:sz="4"/>
+          <w:left w:val="single" w:color="auto" w:sz="4"/>
+          <w:bottom w:val="single" w:color="auto" w:sz="4"/>
+          <w:right w:val="single" w:color="auto" w:sz="4"/>
+          <w:insideH w:val="single" w:color="auto" w:sz="4"/>
+          <w:insideV w:val="single" w:color="auto" w:sz="4"/>
+        </w:tblBorders>
+      </w:tblPr>
+      <w:tblGrid>
+        <w:gridCol w:w="9360"/>
+      </w:tblGrid>
+      <w:tr>
+        <w:tc>
+          <w:tcPr>
+            <w:tcW w:type="dxa" w:w="9360"/>
+            <w:tcBorders>
+              <w:top w:val="single" w:color="BFBFBF" w:sz="6"/>
+              <w:left w:val="single" w:color="BFBFBF" w:sz="6"/>
+              <w:bottom w:val="single" w:color="BFBFBF" w:sz="6"/>
+              <w:right w:val="single" w:color="BFBFBF" w:sz="6"/>
+            </w:tcBorders>
+            <w:shd w:fill="F2F2F2" w:color="auto" w:val="clear"/>
+            <w:tcMar>
+              <w:top w:type="dxa" w:w="100"/>
+              <w:left w:type="dxa" w:w="140"/>
+              <w:bottom w:type="dxa" w:w="100"/>
+              <w:right w:type="dxa" w:w="140"/>
+            </w:tcMar>
+          </w:tcPr>
+          <w:p>
+            <w:pPr>
+              <w:spacing w:after="0"/>
+            </w:pPr>
+            <w:r>
+              <w:rPr>
+                <w:rFonts w:ascii="Consolas" w:cs="Consolas" w:eastAsia="Consolas" w:hAnsi="Consolas"/>
+                <w:sz w:val="18"/>
+                <w:szCs w:val="18"/>
+              </w:rPr>
+              <w:t xml:space="preserve">check_tcb.py fails on &lt;name of the check&gt;. Find the cause, fix the builder (not the check), rebuild and run the check again. Tell me what was wrong.</w:t>
+            </w:r>
+          </w:p>
+        </w:tc>
+      </w:tr>
+    </w:tbl>
+    <w:p>
+      <w:pPr>
+        <w:spacing w:after="80"/>
+      </w:pPr>
+    </w:p>
+    <w:p>
+      <w:pPr>
+        <w:spacing w:after="120"/>
+      </w:pPr>
+      <w:r>
+        <w:rPr>
+          <w:rFonts w:ascii="Arial" w:cs="Arial" w:eastAsia="Arial" w:hAnsi="Arial"/>
+          <w:sz w:val="21"/>
+          <w:szCs w:val="21"/>
+        </w:rPr>
+        <w:t xml:space="preserve">Before you save:</w:t>
+      </w:r>
+    </w:p>
+    <w:tbl>
+      <w:tblPr>
+        <w:tblW w:type="dxa" w:w="9360"/>
+        <w:tblBorders>
+          <w:top w:val="single" w:color="auto" w:sz="4"/>
+          <w:left w:val="single" w:color="auto" w:sz="4"/>
+          <w:bottom w:val="single" w:color="auto" w:sz="4"/>
+          <w:right w:val="single" w:color="auto" w:sz="4"/>
+          <w:insideH w:val="single" w:color="auto" w:sz="4"/>
+          <w:insideV w:val="single" w:color="auto" w:sz="4"/>
+        </w:tblBorders>
+      </w:tblPr>
+      <w:tblGrid>
+        <w:gridCol w:w="9360"/>
+      </w:tblGrid>
+      <w:tr>
+        <w:tc>
+          <w:tcPr>
+            <w:tcW w:type="dxa" w:w="9360"/>
+            <w:tcBorders>
+              <w:top w:val="single" w:color="BFBFBF" w:sz="6"/>
+              <w:left w:val="single" w:color="BFBFBF" w:sz="6"/>
+              <w:bottom w:val="single" w:color="BFBFBF" w:sz="6"/>
+              <w:right w:val="single" w:color="BFBFBF" w:sz="6"/>
+            </w:tcBorders>
+            <w:shd w:fill="F2F2F2" w:color="auto" w:val="clear"/>
+            <w:tcMar>
+              <w:top w:type="dxa" w:w="100"/>
+              <w:left w:type="dxa" w:w="140"/>
+              <w:bottom w:type="dxa" w:w="100"/>
+              <w:right w:type="dxa" w:w="140"/>
+            </w:tcMar>
+          </w:tcPr>
+          <w:p>
+            <w:pPr>
+              <w:spacing w:after="0"/>
+            </w:pPr>
+            <w:r>
+              <w:rPr>
+                <w:rFonts w:ascii="Consolas" w:cs="Consolas" w:eastAsia="Consolas" w:hAnsi="Consolas"/>
+                <w:sz w:val="18"/>
+                <w:szCs w:val="18"/>
+              </w:rPr>
+              <w:t xml:space="preserve">Show me the changes before you save them. List every file you changed and why.</w:t>
+            </w:r>
+          </w:p>
+        </w:tc>
+      </w:tr>
+    </w:tbl>
+    <w:p>
+      <w:pPr>
+        <w:spacing w:after="80"/>
+      </w:pPr>
+    </w:p>
+    <w:p>
+      <w:pPr>
+        <w:spacing w:after="120"/>
+      </w:pPr>
+      <w:r>
+        <w:rPr>
+          <w:rFonts w:ascii="Arial" w:cs="Arial" w:eastAsia="Arial" w:hAnsi="Arial"/>
+          <w:sz w:val="21"/>
+          <w:szCs w:val="21"/>
+        </w:rPr>
+        <w:t xml:space="preserve">When it found something you did not expect:</w:t>
+      </w:r>
+    </w:p>
+    <w:tbl>
+      <w:tblPr>
+        <w:tblW w:type="dxa" w:w="9360"/>
+        <w:tblBorders>
+          <w:top w:val="single" w:color="auto" w:sz="4"/>
+          <w:left w:val="single" w:color="auto" w:sz="4"/>
+          <w:bottom w:val="single" w:color="auto" w:sz="4"/>
+          <w:right w:val="single" w:color="auto" w:sz="4"/>
+          <w:insideH w:val="single" w:color="auto" w:sz="4"/>
+          <w:insideV w:val="single" w:color="auto" w:sz="4"/>
+        </w:tblBorders>
+      </w:tblPr>
+      <w:tblGrid>
+        <w:gridCol w:w="9360"/>
+      </w:tblGrid>
+      <w:tr>
+        <w:tc>
+          <w:tcPr>
+            <w:tcW w:type="dxa" w:w="9360"/>
+            <w:tcBorders>
+              <w:top w:val="single" w:color="BFBFBF" w:sz="6"/>
+              <w:left w:val="single" w:color="BFBFBF" w:sz="6"/>
+              <w:bottom w:val="single" w:color="BFBFBF" w:sz="6"/>
+              <w:right w:val="single" w:color="BFBFBF" w:sz="6"/>
+            </w:tcBorders>
+            <w:shd w:fill="F2F2F2" w:color="auto" w:val="clear"/>
+            <w:tcMar>
+              <w:top w:type="dxa" w:w="100"/>
+              <w:left w:type="dxa" w:w="140"/>
+              <w:bottom w:type="dxa" w:w="100"/>
+              <w:right w:type="dxa" w:w="140"/>
+            </w:tcMar>
+          </w:tcPr>
+          <w:p>
+            <w:pPr>
+              <w:spacing w:after="0"/>
+            </w:pPr>
+            <w:r>
+              <w:rPr>
+                <w:rFonts w:ascii="Consolas" w:cs="Consolas" w:eastAsia="Consolas" w:hAnsi="Consolas"/>
+                <w:sz w:val="18"/>
+                <w:szCs w:val="18"/>
+              </w:rPr>
+              <w:t xml:space="preserve">Is this a legacy bug or a legacy issue under NORMS.md section 0? Show me the legacy cells. If unsure, treat it as an issue, replicate it and register it.</w:t>
+            </w:r>
+          </w:p>
+        </w:tc>
+      </w:tr>
+    </w:tbl>
+    <w:p>
+      <w:pPr>
+        <w:spacing w:after="80"/>
+      </w:pPr>
+    </w:p>
+    <w:p>
+      <w:pPr>
+        <w:spacing w:after="120"/>
+      </w:pPr>
+      <w:r>
+        <w:rPr>
+          <w:rFonts w:ascii="Arial" w:cs="Arial" w:eastAsia="Arial" w:hAnsi="Arial"/>
+          <w:sz w:val="21"/>
+          <w:szCs w:val="21"/>
+        </w:rPr>
+        <w:t xml:space="preserve">Stop for the day, and resume later in a new session:</w:t>
+      </w:r>
+    </w:p>
+    <w:tbl>
+      <w:tblPr>
+        <w:tblW w:type="dxa" w:w="9360"/>
+        <w:tblBorders>
+          <w:top w:val="single" w:color="auto" w:sz="4"/>
+          <w:left w:val="single" w:color="auto" w:sz="4"/>
+          <w:bottom w:val="single" w:color="auto" w:sz="4"/>
+          <w:right w:val="single" w:color="auto" w:sz="4"/>
+          <w:insideH w:val="single" w:color="auto" w:sz="4"/>
+          <w:insideV w:val="single" w:color="auto" w:sz="4"/>
+        </w:tblBorders>
+      </w:tblPr>
+      <w:tblGrid>
+        <w:gridCol w:w="9360"/>
+      </w:tblGrid>
+      <w:tr>
+        <w:tc>
+          <w:tcPr>
+            <w:tcW w:type="dxa" w:w="9360"/>
+            <w:tcBorders>
+              <w:top w:val="single" w:color="BFBFBF" w:sz="6"/>
+              <w:left w:val="single" w:color="BFBFBF" w:sz="6"/>
+              <w:bottom w:val="single" w:color="BFBFBF" w:sz="6"/>
+              <w:right w:val="single" w:color="BFBFBF" w:sz="6"/>
+            </w:tcBorders>
+            <w:shd w:fill="F2F2F2" w:color="auto" w:val="clear"/>
+            <w:tcMar>
+              <w:top w:type="dxa" w:w="100"/>
+              <w:left w:type="dxa" w:w="140"/>
+              <w:bottom w:type="dxa" w:w="100"/>
+              <w:right w:type="dxa" w:w="140"/>
+            </w:tcMar>
+          </w:tcPr>
+          <w:p>
+            <w:pPr>
+              <w:spacing w:after="0"/>
+            </w:pPr>
+            <w:r>
+              <w:rPr>
+                <w:rFonts w:ascii="Consolas" w:cs="Consolas" w:eastAsia="Consolas" w:hAnsi="Consolas"/>
+                <w:sz w:val="18"/>
+                <w:szCs w:val="18"/>
+              </w:rPr>
+              <w:t xml:space="preserve">Stop here. Add the CAVEATS.md entry and the TODO items for what is left, and tell me which phase is next.</w:t>
+            </w:r>
+          </w:p>
+        </w:tc>
+      </w:tr>
+    </w:tbl>
+    <w:p>
+      <w:pPr>
+        <w:spacing w:after="80"/>
+      </w:pPr>
+    </w:p>
+    <w:tbl>
+      <w:tblPr>
+        <w:tblW w:type="dxa" w:w="9360"/>
+        <w:tblBorders>
+          <w:top w:val="single" w:color="auto" w:sz="4"/>
+          <w:left w:val="single" w:color="auto" w:sz="4"/>
+          <w:bottom w:val="single" w:color="auto" w:sz="4"/>
+          <w:right w:val="single" w:color="auto" w:sz="4"/>
+          <w:insideH w:val="single" w:color="auto" w:sz="4"/>
+          <w:insideV w:val="single" w:color="auto" w:sz="4"/>
+        </w:tblBorders>
+      </w:tblPr>
+      <w:tblGrid>
+        <w:gridCol w:w="9360"/>
+      </w:tblGrid>
+      <w:tr>
+        <w:tc>
+          <w:tcPr>
+            <w:tcW w:type="dxa" w:w="9360"/>
+            <w:tcBorders>
+              <w:top w:val="single" w:color="BFBFBF" w:sz="6"/>
+              <w:left w:val="single" w:color="BFBFBF" w:sz="6"/>
+              <w:bottom w:val="single" w:color="BFBFBF" w:sz="6"/>
+              <w:right w:val="single" w:color="BFBFBF" w:sz="6"/>
+            </w:tcBorders>
+            <w:shd w:fill="F2F2F2" w:color="auto" w:val="clear"/>
+            <w:tcMar>
+              <w:top w:type="dxa" w:w="100"/>
+              <w:left w:type="dxa" w:w="140"/>
+              <w:bottom w:type="dxa" w:w="100"/>
+              <w:right w:type="dxa" w:w="140"/>
+            </w:tcMar>
+          </w:tcPr>
+          <w:p>
+            <w:pPr>
+              <w:spacing w:after="0"/>
+            </w:pPr>
+            <w:r>
+              <w:rPr>
+                <w:rFonts w:ascii="Consolas" w:cs="Consolas" w:eastAsia="Consolas" w:hAnsi="Consolas"/>
+                <w:sz w:val="18"/>
+                <w:szCs w:val="18"/>
+              </w:rPr>
+              <w:t xml:space="preserve">@AGENTS.md @excel_ai/plans/prompts/TCB_module_prompt.md We are at phase &lt;n&gt;. Read the bottom of CAVEATS.md and the last report, then do phase &lt;n&gt; only and stop.</w:t>
+            </w:r>
+          </w:p>
+        </w:tc>
+      </w:tr>
+    </w:tbl>
+    <w:p>
+      <w:pPr>
+        <w:spacing w:after="80"/>
+      </w:pPr>
+    </w:p>
+    <w:p>
+      <w:pPr>
+        <w:spacing w:after="120"/>
+      </w:pPr>
+      <w:r>
+        <w:rPr>
+          <w:rFonts w:ascii="Arial" w:cs="Arial" w:eastAsia="Arial" w:hAnsi="Arial"/>
+          <w:sz w:val="21"/>
+          <w:szCs w:val="21"/>
+        </w:rPr>
+        <w:t xml:space="preserve">Then save to GitHub: close the workbooks and double-click </w:t>
+      </w:r>
+      <w:r>
+        <w:rPr>
+          <w:rFonts w:ascii="Consolas" w:cs="Consolas" w:eastAsia="Consolas" w:hAnsi="Consolas"/>
+          <w:sz w:val="19"/>
+          <w:szCs w:val="19"/>
+        </w:rPr>
+        <w:t xml:space="preserve">SyncRepo.bat</w:t>
+      </w:r>
+      <w:r>
+        <w:rPr>
+          <w:rFonts w:ascii="Arial" w:cs="Arial" w:eastAsia="Arial" w:hAnsi="Arial"/>
+          <w:sz w:val="21"/>
+          <w:szCs w:val="21"/>
+        </w:rPr>
+        <w:t xml:space="preserve"> in the repo folder.</w:t>
+      </w:r>
+    </w:p>
+    <w:p>
+      <w:pPr>
+        <w:pStyle w:val="Heading1"/>
+        <w:spacing w:after="120" w:before="280"/>
+      </w:pPr>
+      <w:r>
+        <w:rPr>
+          <w:rFonts w:ascii="Arial" w:cs="Arial" w:eastAsia="Arial" w:hAnsi="Arial"/>
+          <w:b/>
+          <w:bCs/>
+          <w:color w:val="00AE49"/>
+          <w:sz w:val="30"/>
+          <w:szCs w:val="30"/>
+        </w:rPr>
+        <w:t xml:space="preserve">2. What this does</w:t>
       </w:r>
     </w:p>
     <w:p>
@@ -637,7 +2019,7 @@
           <w:sz w:val="30"/>
           <w:szCs w:val="30"/>
         </w:rPr>
-        <w:t xml:space="preserve">2. Before you start</w:t>
+        <w:t xml:space="preserve">3. Before you start</w:t>
       </w:r>
     </w:p>
     <w:p>
@@ -721,7 +2103,7 @@
           <w:sz w:val="21"/>
           <w:szCs w:val="21"/>
         </w:rPr>
-        <w:t xml:space="preserve"> once before you start (section 4).</w:t>
+        <w:t xml:space="preserve"> once before you start (section 5).</w:t>
       </w:r>
     </w:p>
     <w:p>
@@ -755,7 +2137,7 @@
           <w:sz w:val="21"/>
           <w:szCs w:val="21"/>
         </w:rPr>
-        <w:t xml:space="preserve"> is in your checkout once the CPAT-AI branch that adds it is merged into main and you have synced; until then use Appendix A (the same text).</w:t>
+        <w:t xml:space="preserve"> is in your checkout after you sync (it is on main); if not, use Appendix A (the same text).</w:t>
       </w:r>
     </w:p>
     <w:p>
@@ -863,7 +2245,7 @@
           <w:sz w:val="30"/>
           <w:szCs w:val="30"/>
         </w:rPr>
-        <w:t xml:space="preserve">3. Step by step in GitHub Copilot (local mode)</w:t>
+        <w:t xml:space="preserve">4. Step by step in GitHub Copilot (local mode)</w:t>
       </w:r>
     </w:p>
     <w:p>
@@ -910,7 +2292,7 @@
           <w:sz w:val="21"/>
           <w:szCs w:val="21"/>
         </w:rPr>
-        <w:t xml:space="preserve">, where you can open it in Excel, and you save it to GitHub yourself at the end (section 4).</w:t>
+        <w:t xml:space="preserve">, where you can open it in Excel, and you save it to GitHub yourself at the end (section 5).</w:t>
       </w:r>
     </w:p>
     <w:p>
@@ -1499,7 +2881,7 @@
           <w:sz w:val="21"/>
           <w:szCs w:val="21"/>
         </w:rPr>
-        <w:t xml:space="preserve"> and in Appendix B.</w:t>
+        <w:t xml:space="preserve"> and in section 1.</w:t>
       </w:r>
     </w:p>
     <w:p>
@@ -2432,7 +3814,7 @@
           <w:sz w:val="21"/>
           <w:szCs w:val="21"/>
         </w:rPr>
-        <w:t xml:space="preserve">Appendix B</w:t>
+        <w:t xml:space="preserve">section 1</w:t>
       </w:r>
       <w:r>
         <w:rPr>
@@ -2583,7 +3965,7 @@
           <w:sz w:val="30"/>
           <w:szCs w:val="30"/>
         </w:rPr>
-        <w:t xml:space="preserve">4. When done: save to GitHub with SyncRepo.bat</w:t>
+        <w:t xml:space="preserve">5. When done: save to GitHub with SyncRepo.bat</w:t>
       </w:r>
     </w:p>
     <w:p>
@@ -3064,6 +4446,217 @@
       </w:r>
     </w:p>
     <w:p>
+      <w:pPr>
+        <w:pStyle w:val="Heading1"/>
+        <w:spacing w:after="120" w:before="280"/>
+      </w:pPr>
+      <w:r>
+        <w:rPr>
+          <w:rFonts w:ascii="Arial" w:cs="Arial" w:eastAsia="Arial" w:hAnsi="Arial"/>
+          <w:b/>
+          <w:bCs/>
+          <w:color w:val="00AE49"/>
+          <w:sz w:val="30"/>
+          <w:szCs w:val="30"/>
+        </w:rPr>
+        <w:t xml:space="preserve">6. The repo in brief (github.com/cpmodelai/cpat_ai)</w:t>
+      </w:r>
+    </w:p>
+    <w:p>
+      <w:pPr>
+        <w:spacing w:after="120"/>
+      </w:pPr>
+      <w:r>
+        <w:rPr>
+          <w:rFonts w:ascii="Arial" w:cs="Arial" w:eastAsia="Arial" w:hAnsi="Arial"/>
+          <w:sz w:val="21"/>
+          <w:szCs w:val="21"/>
+        </w:rPr>
+        <w:t xml:space="preserve">Four documents to know:</w:t>
+      </w:r>
+    </w:p>
+    <w:p>
+      <w:pPr>
+        <w:pStyle w:val="ListParagraph"/>
+        <w:numPr>
+          <w:ilvl w:val="0"/>
+          <w:numId w:val="2"/>
+        </w:numPr>
+        <w:spacing w:after="60"/>
+      </w:pPr>
+      <w:r>
+        <w:rPr>
+          <w:rFonts w:ascii="Consolas" w:cs="Consolas" w:eastAsia="Consolas" w:hAnsi="Consolas"/>
+          <w:sz w:val="19"/>
+          <w:szCs w:val="19"/>
+        </w:rPr>
+        <w:t xml:space="preserve">README.md</w:t>
+      </w:r>
+      <w:r>
+        <w:rPr>
+          <w:rFonts w:ascii="Arial" w:cs="Arial" w:eastAsia="Arial" w:hAnsi="Arial"/>
+          <w:sz w:val="21"/>
+          <w:szCs w:val="21"/>
+        </w:rPr>
+        <w:t xml:space="preserve">: start here; what is where and who reads what.</w:t>
+      </w:r>
+    </w:p>
+    <w:p>
+      <w:pPr>
+        <w:pStyle w:val="ListParagraph"/>
+        <w:numPr>
+          <w:ilvl w:val="0"/>
+          <w:numId w:val="2"/>
+        </w:numPr>
+        <w:spacing w:after="60"/>
+      </w:pPr>
+      <w:r>
+        <w:rPr>
+          <w:rFonts w:ascii="Consolas" w:cs="Consolas" w:eastAsia="Consolas" w:hAnsi="Consolas"/>
+          <w:sz w:val="19"/>
+          <w:szCs w:val="19"/>
+        </w:rPr>
+        <w:t xml:space="preserve">AGENTS.md</w:t>
+      </w:r>
+      <w:r>
+        <w:rPr>
+          <w:rFonts w:ascii="Arial" w:cs="Arial" w:eastAsia="Arial" w:hAnsi="Arial"/>
+          <w:sz w:val="21"/>
+          <w:szCs w:val="21"/>
+        </w:rPr>
+        <w:t xml:space="preserve">: the instructions every AI follows; attach it to every prompt.</w:t>
+      </w:r>
+    </w:p>
+    <w:p>
+      <w:pPr>
+        <w:pStyle w:val="ListParagraph"/>
+        <w:numPr>
+          <w:ilvl w:val="0"/>
+          <w:numId w:val="2"/>
+        </w:numPr>
+        <w:spacing w:after="60"/>
+      </w:pPr>
+      <w:r>
+        <w:rPr>
+          <w:rFonts w:ascii="Consolas" w:cs="Consolas" w:eastAsia="Consolas" w:hAnsi="Consolas"/>
+          <w:sz w:val="19"/>
+          <w:szCs w:val="19"/>
+        </w:rPr>
+        <w:t xml:space="preserve">NORMS.md</w:t>
+      </w:r>
+      <w:r>
+        <w:rPr>
+          <w:rFonts w:ascii="Arial" w:cs="Arial" w:eastAsia="Arial" w:hAnsi="Arial"/>
+          <w:sz w:val="21"/>
+          <w:szCs w:val="21"/>
+        </w:rPr>
+        <w:t xml:space="preserve">: the rules. Section 0: never replicate a legacy bug; always replicate a legacy issue, and register both. Section 9: how the modules work. Section 1: the column layout.</w:t>
+      </w:r>
+    </w:p>
+    <w:p>
+      <w:pPr>
+        <w:pStyle w:val="ListParagraph"/>
+        <w:numPr>
+          <w:ilvl w:val="0"/>
+          <w:numId w:val="2"/>
+        </w:numPr>
+        <w:spacing w:after="60"/>
+      </w:pPr>
+      <w:r>
+        <w:rPr>
+          <w:rFonts w:ascii="Consolas" w:cs="Consolas" w:eastAsia="Consolas" w:hAnsi="Consolas"/>
+          <w:sz w:val="19"/>
+          <w:szCs w:val="19"/>
+        </w:rPr>
+        <w:t xml:space="preserve">CAVEATS.md</w:t>
+      </w:r>
+      <w:r>
+        <w:rPr>
+          <w:rFonts w:ascii="Arial" w:cs="Arial" w:eastAsia="Arial" w:hAnsi="Arial"/>
+          <w:sz w:val="21"/>
+          <w:szCs w:val="21"/>
+        </w:rPr>
+        <w:t xml:space="preserve">: the log of every finished task (newest at the bottom); read it before building on earlier work.</w:t>
+      </w:r>
+    </w:p>
+    <w:p>
+      <w:pPr>
+        <w:spacing w:after="120"/>
+      </w:pPr>
+      <w:r>
+        <w:rPr>
+          <w:rFonts w:ascii="Arial" w:cs="Arial" w:eastAsia="Arial" w:hAnsi="Arial"/>
+          <w:sz w:val="21"/>
+          <w:szCs w:val="21"/>
+        </w:rPr>
+        <w:t xml:space="preserve">Also useful: </w:t>
+      </w:r>
+      <w:r>
+        <w:rPr>
+          <w:rFonts w:ascii="Consolas" w:cs="Consolas" w:eastAsia="Consolas" w:hAnsi="Consolas"/>
+          <w:sz w:val="19"/>
+          <w:szCs w:val="19"/>
+        </w:rPr>
+        <w:t xml:space="preserve">excel_ai/BUGS.md</w:t>
+      </w:r>
+      <w:r>
+        <w:rPr>
+          <w:rFonts w:ascii="Arial" w:cs="Arial" w:eastAsia="Arial" w:hAnsi="Arial"/>
+          <w:sz w:val="21"/>
+          <w:szCs w:val="21"/>
+        </w:rPr>
+        <w:t xml:space="preserve"> and </w:t>
+      </w:r>
+      <w:r>
+        <w:rPr>
+          <w:rFonts w:ascii="Consolas" w:cs="Consolas" w:eastAsia="Consolas" w:hAnsi="Consolas"/>
+          <w:sz w:val="19"/>
+          <w:szCs w:val="19"/>
+        </w:rPr>
+        <w:t xml:space="preserve">excel_ai/ISSUES.md</w:t>
+      </w:r>
+      <w:r>
+        <w:rPr>
+          <w:rFonts w:ascii="Arial" w:cs="Arial" w:eastAsia="Arial" w:hAnsi="Arial"/>
+          <w:sz w:val="21"/>
+          <w:szCs w:val="21"/>
+        </w:rPr>
+        <w:t xml:space="preserve"> (the legacy bugs and issues found so far), </w:t>
+      </w:r>
+      <w:r>
+        <w:rPr>
+          <w:rFonts w:ascii="Consolas" w:cs="Consolas" w:eastAsia="Consolas" w:hAnsi="Consolas"/>
+          <w:sz w:val="19"/>
+          <w:szCs w:val="19"/>
+        </w:rPr>
+        <w:t xml:space="preserve">HumanReadme-QuickStart.docx</w:t>
+      </w:r>
+      <w:r>
+        <w:rPr>
+          <w:rFonts w:ascii="Arial" w:cs="Arial" w:eastAsia="Arial" w:hAnsi="Arial"/>
+          <w:sz w:val="21"/>
+          <w:szCs w:val="21"/>
+        </w:rPr>
+        <w:t xml:space="preserve"> (a short orientation for people), </w:t>
+      </w:r>
+      <w:r>
+        <w:rPr>
+          <w:rFonts w:ascii="Consolas" w:cs="Consolas" w:eastAsia="Consolas" w:hAnsi="Consolas"/>
+          <w:sz w:val="19"/>
+          <w:szCs w:val="19"/>
+        </w:rPr>
+        <w:t xml:space="preserve">excel_ai/plans/prompts/</w:t>
+      </w:r>
+      <w:r>
+        <w:rPr>
+          <w:rFonts w:ascii="Arial" w:cs="Arial" w:eastAsia="Arial" w:hAnsi="Arial"/>
+          <w:sz w:val="21"/>
+          <w:szCs w:val="21"/>
+        </w:rPr>
+        <w:t xml:space="preserve"> (these prompts).</w:t>
+      </w:r>
+    </w:p>
+    <w:p>
       <w:r>
         <w:br w:type="page"/>
       </w:r>
@@ -3832,20 +5425,20 @@
           <w:sz w:val="30"/>
           <w:szCs w:val="30"/>
         </w:rPr>
-        <w:t xml:space="preserve">Appendix B. Starter and follow-up prompts</w:t>
-      </w:r>
-    </w:p>
-    <w:p>
-      <w:pPr>
-        <w:spacing w:after="120"/>
-      </w:pPr>
-      <w:r>
-        <w:rPr>
-          <w:rFonts w:ascii="Arial" w:cs="Arial" w:eastAsia="Arial" w:hAnsi="Arial"/>
-          <w:sz w:val="21"/>
-          <w:szCs w:val="21"/>
-        </w:rPr>
-        <w:t xml:space="preserve">The content of </w:t>
+        <w:t xml:space="preserve">Appendix B. Getting set up with AI in the Climate-Fiscal Team</w:t>
+      </w:r>
+    </w:p>
+    <w:p>
+      <w:pPr>
+        <w:spacing w:after="120"/>
+      </w:pPr>
+      <w:r>
+        <w:rPr>
+          <w:rFonts w:ascii="Arial" w:cs="Arial" w:eastAsia="Arial" w:hAnsi="Arial"/>
+          <w:sz w:val="21"/>
+          <w:szCs w:val="21"/>
+        </w:rPr>
+        <w:t xml:space="preserve">The text of the team's setup guide (</w:t>
       </w:r>
       <w:r>
         <w:rPr>
@@ -3853,28 +5446,15 @@
           <w:sz w:val="19"/>
           <w:szCs w:val="19"/>
         </w:rPr>
-        <w:t xml:space="preserve">excel_ai/plans/prompts/TCB_starter_prompts.md</w:t>
-      </w:r>
-      <w:r>
-        <w:rPr>
-          <w:rFonts w:ascii="Arial" w:cs="Arial" w:eastAsia="Arial" w:hAnsi="Arial"/>
-          <w:sz w:val="21"/>
-          <w:szCs w:val="21"/>
-        </w:rPr>
-        <w:t xml:space="preserve">. Type or paste one box at a time.</w:t>
-      </w:r>
-    </w:p>
-    <w:p>
-      <w:pPr>
-        <w:spacing w:after="120"/>
-      </w:pPr>
-      <w:r>
-        <w:rPr>
-          <w:rFonts w:ascii="Arial" w:cs="Arial" w:eastAsia="Arial" w:hAnsi="Arial"/>
-          <w:sz w:val="21"/>
-          <w:szCs w:val="21"/>
-        </w:rPr>
-        <w:t xml:space="preserve">Short prompts to type into GitHub Copilot (Current checkout, Claude Opus, Interactive). The long instructions are in </w:t>
+        <w:t xml:space="preserve">other/SetupGuide.docx</w:t>
+      </w:r>
+      <w:r>
+        <w:rPr>
+          <w:rFonts w:ascii="Arial" w:cs="Arial" w:eastAsia="Arial" w:hAnsi="Arial"/>
+          <w:sz w:val="21"/>
+          <w:szCs w:val="21"/>
+        </w:rPr>
+        <w:t xml:space="preserve">; written to </w:t>
       </w:r>
       <w:r>
         <w:rPr>
@@ -3882,44 +5462,15 @@
           <w:sz w:val="19"/>
           <w:szCs w:val="19"/>
         </w:rPr>
-        <w:t xml:space="preserve">TCB_module_prompt.md</w:t>
-      </w:r>
-      <w:r>
-        <w:rPr>
-          <w:rFonts w:ascii="Arial" w:cs="Arial" w:eastAsia="Arial" w:hAnsi="Arial"/>
-          <w:sz w:val="21"/>
-          <w:szCs w:val="21"/>
-        </w:rPr>
-        <w:t xml:space="preserve">; Copilot reads them from the repo, so you never paste them. Send one prompt, read the report, then send the next.</w:t>
-      </w:r>
-    </w:p>
-    <w:p>
-      <w:pPr>
-        <w:pStyle w:val="Heading2"/>
-        <w:spacing w:after="100" w:before="200"/>
-      </w:pPr>
-      <w:r>
-        <w:rPr>
-          <w:rFonts w:ascii="Arial" w:cs="Arial" w:eastAsia="Arial" w:hAnsi="Arial"/>
-          <w:b/>
-          <w:bCs/>
-          <w:sz w:val="24"/>
-          <w:szCs w:val="24"/>
-        </w:rPr>
-        <w:t xml:space="preserve">Starter (new session)</w:t>
-      </w:r>
-    </w:p>
-    <w:p>
-      <w:pPr>
-        <w:spacing w:after="120"/>
-      </w:pPr>
-      <w:r>
-        <w:rPr>
-          <w:rFonts w:ascii="Arial" w:cs="Arial" w:eastAsia="Arial" w:hAnsi="Arial"/>
-          <w:sz w:val="21"/>
-          <w:szCs w:val="21"/>
-        </w:rPr>
-        <w:t xml:space="preserve">Type </w:t>
+        <w:t xml:space="preserve">setup_guide.md</w:t>
+      </w:r>
+      <w:r>
+        <w:rPr>
+          <w:rFonts w:ascii="Arial" w:cs="Arial" w:eastAsia="Arial" w:hAnsi="Arial"/>
+          <w:sz w:val="21"/>
+          <w:szCs w:val="21"/>
+        </w:rPr>
+        <w:t xml:space="preserve"> by </w:t>
       </w:r>
       <w:r>
         <w:rPr>
@@ -3927,130 +5478,38 @@
           <w:sz w:val="19"/>
           <w:szCs w:val="19"/>
         </w:rPr>
-        <w:t xml:space="preserve">@</w:t>
-      </w:r>
-      <w:r>
-        <w:rPr>
-          <w:rFonts w:ascii="Arial" w:cs="Arial" w:eastAsia="Arial" w:hAnsi="Arial"/>
-          <w:sz w:val="21"/>
-          <w:szCs w:val="21"/>
-        </w:rPr>
-        <w:t xml:space="preserve"> to attach the two files, then:</w:t>
-      </w:r>
-    </w:p>
-    <w:tbl>
-      <w:tblPr>
-        <w:tblW w:type="dxa" w:w="9360"/>
-        <w:tblBorders>
-          <w:top w:val="single" w:color="auto" w:sz="4"/>
-          <w:left w:val="single" w:color="auto" w:sz="4"/>
-          <w:bottom w:val="single" w:color="auto" w:sz="4"/>
-          <w:right w:val="single" w:color="auto" w:sz="4"/>
-          <w:insideH w:val="single" w:color="auto" w:sz="4"/>
-          <w:insideV w:val="single" w:color="auto" w:sz="4"/>
-        </w:tblBorders>
-      </w:tblPr>
-      <w:tblGrid>
-        <w:gridCol w:w="9360"/>
-      </w:tblGrid>
-      <w:tr>
-        <w:tc>
-          <w:tcPr>
-            <w:tcW w:type="dxa" w:w="9360"/>
-            <w:tcBorders>
-              <w:top w:val="single" w:color="BFBFBF" w:sz="6"/>
-              <w:left w:val="single" w:color="BFBFBF" w:sz="6"/>
-              <w:bottom w:val="single" w:color="BFBFBF" w:sz="6"/>
-              <w:right w:val="single" w:color="BFBFBF" w:sz="6"/>
-            </w:tcBorders>
-            <w:shd w:fill="F2F2F2" w:color="auto" w:val="clear"/>
-            <w:tcMar>
-              <w:top w:type="dxa" w:w="100"/>
-              <w:left w:type="dxa" w:w="140"/>
-              <w:bottom w:type="dxa" w:w="100"/>
-              <w:right w:type="dxa" w:w="140"/>
-            </w:tcMar>
-          </w:tcPr>
-          <w:p>
-            <w:pPr>
-              <w:spacing w:after="0"/>
-            </w:pPr>
-            <w:r>
-              <w:rPr>
-                <w:rFonts w:ascii="Consolas" w:cs="Consolas" w:eastAsia="Consolas" w:hAnsi="Consolas"/>
-                <w:sz w:val="18"/>
-                <w:szCs w:val="18"/>
-              </w:rPr>
-              <w:t xml:space="preserve">@AGENTS.md @excel_ai/plans/prompts/TCB_module_prompt.md Follow these files. Do phase 0 only, then stop and report.</w:t>
-            </w:r>
-          </w:p>
-        </w:tc>
-      </w:tr>
-    </w:tbl>
-    <w:p>
-      <w:pPr>
-        <w:spacing w:after="80"/>
-      </w:pPr>
-    </w:p>
-    <w:p>
-      <w:pPr>
-        <w:spacing w:after="120"/>
-      </w:pPr>
-      <w:r>
-        <w:rPr>
-          <w:rFonts w:ascii="Arial" w:cs="Arial" w:eastAsia="Arial" w:hAnsi="Arial"/>
-          <w:sz w:val="21"/>
-          <w:szCs w:val="21"/>
-        </w:rPr>
-        <w:t xml:space="preserve">If </w:t>
-      </w:r>
-      <w:r>
-        <w:rPr>
-          <w:rFonts w:ascii="Consolas" w:cs="Consolas" w:eastAsia="Consolas" w:hAnsi="Consolas"/>
-          <w:sz w:val="19"/>
-          <w:szCs w:val="19"/>
-        </w:rPr>
-        <w:t xml:space="preserve">excel_ai/plans/prompts/</w:t>
-      </w:r>
-      <w:r>
-        <w:rPr>
-          <w:rFonts w:ascii="Arial" w:cs="Arial" w:eastAsia="Arial" w:hAnsi="Arial"/>
-          <w:sz w:val="21"/>
-          <w:szCs w:val="21"/>
-        </w:rPr>
-        <w:t xml:space="preserve"> is not in your checkout, double-click </w:t>
-      </w:r>
-      <w:r>
-        <w:rPr>
-          <w:rFonts w:ascii="Consolas" w:cs="Consolas" w:eastAsia="Consolas" w:hAnsi="Consolas"/>
-          <w:sz w:val="19"/>
-          <w:szCs w:val="19"/>
-        </w:rPr>
-        <w:t xml:space="preserve">SyncRepo.bat</w:t>
-      </w:r>
-      <w:r>
-        <w:rPr>
-          <w:rFonts w:ascii="Arial" w:cs="Arial" w:eastAsia="Arial" w:hAnsi="Arial"/>
-          <w:sz w:val="21"/>
-          <w:szCs w:val="21"/>
-        </w:rPr>
-        <w:t xml:space="preserve"> first; if it is still missing, paste the whole of </w:t>
-      </w:r>
-      <w:r>
-        <w:rPr>
-          <w:rFonts w:ascii="Consolas" w:cs="Consolas" w:eastAsia="Consolas" w:hAnsi="Consolas"/>
-          <w:sz w:val="19"/>
-          <w:szCs w:val="19"/>
-        </w:rPr>
-        <w:t xml:space="preserve">TCB_module_prompt.md</w:t>
-      </w:r>
-      <w:r>
-        <w:rPr>
-          <w:rFonts w:ascii="Arial" w:cs="Arial" w:eastAsia="Arial" w:hAnsi="Arial"/>
-          <w:sz w:val="21"/>
-          <w:szCs w:val="21"/>
-        </w:rPr>
-        <w:t xml:space="preserve"> instead (Appendix A of the Word guide).</w:t>
+        <w:t xml:space="preserve">make_quick_guides.py</w:t>
+      </w:r>
+      <w:r>
+        <w:rPr>
+          <w:rFonts w:ascii="Arial" w:cs="Arial" w:eastAsia="Arial" w:hAnsi="Arial"/>
+          <w:sz w:val="21"/>
+          <w:szCs w:val="21"/>
+        </w:rPr>
+        <w:t xml:space="preserve">).</w:t>
+      </w:r>
+    </w:p>
+    <w:p>
+      <w:pPr>
+        <w:spacing w:after="120"/>
+      </w:pPr>
+      <w:r>
+        <w:rPr>
+          <w:rFonts w:ascii="Arial" w:cs="Arial" w:eastAsia="Arial" w:hAnsi="Arial"/>
+          <w:b/>
+          <w:bCs/>
+          <w:sz w:val="21"/>
+          <w:szCs w:val="21"/>
+        </w:rPr>
+        <w:t xml:space="preserve">This guide has four parts.</w:t>
+      </w:r>
+      <w:r>
+        <w:rPr>
+          <w:rFonts w:ascii="Arial" w:cs="Arial" w:eastAsia="Arial" w:hAnsi="Arial"/>
+          <w:sz w:val="21"/>
+          <w:szCs w:val="21"/>
+        </w:rPr>
+        <w:t xml:space="preserve"> Part 1, Setup: new users, once. Part 2, Update: if you set up before the repos moved to github.com/cpmodelai, once. Part 3, Tools: how to use the three tools. Part 4, Git in brief: what git does and how to fix a clash.</w:t>
       </w:r>
     </w:p>
     <w:p>
@@ -4066,356 +5525,296 @@
           <w:sz w:val="24"/>
           <w:szCs w:val="24"/>
         </w:rPr>
-        <w:t xml:space="preserve">Starter queries</w:t>
-      </w:r>
-    </w:p>
-    <w:p>
-      <w:pPr>
-        <w:spacing w:after="120"/>
-      </w:pPr>
-      <w:r>
-        <w:rPr>
-          <w:rFonts w:ascii="Arial" w:cs="Arial" w:eastAsia="Arial" w:hAnsi="Arial"/>
-          <w:sz w:val="21"/>
-          <w:szCs w:val="21"/>
-        </w:rPr>
-        <w:t xml:space="preserve">One at a time, after the starter (or in a new session with the two files attached):</w:t>
-      </w:r>
-    </w:p>
-    <w:p>
-      <w:pPr>
-        <w:spacing w:after="120"/>
-      </w:pPr>
-      <w:r>
-        <w:rPr>
-          <w:rFonts w:ascii="Arial" w:cs="Arial" w:eastAsia="Arial" w:hAnsi="Arial"/>
-          <w:sz w:val="21"/>
-          <w:szCs w:val="21"/>
-        </w:rPr>
-        <w:t xml:space="preserve">- Build it, starting from what already exists</w:t>
-      </w:r>
-    </w:p>
-    <w:tbl>
-      <w:tblPr>
-        <w:tblW w:type="dxa" w:w="9360"/>
-        <w:tblBorders>
-          <w:top w:val="single" w:color="auto" w:sz="4"/>
-          <w:left w:val="single" w:color="auto" w:sz="4"/>
-          <w:bottom w:val="single" w:color="auto" w:sz="4"/>
-          <w:right w:val="single" w:color="auto" w:sz="4"/>
-          <w:insideH w:val="single" w:color="auto" w:sz="4"/>
-          <w:insideV w:val="single" w:color="auto" w:sz="4"/>
-        </w:tblBorders>
-      </w:tblPr>
-      <w:tblGrid>
-        <w:gridCol w:w="9360"/>
-      </w:tblGrid>
-      <w:tr>
-        <w:tc>
-          <w:tcPr>
-            <w:tcW w:type="dxa" w:w="9360"/>
-            <w:tcBorders>
-              <w:top w:val="single" w:color="BFBFBF" w:sz="6"/>
-              <w:left w:val="single" w:color="BFBFBF" w:sz="6"/>
-              <w:bottom w:val="single" w:color="BFBFBF" w:sz="6"/>
-              <w:right w:val="single" w:color="BFBFBF" w:sz="6"/>
-            </w:tcBorders>
-            <w:shd w:fill="F2F2F2" w:color="auto" w:val="clear"/>
-            <w:tcMar>
-              <w:top w:type="dxa" w:w="100"/>
-              <w:left w:type="dxa" w:w="140"/>
-              <w:bottom w:type="dxa" w:w="100"/>
-              <w:right w:type="dxa" w:w="140"/>
-            </w:tcMar>
-          </w:tcPr>
-          <w:p>
-            <w:pPr>
-              <w:spacing w:after="0"/>
-            </w:pPr>
-            <w:r>
-              <w:rPr>
-                <w:rFonts w:ascii="Consolas" w:cs="Consolas" w:eastAsia="Consolas" w:hAnsi="Consolas"/>
-                <w:sz w:val="18"/>
-                <w:szCs w:val="18"/>
-              </w:rPr>
-              <w:t xml:space="preserve">@AGENTS.md @excel_ai/plans/prompts/TCB_module_prompt.md Build the module, starting from what already exists: the plan `excel_ai/plans/Transport_cobenefits.md`, the legacy extracts in `data/mvp_legacy_extracts/`, `transport_model_ref.py`, the typed values of Mitigation's tab FromTransportCB and the distribution module's patterns. Do phase 0 only, then stop and report.</w:t>
-            </w:r>
-          </w:p>
-        </w:tc>
-      </w:tr>
-    </w:tbl>
-    <w:p>
-      <w:pPr>
-        <w:spacing w:after="80"/>
-      </w:pPr>
-    </w:p>
-    <w:p>
-      <w:pPr>
-        <w:spacing w:after="120"/>
-      </w:pPr>
-      <w:r>
-        <w:rPr>
-          <w:rFonts w:ascii="Arial" w:cs="Arial" w:eastAsia="Arial" w:hAnsi="Arial"/>
-          <w:sz w:val="21"/>
-          <w:szCs w:val="21"/>
-        </w:rPr>
-        <w:t xml:space="preserve">- Check it against legacy outputs</w:t>
-      </w:r>
-    </w:p>
-    <w:tbl>
-      <w:tblPr>
-        <w:tblW w:type="dxa" w:w="9360"/>
-        <w:tblBorders>
-          <w:top w:val="single" w:color="auto" w:sz="4"/>
-          <w:left w:val="single" w:color="auto" w:sz="4"/>
-          <w:bottom w:val="single" w:color="auto" w:sz="4"/>
-          <w:right w:val="single" w:color="auto" w:sz="4"/>
-          <w:insideH w:val="single" w:color="auto" w:sz="4"/>
-          <w:insideV w:val="single" w:color="auto" w:sz="4"/>
-        </w:tblBorders>
-      </w:tblPr>
-      <w:tblGrid>
-        <w:gridCol w:w="9360"/>
-      </w:tblGrid>
-      <w:tr>
-        <w:tc>
-          <w:tcPr>
-            <w:tcW w:type="dxa" w:w="9360"/>
-            <w:tcBorders>
-              <w:top w:val="single" w:color="BFBFBF" w:sz="6"/>
-              <w:left w:val="single" w:color="BFBFBF" w:sz="6"/>
-              <w:bottom w:val="single" w:color="BFBFBF" w:sz="6"/>
-              <w:right w:val="single" w:color="BFBFBF" w:sz="6"/>
-            </w:tcBorders>
-            <w:shd w:fill="F2F2F2" w:color="auto" w:val="clear"/>
-            <w:tcMar>
-              <w:top w:type="dxa" w:w="100"/>
-              <w:left w:type="dxa" w:w="140"/>
-              <w:bottom w:type="dxa" w:w="100"/>
-              <w:right w:type="dxa" w:w="140"/>
-            </w:tcMar>
-          </w:tcPr>
-          <w:p>
-            <w:pPr>
-              <w:spacing w:after="0"/>
-            </w:pPr>
-            <w:r>
-              <w:rPr>
-                <w:rFonts w:ascii="Consolas" w:cs="Consolas" w:eastAsia="Consolas" w:hAnsi="Consolas"/>
-                <w:sz w:val="18"/>
-                <w:szCs w:val="18"/>
-              </w:rPr>
-              <w:t xml:space="preserve">Check it against legacy outputs: compare the transport co-benefits module's results for Egypt with legacy 465's cached values, year by year, both scenarios. List every difference above 0.1% with its cause: a registered bug fix, a replicated issue, or unexplained (then find the cause).</w:t>
-            </w:r>
-          </w:p>
-        </w:tc>
-      </w:tr>
-    </w:tbl>
-    <w:p>
-      <w:pPr>
-        <w:spacing w:after="80"/>
-      </w:pPr>
-    </w:p>
-    <w:p>
-      <w:pPr>
-        <w:spacing w:after="120"/>
-      </w:pPr>
-      <w:r>
-        <w:rPr>
-          <w:rFonts w:ascii="Arial" w:cs="Arial" w:eastAsia="Arial" w:hAnsi="Arial"/>
-          <w:sz w:val="21"/>
-          <w:szCs w:val="21"/>
-        </w:rPr>
-        <w:t xml:space="preserve">- Produce a short PowerPoint, following the norms of the other documents</w:t>
-      </w:r>
-    </w:p>
-    <w:tbl>
-      <w:tblPr>
-        <w:tblW w:type="dxa" w:w="9360"/>
-        <w:tblBorders>
-          <w:top w:val="single" w:color="auto" w:sz="4"/>
-          <w:left w:val="single" w:color="auto" w:sz="4"/>
-          <w:bottom w:val="single" w:color="auto" w:sz="4"/>
-          <w:right w:val="single" w:color="auto" w:sz="4"/>
-          <w:insideH w:val="single" w:color="auto" w:sz="4"/>
-          <w:insideV w:val="single" w:color="auto" w:sz="4"/>
-        </w:tblBorders>
-      </w:tblPr>
-      <w:tblGrid>
-        <w:gridCol w:w="9360"/>
-      </w:tblGrid>
-      <w:tr>
-        <w:tc>
-          <w:tcPr>
-            <w:tcW w:type="dxa" w:w="9360"/>
-            <w:tcBorders>
-              <w:top w:val="single" w:color="BFBFBF" w:sz="6"/>
-              <w:left w:val="single" w:color="BFBFBF" w:sz="6"/>
-              <w:bottom w:val="single" w:color="BFBFBF" w:sz="6"/>
-              <w:right w:val="single" w:color="BFBFBF" w:sz="6"/>
-            </w:tcBorders>
-            <w:shd w:fill="F2F2F2" w:color="auto" w:val="clear"/>
-            <w:tcMar>
-              <w:top w:type="dxa" w:w="100"/>
-              <w:left w:type="dxa" w:w="140"/>
-              <w:bottom w:type="dxa" w:w="100"/>
-              <w:right w:type="dxa" w:w="140"/>
-            </w:tcMar>
-          </w:tcPr>
-          <w:p>
-            <w:pPr>
-              <w:spacing w:after="0"/>
-            </w:pPr>
-            <w:r>
-              <w:rPr>
-                <w:rFonts w:ascii="Consolas" w:cs="Consolas" w:eastAsia="Consolas" w:hAnsi="Consolas"/>
-                <w:sz w:val="18"/>
-                <w:szCs w:val="18"/>
-              </w:rPr>
-              <w:t xml:space="preserve">Produce a short PowerPoint (about 6 slides) on the transport co-benefits module: what it does, how it links to the other modules, the results for Egypt against legacy, the bugs fixed and issues replicated (codes), open decisions. Follow the norms of the other documents: the CPAT-AI Overview deck (`excel_ai/CPAT-AI_Overview_v&lt;version&gt;.pptx`, builder `excel_ai/mitigation/presentation/build_deck.js`), counts taken from the register, `NORMS.md` 5. Save it as `excel_ai/CPAT-AI_TransportCobenefits_Overview_v&lt;version&gt;.pptx`.</w:t>
-            </w:r>
-          </w:p>
-        </w:tc>
-      </w:tr>
-    </w:tbl>
-    <w:p>
-      <w:pPr>
-        <w:spacing w:after="80"/>
-      </w:pPr>
-    </w:p>
-    <w:p>
-      <w:pPr>
-        <w:spacing w:after="120"/>
-      </w:pPr>
-      <w:r>
-        <w:rPr>
-          <w:rFonts w:ascii="Arial" w:cs="Arial" w:eastAsia="Arial" w:hAnsi="Arial"/>
-          <w:sz w:val="21"/>
-          <w:szCs w:val="21"/>
-        </w:rPr>
-        <w:t xml:space="preserve">- Check that every bug found is in the registers</w:t>
-      </w:r>
-    </w:p>
-    <w:tbl>
-      <w:tblPr>
-        <w:tblW w:type="dxa" w:w="9360"/>
-        <w:tblBorders>
-          <w:top w:val="single" w:color="auto" w:sz="4"/>
-          <w:left w:val="single" w:color="auto" w:sz="4"/>
-          <w:bottom w:val="single" w:color="auto" w:sz="4"/>
-          <w:right w:val="single" w:color="auto" w:sz="4"/>
-          <w:insideH w:val="single" w:color="auto" w:sz="4"/>
-          <w:insideV w:val="single" w:color="auto" w:sz="4"/>
-        </w:tblBorders>
-      </w:tblPr>
-      <w:tblGrid>
-        <w:gridCol w:w="9360"/>
-      </w:tblGrid>
-      <w:tr>
-        <w:tc>
-          <w:tcPr>
-            <w:tcW w:type="dxa" w:w="9360"/>
-            <w:tcBorders>
-              <w:top w:val="single" w:color="BFBFBF" w:sz="6"/>
-              <w:left w:val="single" w:color="BFBFBF" w:sz="6"/>
-              <w:bottom w:val="single" w:color="BFBFBF" w:sz="6"/>
-              <w:right w:val="single" w:color="BFBFBF" w:sz="6"/>
-            </w:tcBorders>
-            <w:shd w:fill="F2F2F2" w:color="auto" w:val="clear"/>
-            <w:tcMar>
-              <w:top w:type="dxa" w:w="100"/>
-              <w:left w:type="dxa" w:w="140"/>
-              <w:bottom w:type="dxa" w:w="100"/>
-              <w:right w:type="dxa" w:w="140"/>
-            </w:tcMar>
-          </w:tcPr>
-          <w:p>
-            <w:pPr>
-              <w:spacing w:after="0"/>
-            </w:pPr>
-            <w:r>
-              <w:rPr>
-                <w:rFonts w:ascii="Consolas" w:cs="Consolas" w:eastAsia="Consolas" w:hAnsi="Consolas"/>
-                <w:sz w:val="18"/>
-                <w:szCs w:val="18"/>
-              </w:rPr>
-              <w:t xml:space="preserve">Check that every bug and issue you found is in the register (`excel_ai/mitigation/issues_register.py`, `make_legacy_fixes.py`), with its code, legacy cells and cross-references; regenerate `excel_ai/BUGS.md`, `excel_ai/ISSUES.md` and the tracker, and list what you added.</w:t>
-            </w:r>
-          </w:p>
-        </w:tc>
-      </w:tr>
-    </w:tbl>
-    <w:p>
-      <w:pPr>
-        <w:spacing w:after="80"/>
-      </w:pPr>
-    </w:p>
-    <w:p>
-      <w:pPr>
-        <w:spacing w:after="120"/>
-      </w:pPr>
-      <w:r>
-        <w:rPr>
-          <w:rFonts w:ascii="Arial" w:cs="Arial" w:eastAsia="Arial" w:hAnsi="Arial"/>
-          <w:sz w:val="21"/>
-          <w:szCs w:val="21"/>
-        </w:rPr>
-        <w:t xml:space="preserve">- Adjust what you do not like or what is missing</w:t>
-      </w:r>
-    </w:p>
-    <w:tbl>
-      <w:tblPr>
-        <w:tblW w:type="dxa" w:w="9360"/>
-        <w:tblBorders>
-          <w:top w:val="single" w:color="auto" w:sz="4"/>
-          <w:left w:val="single" w:color="auto" w:sz="4"/>
-          <w:bottom w:val="single" w:color="auto" w:sz="4"/>
-          <w:right w:val="single" w:color="auto" w:sz="4"/>
-          <w:insideH w:val="single" w:color="auto" w:sz="4"/>
-          <w:insideV w:val="single" w:color="auto" w:sz="4"/>
-        </w:tblBorders>
-      </w:tblPr>
-      <w:tblGrid>
-        <w:gridCol w:w="9360"/>
-      </w:tblGrid>
-      <w:tr>
-        <w:tc>
-          <w:tcPr>
-            <w:tcW w:type="dxa" w:w="9360"/>
-            <w:tcBorders>
-              <w:top w:val="single" w:color="BFBFBF" w:sz="6"/>
-              <w:left w:val="single" w:color="BFBFBF" w:sz="6"/>
-              <w:bottom w:val="single" w:color="BFBFBF" w:sz="6"/>
-              <w:right w:val="single" w:color="BFBFBF" w:sz="6"/>
-            </w:tcBorders>
-            <w:shd w:fill="F2F2F2" w:color="auto" w:val="clear"/>
-            <w:tcMar>
-              <w:top w:type="dxa" w:w="100"/>
-              <w:left w:type="dxa" w:w="140"/>
-              <w:bottom w:type="dxa" w:w="100"/>
-              <w:right w:type="dxa" w:w="140"/>
-            </w:tcMar>
-          </w:tcPr>
-          <w:p>
-            <w:pPr>
-              <w:spacing w:after="0"/>
-            </w:pPr>
-            <w:r>
-              <w:rPr>
-                <w:rFonts w:ascii="Consolas" w:cs="Consolas" w:eastAsia="Consolas" w:hAnsi="Consolas"/>
-                <w:sz w:val="18"/>
-                <w:szCs w:val="18"/>
-              </w:rPr>
-              <w:t xml:space="preserve">I found I don't like format (x) / you are lacking output (y): please adjust. Change the builder, not the built workbook; rebuild, rerun the check and show me the result.</w:t>
-            </w:r>
-          </w:p>
-        </w:tc>
-      </w:tr>
-    </w:tbl>
-    <w:p>
-      <w:pPr>
-        <w:spacing w:after="80"/>
-      </w:pPr>
+        <w:t xml:space="preserve">Part 1. Setup (new users)</w:t>
+      </w:r>
+    </w:p>
+    <w:p>
+      <w:pPr>
+        <w:spacing w:after="120"/>
+      </w:pPr>
+      <w:r>
+        <w:rPr>
+          <w:rFonts w:ascii="Arial" w:cs="Arial" w:eastAsia="Arial" w:hAnsi="Arial"/>
+          <w:b/>
+          <w:bCs/>
+          <w:sz w:val="21"/>
+          <w:szCs w:val="21"/>
+        </w:rPr>
+        <w:t xml:space="preserve">Action A:</w:t>
+      </w:r>
+      <w:r>
+        <w:rPr>
+          <w:rFonts w:ascii="Arial" w:cs="Arial" w:eastAsia="Arial" w:hAnsi="Arial"/>
+          <w:sz w:val="21"/>
+          <w:szCs w:val="21"/>
+        </w:rPr>
+        <w:t xml:space="preserve"> Please create a GitHub ID (using a work or personal email address).</w:t>
+      </w:r>
+    </w:p>
+    <w:p>
+      <w:pPr>
+        <w:spacing w:after="120"/>
+      </w:pPr>
+      <w:r>
+        <w:rPr>
+          <w:rFonts w:ascii="Arial" w:cs="Arial" w:eastAsia="Arial" w:hAnsi="Arial"/>
+          <w:sz w:val="21"/>
+          <w:szCs w:val="21"/>
+        </w:rPr>
+        <w:t xml:space="preserve">1.  Go to https://github.com and click </w:t>
+      </w:r>
+      <w:r>
+        <w:rPr>
+          <w:rFonts w:ascii="Arial" w:cs="Arial" w:eastAsia="Arial" w:hAnsi="Arial"/>
+          <w:b/>
+          <w:bCs/>
+          <w:sz w:val="21"/>
+          <w:szCs w:val="21"/>
+        </w:rPr>
+        <w:t xml:space="preserve">Sign up</w:t>
+      </w:r>
+      <w:r>
+        <w:rPr>
+          <w:rFonts w:ascii="Arial" w:cs="Arial" w:eastAsia="Arial" w:hAnsi="Arial"/>
+          <w:sz w:val="21"/>
+          <w:szCs w:val="21"/>
+        </w:rPr>
+        <w:t xml:space="preserve">.</w:t>
+      </w:r>
+    </w:p>
+    <w:p>
+      <w:pPr>
+        <w:spacing w:after="120"/>
+      </w:pPr>
+      <w:r>
+        <w:rPr>
+          <w:rFonts w:ascii="Arial" w:cs="Arial" w:eastAsia="Arial" w:hAnsi="Arial"/>
+          <w:sz w:val="21"/>
+          <w:szCs w:val="21"/>
+        </w:rPr>
+        <w:t xml:space="preserve">2.  Enter your email address and a password.</w:t>
+      </w:r>
+    </w:p>
+    <w:p>
+      <w:pPr>
+        <w:spacing w:after="120"/>
+      </w:pPr>
+      <w:r>
+        <w:rPr>
+          <w:rFonts w:ascii="Arial" w:cs="Arial" w:eastAsia="Arial" w:hAnsi="Arial"/>
+          <w:sz w:val="21"/>
+          <w:szCs w:val="21"/>
+        </w:rPr>
+        <w:t xml:space="preserve">3.  Type the username you want. GitHub will tell you right away if it’s taken.</w:t>
+      </w:r>
+    </w:p>
+    <w:p>
+      <w:pPr>
+        <w:spacing w:after="120"/>
+      </w:pPr>
+      <w:r>
+        <w:rPr>
+          <w:rFonts w:ascii="Arial" w:cs="Arial" w:eastAsia="Arial" w:hAnsi="Arial"/>
+          <w:sz w:val="21"/>
+          <w:szCs w:val="21"/>
+        </w:rPr>
+        <w:t xml:space="preserve">4.  Complete the verification puzzle, then enter the code GitHub emails you.</w:t>
+      </w:r>
+    </w:p>
+    <w:p>
+      <w:pPr>
+        <w:spacing w:after="120"/>
+      </w:pPr>
+      <w:r>
+        <w:rPr>
+          <w:rFonts w:ascii="Arial" w:cs="Arial" w:eastAsia="Arial" w:hAnsi="Arial"/>
+          <w:b/>
+          <w:bCs/>
+          <w:sz w:val="21"/>
+          <w:szCs w:val="21"/>
+        </w:rPr>
+        <w:t xml:space="preserve">Action B:</w:t>
+      </w:r>
+      <w:r>
+        <w:rPr>
+          <w:rFonts w:ascii="Arial" w:cs="Arial" w:eastAsia="Arial" w:hAnsi="Arial"/>
+          <w:sz w:val="21"/>
+          <w:szCs w:val="21"/>
+        </w:rPr>
+        <w:t xml:space="preserve"> Please get </w:t>
+      </w:r>
+      <w:r>
+        <w:rPr>
+          <w:rFonts w:ascii="Arial" w:cs="Arial" w:eastAsia="Arial" w:hAnsi="Arial"/>
+          <w:b/>
+          <w:bCs/>
+          <w:sz w:val="21"/>
+          <w:szCs w:val="21"/>
+        </w:rPr>
+        <w:t xml:space="preserve">Git for Windows</w:t>
+      </w:r>
+      <w:r>
+        <w:rPr>
+          <w:rFonts w:ascii="Arial" w:cs="Arial" w:eastAsia="Arial" w:hAnsi="Arial"/>
+          <w:sz w:val="21"/>
+          <w:szCs w:val="21"/>
+        </w:rPr>
+        <w:t xml:space="preserve"> from the WB Software Center, and </w:t>
+      </w:r>
+      <w:r>
+        <w:rPr>
+          <w:rFonts w:ascii="Arial" w:cs="Arial" w:eastAsia="Arial" w:hAnsi="Arial"/>
+          <w:b/>
+          <w:bCs/>
+          <w:sz w:val="21"/>
+          <w:szCs w:val="21"/>
+        </w:rPr>
+        <w:t xml:space="preserve">GitHub Copilot</w:t>
+      </w:r>
+      <w:r>
+        <w:rPr>
+          <w:rFonts w:ascii="Arial" w:cs="Arial" w:eastAsia="Arial" w:hAnsi="Arial"/>
+          <w:sz w:val="21"/>
+          <w:szCs w:val="21"/>
+        </w:rPr>
+        <w:t xml:space="preserve"> from the Microsoft Store. </w:t>
+      </w:r>
+      <w:r>
+        <w:rPr>
+          <w:rFonts w:ascii="Arial" w:cs="Arial" w:eastAsia="Arial" w:hAnsi="Arial"/>
+          <w:b/>
+          <w:bCs/>
+          <w:sz w:val="21"/>
+          <w:szCs w:val="21"/>
+        </w:rPr>
+        <w:t xml:space="preserve">GitHub Desktop</w:t>
+      </w:r>
+      <w:r>
+        <w:rPr>
+          <w:rFonts w:ascii="Arial" w:cs="Arial" w:eastAsia="Arial" w:hAnsi="Arial"/>
+          <w:sz w:val="21"/>
+          <w:szCs w:val="21"/>
+        </w:rPr>
+        <w:t xml:space="preserve"> (also in the Software Center, or desktop.github.com) is recommended too: it shows your changes and helps resolve merge issues (Part 4).</w:t>
+      </w:r>
+    </w:p>
+    <w:p>
+      <w:pPr>
+        <w:spacing w:after="120"/>
+      </w:pPr>
+      <w:r>
+        <w:rPr>
+          <w:rFonts w:ascii="Arial" w:cs="Arial" w:eastAsia="Arial" w:hAnsi="Arial"/>
+          <w:b/>
+          <w:bCs/>
+          <w:sz w:val="21"/>
+          <w:szCs w:val="21"/>
+        </w:rPr>
+        <w:t xml:space="preserve">Action C:</w:t>
+      </w:r>
+      <w:r>
+        <w:rPr>
+          <w:rFonts w:ascii="Arial" w:cs="Arial" w:eastAsia="Arial" w:hAnsi="Arial"/>
+          <w:sz w:val="21"/>
+          <w:szCs w:val="21"/>
+        </w:rPr>
+        <w:t xml:space="preserve"> Go to C:\Users\WB&lt;PID&gt; (go to C:\Users and find your folder: WB followed by your PID). Download Repos.zip (https://worldbankgroup.sharepoint.com/:u:/s/WKPEFFiles/IQDg6DHLPk2BSKjexUoCSQE6AWxZvE7l9KfLJjHP9XBj3K8?e=hDP9IL) (or get it from github.com/cpmodelai/repo-tools) and extract it there, then go to C:\Users\WB&lt;PID&gt;\Repos. Click CloneRepos.bat to clone the selected repos. Then click SyncAllRepos.bat for any changes later.</w:t>
+      </w:r>
+    </w:p>
+    <w:p>
+      <w:pPr>
+        <w:spacing w:after="120"/>
+      </w:pPr>
+      <w:r>
+        <w:rPr>
+          <w:rFonts w:ascii="Arial" w:cs="Arial" w:eastAsia="Arial" w:hAnsi="Arial"/>
+          <w:b/>
+          <w:bCs/>
+          <w:sz w:val="21"/>
+          <w:szCs w:val="21"/>
+        </w:rPr>
+        <w:t xml:space="preserve">Action D:</w:t>
+      </w:r>
+      <w:r>
+        <w:rPr>
+          <w:rFonts w:ascii="Arial" w:cs="Arial" w:eastAsia="Arial" w:hAnsi="Arial"/>
+          <w:sz w:val="21"/>
+          <w:szCs w:val="21"/>
+        </w:rPr>
+        <w:t xml:space="preserve"> Add your GitHub ID (and get an Enterprise account).</w:t>
+      </w:r>
+    </w:p>
+    <w:p>
+      <w:pPr>
+        <w:pStyle w:val="ListParagraph"/>
+        <w:numPr>
+          <w:ilvl w:val="0"/>
+          <w:numId w:val="2"/>
+        </w:numPr>
+        <w:spacing w:after="60"/>
+      </w:pPr>
+      <w:r>
+        <w:rPr>
+          <w:rFonts w:ascii="Arial" w:cs="Arial" w:eastAsia="Arial" w:hAnsi="Arial"/>
+          <w:sz w:val="21"/>
+          <w:szCs w:val="21"/>
+        </w:rPr>
+        <w:t xml:space="preserve">Once you have your ID, ask Kacper (klukaszewicz@worldbank.org) to add you to </w:t>
+      </w:r>
+      <w:r>
+        <w:rPr>
+          <w:rFonts w:ascii="Arial" w:cs="Arial" w:eastAsia="Arial" w:hAnsi="Arial"/>
+          <w:b/>
+          <w:bCs/>
+          <w:sz w:val="21"/>
+          <w:szCs w:val="21"/>
+        </w:rPr>
+        <w:t xml:space="preserve">cpmodelai</w:t>
+      </w:r>
+      <w:r>
+        <w:rPr>
+          <w:rFonts w:ascii="Arial" w:cs="Arial" w:eastAsia="Arial" w:hAnsi="Arial"/>
+          <w:sz w:val="21"/>
+          <w:szCs w:val="21"/>
+        </w:rPr>
+        <w:t xml:space="preserve">, where our repos are. Copy in Paulina and Stephen for information.</w:t>
+      </w:r>
+    </w:p>
+    <w:p>
+      <w:pPr>
+        <w:pStyle w:val="ListParagraph"/>
+        <w:numPr>
+          <w:ilvl w:val="0"/>
+          <w:numId w:val="2"/>
+        </w:numPr>
+        <w:spacing w:after="60"/>
+      </w:pPr>
+      <w:r>
+        <w:rPr>
+          <w:rFonts w:ascii="Arial" w:cs="Arial" w:eastAsia="Arial" w:hAnsi="Arial"/>
+          <w:sz w:val="21"/>
+          <w:szCs w:val="21"/>
+        </w:rPr>
+        <w:t xml:space="preserve">Ask for your user ID to be added to the WB GitHub organisation: http://githubmemberrequest/</w:t>
+      </w:r>
+    </w:p>
+    <w:p>
+      <w:pPr>
+        <w:pStyle w:val="ListParagraph"/>
+        <w:numPr>
+          <w:ilvl w:val="0"/>
+          <w:numId w:val="2"/>
+        </w:numPr>
+        <w:spacing w:after="60"/>
+      </w:pPr>
+      <w:r>
+        <w:rPr>
+          <w:rFonts w:ascii="Arial" w:cs="Arial" w:eastAsia="Arial" w:hAnsi="Arial"/>
+          <w:sz w:val="21"/>
+          <w:szCs w:val="21"/>
+        </w:rPr>
+        <w:t xml:space="preserve">Get a GitHub Enterprise account by emailing GitHub_Enterprise_Admin@worldbankgroup.org with your GitHub ID.</w:t>
+      </w:r>
     </w:p>
     <w:p>
       <w:pPr>
@@ -4430,278 +5829,113 @@
           <w:sz w:val="24"/>
           <w:szCs w:val="24"/>
         </w:rPr>
-        <w:t xml:space="preserve">Next phases</w:t>
-      </w:r>
-    </w:p>
-    <w:tbl>
-      <w:tblPr>
-        <w:tblW w:type="dxa" w:w="9360"/>
-        <w:tblBorders>
-          <w:top w:val="single" w:color="auto" w:sz="4"/>
-          <w:left w:val="single" w:color="auto" w:sz="4"/>
-          <w:bottom w:val="single" w:color="auto" w:sz="4"/>
-          <w:right w:val="single" w:color="auto" w:sz="4"/>
-          <w:insideH w:val="single" w:color="auto" w:sz="4"/>
-          <w:insideV w:val="single" w:color="auto" w:sz="4"/>
-        </w:tblBorders>
-      </w:tblPr>
-      <w:tblGrid>
-        <w:gridCol w:w="9360"/>
-      </w:tblGrid>
-      <w:tr>
-        <w:tc>
-          <w:tcPr>
-            <w:tcW w:type="dxa" w:w="9360"/>
-            <w:tcBorders>
-              <w:top w:val="single" w:color="BFBFBF" w:sz="6"/>
-              <w:left w:val="single" w:color="BFBFBF" w:sz="6"/>
-              <w:bottom w:val="single" w:color="BFBFBF" w:sz="6"/>
-              <w:right w:val="single" w:color="BFBFBF" w:sz="6"/>
-            </w:tcBorders>
-            <w:shd w:fill="F2F2F2" w:color="auto" w:val="clear"/>
-            <w:tcMar>
-              <w:top w:type="dxa" w:w="100"/>
-              <w:left w:type="dxa" w:w="140"/>
-              <w:bottom w:type="dxa" w:w="100"/>
-              <w:right w:type="dxa" w:w="140"/>
-            </w:tcMar>
-          </w:tcPr>
-          <w:p>
-            <w:pPr>
-              <w:spacing w:after="0"/>
-            </w:pPr>
-            <w:r>
-              <w:rPr>
-                <w:rFonts w:ascii="Consolas" w:cs="Consolas" w:eastAsia="Consolas" w:hAnsi="Consolas"/>
-                <w:sz w:val="18"/>
-                <w:szCs w:val="18"/>
-              </w:rPr>
-              <w:t xml:space="preserve">Go ahead with phase 1.</w:t>
-            </w:r>
-          </w:p>
-        </w:tc>
-      </w:tr>
-    </w:tbl>
-    <w:p>
-      <w:pPr>
-        <w:spacing w:after="80"/>
-      </w:pPr>
-    </w:p>
-    <w:tbl>
-      <w:tblPr>
-        <w:tblW w:type="dxa" w:w="9360"/>
-        <w:tblBorders>
-          <w:top w:val="single" w:color="auto" w:sz="4"/>
-          <w:left w:val="single" w:color="auto" w:sz="4"/>
-          <w:bottom w:val="single" w:color="auto" w:sz="4"/>
-          <w:right w:val="single" w:color="auto" w:sz="4"/>
-          <w:insideH w:val="single" w:color="auto" w:sz="4"/>
-          <w:insideV w:val="single" w:color="auto" w:sz="4"/>
-        </w:tblBorders>
-      </w:tblPr>
-      <w:tblGrid>
-        <w:gridCol w:w="9360"/>
-      </w:tblGrid>
-      <w:tr>
-        <w:tc>
-          <w:tcPr>
-            <w:tcW w:type="dxa" w:w="9360"/>
-            <w:tcBorders>
-              <w:top w:val="single" w:color="BFBFBF" w:sz="6"/>
-              <w:left w:val="single" w:color="BFBFBF" w:sz="6"/>
-              <w:bottom w:val="single" w:color="BFBFBF" w:sz="6"/>
-              <w:right w:val="single" w:color="BFBFBF" w:sz="6"/>
-            </w:tcBorders>
-            <w:shd w:fill="F2F2F2" w:color="auto" w:val="clear"/>
-            <w:tcMar>
-              <w:top w:type="dxa" w:w="100"/>
-              <w:left w:type="dxa" w:w="140"/>
-              <w:bottom w:type="dxa" w:w="100"/>
-              <w:right w:type="dxa" w:w="140"/>
-            </w:tcMar>
-          </w:tcPr>
-          <w:p>
-            <w:pPr>
-              <w:spacing w:after="0"/>
-            </w:pPr>
-            <w:r>
-              <w:rPr>
-                <w:rFonts w:ascii="Consolas" w:cs="Consolas" w:eastAsia="Consolas" w:hAnsi="Consolas"/>
-                <w:sz w:val="18"/>
-                <w:szCs w:val="18"/>
-              </w:rPr>
-              <w:t xml:space="preserve">Go ahead with phase 2.</w:t>
-            </w:r>
-          </w:p>
-        </w:tc>
-      </w:tr>
-    </w:tbl>
-    <w:p>
-      <w:pPr>
-        <w:spacing w:after="80"/>
-      </w:pPr>
-    </w:p>
-    <w:tbl>
-      <w:tblPr>
-        <w:tblW w:type="dxa" w:w="9360"/>
-        <w:tblBorders>
-          <w:top w:val="single" w:color="auto" w:sz="4"/>
-          <w:left w:val="single" w:color="auto" w:sz="4"/>
-          <w:bottom w:val="single" w:color="auto" w:sz="4"/>
-          <w:right w:val="single" w:color="auto" w:sz="4"/>
-          <w:insideH w:val="single" w:color="auto" w:sz="4"/>
-          <w:insideV w:val="single" w:color="auto" w:sz="4"/>
-        </w:tblBorders>
-      </w:tblPr>
-      <w:tblGrid>
-        <w:gridCol w:w="9360"/>
-      </w:tblGrid>
-      <w:tr>
-        <w:tc>
-          <w:tcPr>
-            <w:tcW w:type="dxa" w:w="9360"/>
-            <w:tcBorders>
-              <w:top w:val="single" w:color="BFBFBF" w:sz="6"/>
-              <w:left w:val="single" w:color="BFBFBF" w:sz="6"/>
-              <w:bottom w:val="single" w:color="BFBFBF" w:sz="6"/>
-              <w:right w:val="single" w:color="BFBFBF" w:sz="6"/>
-            </w:tcBorders>
-            <w:shd w:fill="F2F2F2" w:color="auto" w:val="clear"/>
-            <w:tcMar>
-              <w:top w:type="dxa" w:w="100"/>
-              <w:left w:type="dxa" w:w="140"/>
-              <w:bottom w:type="dxa" w:w="100"/>
-              <w:right w:type="dxa" w:w="140"/>
-            </w:tcMar>
-          </w:tcPr>
-          <w:p>
-            <w:pPr>
-              <w:spacing w:after="0"/>
-            </w:pPr>
-            <w:r>
-              <w:rPr>
-                <w:rFonts w:ascii="Consolas" w:cs="Consolas" w:eastAsia="Consolas" w:hAnsi="Consolas"/>
-                <w:sz w:val="18"/>
-                <w:szCs w:val="18"/>
-              </w:rPr>
-              <w:t xml:space="preserve">Go ahead with phase 3.</w:t>
-            </w:r>
-          </w:p>
-        </w:tc>
-      </w:tr>
-    </w:tbl>
-    <w:p>
-      <w:pPr>
-        <w:spacing w:after="80"/>
-      </w:pPr>
-    </w:p>
-    <w:tbl>
-      <w:tblPr>
-        <w:tblW w:type="dxa" w:w="9360"/>
-        <w:tblBorders>
-          <w:top w:val="single" w:color="auto" w:sz="4"/>
-          <w:left w:val="single" w:color="auto" w:sz="4"/>
-          <w:bottom w:val="single" w:color="auto" w:sz="4"/>
-          <w:right w:val="single" w:color="auto" w:sz="4"/>
-          <w:insideH w:val="single" w:color="auto" w:sz="4"/>
-          <w:insideV w:val="single" w:color="auto" w:sz="4"/>
-        </w:tblBorders>
-      </w:tblPr>
-      <w:tblGrid>
-        <w:gridCol w:w="9360"/>
-      </w:tblGrid>
-      <w:tr>
-        <w:tc>
-          <w:tcPr>
-            <w:tcW w:type="dxa" w:w="9360"/>
-            <w:tcBorders>
-              <w:top w:val="single" w:color="BFBFBF" w:sz="6"/>
-              <w:left w:val="single" w:color="BFBFBF" w:sz="6"/>
-              <w:bottom w:val="single" w:color="BFBFBF" w:sz="6"/>
-              <w:right w:val="single" w:color="BFBFBF" w:sz="6"/>
-            </w:tcBorders>
-            <w:shd w:fill="F2F2F2" w:color="auto" w:val="clear"/>
-            <w:tcMar>
-              <w:top w:type="dxa" w:w="100"/>
-              <w:left w:type="dxa" w:w="140"/>
-              <w:bottom w:type="dxa" w:w="100"/>
-              <w:right w:type="dxa" w:w="140"/>
-            </w:tcMar>
-          </w:tcPr>
-          <w:p>
-            <w:pPr>
-              <w:spacing w:after="0"/>
-            </w:pPr>
-            <w:r>
-              <w:rPr>
-                <w:rFonts w:ascii="Consolas" w:cs="Consolas" w:eastAsia="Consolas" w:hAnsi="Consolas"/>
-                <w:sz w:val="18"/>
-                <w:szCs w:val="18"/>
-              </w:rPr>
-              <w:t xml:space="preserve">Go ahead with phase 4.</w:t>
-            </w:r>
-          </w:p>
-        </w:tc>
-      </w:tr>
-    </w:tbl>
-    <w:p>
-      <w:pPr>
-        <w:spacing w:after="80"/>
-      </w:pPr>
-    </w:p>
-    <w:tbl>
-      <w:tblPr>
-        <w:tblW w:type="dxa" w:w="9360"/>
-        <w:tblBorders>
-          <w:top w:val="single" w:color="auto" w:sz="4"/>
-          <w:left w:val="single" w:color="auto" w:sz="4"/>
-          <w:bottom w:val="single" w:color="auto" w:sz="4"/>
-          <w:right w:val="single" w:color="auto" w:sz="4"/>
-          <w:insideH w:val="single" w:color="auto" w:sz="4"/>
-          <w:insideV w:val="single" w:color="auto" w:sz="4"/>
-        </w:tblBorders>
-      </w:tblPr>
-      <w:tblGrid>
-        <w:gridCol w:w="9360"/>
-      </w:tblGrid>
-      <w:tr>
-        <w:tc>
-          <w:tcPr>
-            <w:tcW w:type="dxa" w:w="9360"/>
-            <w:tcBorders>
-              <w:top w:val="single" w:color="BFBFBF" w:sz="6"/>
-              <w:left w:val="single" w:color="BFBFBF" w:sz="6"/>
-              <w:bottom w:val="single" w:color="BFBFBF" w:sz="6"/>
-              <w:right w:val="single" w:color="BFBFBF" w:sz="6"/>
-            </w:tcBorders>
-            <w:shd w:fill="F2F2F2" w:color="auto" w:val="clear"/>
-            <w:tcMar>
-              <w:top w:type="dxa" w:w="100"/>
-              <w:left w:type="dxa" w:w="140"/>
-              <w:bottom w:type="dxa" w:w="100"/>
-              <w:right w:type="dxa" w:w="140"/>
-            </w:tcMar>
-          </w:tcPr>
-          <w:p>
-            <w:pPr>
-              <w:spacing w:after="0"/>
-            </w:pPr>
-            <w:r>
-              <w:rPr>
-                <w:rFonts w:ascii="Consolas" w:cs="Consolas" w:eastAsia="Consolas" w:hAnsi="Consolas"/>
-                <w:sz w:val="18"/>
-                <w:szCs w:val="18"/>
-              </w:rPr>
-              <w:t xml:space="preserve">Go ahead with phase 5.</w:t>
-            </w:r>
-          </w:p>
-        </w:tc>
-      </w:tr>
-    </w:tbl>
-    <w:p>
-      <w:pPr>
-        <w:spacing w:after="80"/>
-      </w:pPr>
+        <w:t xml:space="preserve">Optional: linking Claude to the repos</w:t>
+      </w:r>
+    </w:p>
+    <w:p>
+      <w:pPr>
+        <w:spacing w:after="120"/>
+      </w:pPr>
+      <w:r>
+        <w:rPr>
+          <w:rFonts w:ascii="Arial" w:cs="Arial" w:eastAsia="Arial" w:hAnsi="Arial"/>
+          <w:b/>
+          <w:bCs/>
+          <w:sz w:val="21"/>
+          <w:szCs w:val="21"/>
+        </w:rPr>
+        <w:t xml:space="preserve">1. Create a Claude account.</w:t>
+      </w:r>
+      <w:r>
+        <w:rPr>
+          <w:rFonts w:ascii="Arial" w:cs="Arial" w:eastAsia="Arial" w:hAnsi="Arial"/>
+          <w:sz w:val="21"/>
+          <w:szCs w:val="21"/>
+        </w:rPr>
+        <w:t xml:space="preserve"> Go to claude.ai (or get the Claude app) and click </w:t>
+      </w:r>
+      <w:r>
+        <w:rPr>
+          <w:rFonts w:ascii="Arial" w:cs="Arial" w:eastAsia="Arial" w:hAnsi="Arial"/>
+          <w:b/>
+          <w:bCs/>
+          <w:sz w:val="21"/>
+          <w:szCs w:val="21"/>
+        </w:rPr>
+        <w:t xml:space="preserve">Sign up</w:t>
+      </w:r>
+      <w:r>
+        <w:rPr>
+          <w:rFonts w:ascii="Arial" w:cs="Arial" w:eastAsia="Arial" w:hAnsi="Arial"/>
+          <w:sz w:val="21"/>
+          <w:szCs w:val="21"/>
+        </w:rPr>
+        <w:t xml:space="preserve">, with an email address or a Google account. If you used email, click the sign-in link Claude sends you, then enter your name. You are on the free plan; you can upgrade later from Settings.</w:t>
+      </w:r>
+    </w:p>
+    <w:p>
+      <w:pPr>
+        <w:spacing w:after="120"/>
+      </w:pPr>
+      <w:r>
+        <w:rPr>
+          <w:rFonts w:ascii="Arial" w:cs="Arial" w:eastAsia="Arial" w:hAnsi="Arial"/>
+          <w:b/>
+          <w:bCs/>
+          <w:sz w:val="21"/>
+          <w:szCs w:val="21"/>
+        </w:rPr>
+        <w:t xml:space="preserve">2. Connect GitHub.</w:t>
+      </w:r>
+      <w:r>
+        <w:rPr>
+          <w:rFonts w:ascii="Arial" w:cs="Arial" w:eastAsia="Arial" w:hAnsi="Arial"/>
+          <w:sz w:val="21"/>
+          <w:szCs w:val="21"/>
+        </w:rPr>
+        <w:t xml:space="preserve"> A “repo” (repository) is a folder of files stored on GitHub. In Claude, go to Settings → Connectors, find GitHub and click Connect; GitHub asks you to approve access (support.claude.com, “Use the GitHub integration”).</w:t>
+      </w:r>
+    </w:p>
+    <w:p>
+      <w:pPr>
+        <w:spacing w:after="120"/>
+      </w:pPr>
+      <w:r>
+        <w:rPr>
+          <w:rFonts w:ascii="Arial" w:cs="Arial" w:eastAsia="Arial" w:hAnsi="Arial"/>
+          <w:b/>
+          <w:bCs/>
+          <w:sz w:val="21"/>
+          <w:szCs w:val="21"/>
+        </w:rPr>
+        <w:t xml:space="preserve">3. Add a repo.</w:t>
+      </w:r>
+      <w:r>
+        <w:rPr>
+          <w:rFonts w:ascii="Arial" w:cs="Arial" w:eastAsia="Arial" w:hAnsi="Arial"/>
+          <w:sz w:val="21"/>
+          <w:szCs w:val="21"/>
+        </w:rPr>
+        <w:t xml:space="preserve"> Open a chat (or a Project), click </w:t>
+      </w:r>
+      <w:r>
+        <w:rPr>
+          <w:rFonts w:ascii="Arial" w:cs="Arial" w:eastAsia="Arial" w:hAnsi="Arial"/>
+          <w:b/>
+          <w:bCs/>
+          <w:sz w:val="21"/>
+          <w:szCs w:val="21"/>
+        </w:rPr>
+        <w:t xml:space="preserve">+</w:t>
+      </w:r>
+      <w:r>
+        <w:rPr>
+          <w:rFonts w:ascii="Arial" w:cs="Arial" w:eastAsia="Arial" w:hAnsi="Arial"/>
+          <w:sz w:val="21"/>
+          <w:szCs w:val="21"/>
+        </w:rPr>
+        <w:t xml:space="preserve"> next to the message box, choose “Add from GitHub”, then search or paste the repo URL. Claude can now read its files; you can add several repos.</w:t>
+      </w:r>
     </w:p>
     <w:p>
       <w:pPr>
@@ -4716,492 +5950,1489 @@
           <w:sz w:val="24"/>
           <w:szCs w:val="24"/>
         </w:rPr>
-        <w:t xml:space="preserve">Example follow-ups</w:t>
-      </w:r>
-    </w:p>
-    <w:p>
-      <w:pPr>
-        <w:spacing w:after="120"/>
-      </w:pPr>
-      <w:r>
-        <w:rPr>
-          <w:rFonts w:ascii="Arial" w:cs="Arial" w:eastAsia="Arial" w:hAnsi="Arial"/>
-          <w:sz w:val="21"/>
-          <w:szCs w:val="21"/>
-        </w:rPr>
-        <w:t xml:space="preserve">Answer the decisions it asks for (example only: use your own decisions):</w:t>
-      </w:r>
-    </w:p>
-    <w:tbl>
-      <w:tblPr>
-        <w:tblW w:type="dxa" w:w="9360"/>
-        <w:tblBorders>
-          <w:top w:val="single" w:color="auto" w:sz="4"/>
-          <w:left w:val="single" w:color="auto" w:sz="4"/>
-          <w:bottom w:val="single" w:color="auto" w:sz="4"/>
-          <w:right w:val="single" w:color="auto" w:sz="4"/>
-          <w:insideH w:val="single" w:color="auto" w:sz="4"/>
-          <w:insideV w:val="single" w:color="auto" w:sz="4"/>
-        </w:tblBorders>
-      </w:tblPr>
-      <w:tblGrid>
-        <w:gridCol w:w="9360"/>
-      </w:tblGrid>
-      <w:tr>
-        <w:tc>
-          <w:tcPr>
-            <w:tcW w:type="dxa" w:w="9360"/>
-            <w:tcBorders>
-              <w:top w:val="single" w:color="BFBFBF" w:sz="6"/>
-              <w:left w:val="single" w:color="BFBFBF" w:sz="6"/>
-              <w:bottom w:val="single" w:color="BFBFBF" w:sz="6"/>
-              <w:right w:val="single" w:color="BFBFBF" w:sz="6"/>
-            </w:tcBorders>
-            <w:shd w:fill="F2F2F2" w:color="auto" w:val="clear"/>
-            <w:tcMar>
-              <w:top w:type="dxa" w:w="100"/>
-              <w:left w:type="dxa" w:w="140"/>
-              <w:bottom w:type="dxa" w:w="100"/>
-              <w:right w:type="dxa" w:w="140"/>
-            </w:tcMar>
-          </w:tcPr>
-          <w:p>
-            <w:pPr>
-              <w:spacing w:after="0"/>
-            </w:pPr>
-            <w:r>
-              <w:rPr>
-                <w:rFonts w:ascii="Consolas" w:cs="Consolas" w:eastAsia="Consolas" w:hAnsi="Consolas"/>
-                <w:sz w:val="18"/>
-                <w:szCs w:val="18"/>
-              </w:rPr>
-              <w:t xml:space="preserve">Decisions: B-c replicate as an issue (legacy uses 100% of the after-tax wage); B-d fix as a bug; B-e replicate as an issue. D5: gasoline and diesel only. D7: charts of vehicle-km, deaths, congestion and road damage; skip the historical scatter. D8: import the whole Tran_Elast table. Record these in the register, then go ahead with phase 1.</w:t>
-            </w:r>
-          </w:p>
-        </w:tc>
-      </w:tr>
-    </w:tbl>
-    <w:p>
-      <w:pPr>
-        <w:spacing w:after="80"/>
-      </w:pPr>
-    </w:p>
-    <w:p>
-      <w:pPr>
-        <w:spacing w:after="120"/>
-      </w:pPr>
-      <w:r>
-        <w:rPr>
-          <w:rFonts w:ascii="Arial" w:cs="Arial" w:eastAsia="Arial" w:hAnsi="Arial"/>
-          <w:sz w:val="21"/>
-          <w:szCs w:val="21"/>
-        </w:rPr>
-        <w:t xml:space="preserve">Ask for an explanation:</w:t>
-      </w:r>
-    </w:p>
-    <w:tbl>
-      <w:tblPr>
-        <w:tblW w:type="dxa" w:w="9360"/>
-        <w:tblBorders>
-          <w:top w:val="single" w:color="auto" w:sz="4"/>
-          <w:left w:val="single" w:color="auto" w:sz="4"/>
-          <w:bottom w:val="single" w:color="auto" w:sz="4"/>
-          <w:right w:val="single" w:color="auto" w:sz="4"/>
-          <w:insideH w:val="single" w:color="auto" w:sz="4"/>
-          <w:insideV w:val="single" w:color="auto" w:sz="4"/>
-        </w:tblBorders>
-      </w:tblPr>
-      <w:tblGrid>
-        <w:gridCol w:w="9360"/>
-      </w:tblGrid>
-      <w:tr>
-        <w:tc>
-          <w:tcPr>
-            <w:tcW w:type="dxa" w:w="9360"/>
-            <w:tcBorders>
-              <w:top w:val="single" w:color="BFBFBF" w:sz="6"/>
-              <w:left w:val="single" w:color="BFBFBF" w:sz="6"/>
-              <w:bottom w:val="single" w:color="BFBFBF" w:sz="6"/>
-              <w:right w:val="single" w:color="BFBFBF" w:sz="6"/>
-            </w:tcBorders>
-            <w:shd w:fill="F2F2F2" w:color="auto" w:val="clear"/>
-            <w:tcMar>
-              <w:top w:type="dxa" w:w="100"/>
-              <w:left w:type="dxa" w:w="140"/>
-              <w:bottom w:type="dxa" w:w="100"/>
-              <w:right w:type="dxa" w:w="140"/>
-            </w:tcMar>
-          </w:tcPr>
-          <w:p>
-            <w:pPr>
-              <w:spacing w:after="0"/>
-            </w:pPr>
-            <w:r>
-              <w:rPr>
-                <w:rFonts w:ascii="Consolas" w:cs="Consolas" w:eastAsia="Consolas" w:hAnsi="Consolas"/>
-                <w:sz w:val="18"/>
-                <w:szCs w:val="18"/>
-              </w:rPr>
-              <w:t xml:space="preserve">Explain in plain words, with the Egypt numbers for 2030, how the Legacy and Engineer modes differ and why legacy is inconsistent.</w:t>
-            </w:r>
-          </w:p>
-        </w:tc>
-      </w:tr>
-    </w:tbl>
-    <w:p>
-      <w:pPr>
-        <w:spacing w:after="80"/>
-      </w:pPr>
-    </w:p>
-    <w:p>
-      <w:pPr>
-        <w:spacing w:after="120"/>
-      </w:pPr>
-      <w:r>
-        <w:rPr>
-          <w:rFonts w:ascii="Arial" w:cs="Arial" w:eastAsia="Arial" w:hAnsi="Arial"/>
-          <w:sz w:val="21"/>
-          <w:szCs w:val="21"/>
-        </w:rPr>
-        <w:t xml:space="preserve">When a check fails:</w:t>
-      </w:r>
-    </w:p>
-    <w:tbl>
-      <w:tblPr>
-        <w:tblW w:type="dxa" w:w="9360"/>
-        <w:tblBorders>
-          <w:top w:val="single" w:color="auto" w:sz="4"/>
-          <w:left w:val="single" w:color="auto" w:sz="4"/>
-          <w:bottom w:val="single" w:color="auto" w:sz="4"/>
-          <w:right w:val="single" w:color="auto" w:sz="4"/>
-          <w:insideH w:val="single" w:color="auto" w:sz="4"/>
-          <w:insideV w:val="single" w:color="auto" w:sz="4"/>
-        </w:tblBorders>
-      </w:tblPr>
-      <w:tblGrid>
-        <w:gridCol w:w="9360"/>
-      </w:tblGrid>
-      <w:tr>
-        <w:tc>
-          <w:tcPr>
-            <w:tcW w:type="dxa" w:w="9360"/>
-            <w:tcBorders>
-              <w:top w:val="single" w:color="BFBFBF" w:sz="6"/>
-              <w:left w:val="single" w:color="BFBFBF" w:sz="6"/>
-              <w:bottom w:val="single" w:color="BFBFBF" w:sz="6"/>
-              <w:right w:val="single" w:color="BFBFBF" w:sz="6"/>
-            </w:tcBorders>
-            <w:shd w:fill="F2F2F2" w:color="auto" w:val="clear"/>
-            <w:tcMar>
-              <w:top w:type="dxa" w:w="100"/>
-              <w:left w:type="dxa" w:w="140"/>
-              <w:bottom w:type="dxa" w:w="100"/>
-              <w:right w:type="dxa" w:w="140"/>
-            </w:tcMar>
-          </w:tcPr>
-          <w:p>
-            <w:pPr>
-              <w:spacing w:after="0"/>
-            </w:pPr>
-            <w:r>
-              <w:rPr>
-                <w:rFonts w:ascii="Consolas" w:cs="Consolas" w:eastAsia="Consolas" w:hAnsi="Consolas"/>
-                <w:sz w:val="18"/>
-                <w:szCs w:val="18"/>
-              </w:rPr>
-              <w:t xml:space="preserve">check_tcb.py fails on &lt;name of the check&gt;. Find the cause, fix the builder (not the check), rebuild and run the check again. Tell me what was wrong.</w:t>
-            </w:r>
-          </w:p>
-        </w:tc>
-      </w:tr>
-    </w:tbl>
-    <w:p>
-      <w:pPr>
-        <w:spacing w:after="80"/>
-      </w:pPr>
-    </w:p>
-    <w:p>
-      <w:pPr>
-        <w:spacing w:after="120"/>
-      </w:pPr>
-      <w:r>
-        <w:rPr>
-          <w:rFonts w:ascii="Arial" w:cs="Arial" w:eastAsia="Arial" w:hAnsi="Arial"/>
-          <w:sz w:val="21"/>
-          <w:szCs w:val="21"/>
-        </w:rPr>
-        <w:t xml:space="preserve">Before you save:</w:t>
-      </w:r>
-    </w:p>
-    <w:tbl>
-      <w:tblPr>
-        <w:tblW w:type="dxa" w:w="9360"/>
-        <w:tblBorders>
-          <w:top w:val="single" w:color="auto" w:sz="4"/>
-          <w:left w:val="single" w:color="auto" w:sz="4"/>
-          <w:bottom w:val="single" w:color="auto" w:sz="4"/>
-          <w:right w:val="single" w:color="auto" w:sz="4"/>
-          <w:insideH w:val="single" w:color="auto" w:sz="4"/>
-          <w:insideV w:val="single" w:color="auto" w:sz="4"/>
-        </w:tblBorders>
-      </w:tblPr>
-      <w:tblGrid>
-        <w:gridCol w:w="9360"/>
-      </w:tblGrid>
-      <w:tr>
-        <w:tc>
-          <w:tcPr>
-            <w:tcW w:type="dxa" w:w="9360"/>
-            <w:tcBorders>
-              <w:top w:val="single" w:color="BFBFBF" w:sz="6"/>
-              <w:left w:val="single" w:color="BFBFBF" w:sz="6"/>
-              <w:bottom w:val="single" w:color="BFBFBF" w:sz="6"/>
-              <w:right w:val="single" w:color="BFBFBF" w:sz="6"/>
-            </w:tcBorders>
-            <w:shd w:fill="F2F2F2" w:color="auto" w:val="clear"/>
-            <w:tcMar>
-              <w:top w:type="dxa" w:w="100"/>
-              <w:left w:type="dxa" w:w="140"/>
-              <w:bottom w:type="dxa" w:w="100"/>
-              <w:right w:type="dxa" w:w="140"/>
-            </w:tcMar>
-          </w:tcPr>
-          <w:p>
-            <w:pPr>
-              <w:spacing w:after="0"/>
-            </w:pPr>
-            <w:r>
-              <w:rPr>
-                <w:rFonts w:ascii="Consolas" w:cs="Consolas" w:eastAsia="Consolas" w:hAnsi="Consolas"/>
-                <w:sz w:val="18"/>
-                <w:szCs w:val="18"/>
-              </w:rPr>
-              <w:t xml:space="preserve">Show me the changes before you save them. List every file you changed and why.</w:t>
-            </w:r>
-          </w:p>
-        </w:tc>
-      </w:tr>
-    </w:tbl>
-    <w:p>
-      <w:pPr>
-        <w:spacing w:after="80"/>
-      </w:pPr>
-    </w:p>
-    <w:p>
-      <w:pPr>
-        <w:spacing w:after="120"/>
-      </w:pPr>
-      <w:r>
-        <w:rPr>
-          <w:rFonts w:ascii="Arial" w:cs="Arial" w:eastAsia="Arial" w:hAnsi="Arial"/>
-          <w:sz w:val="21"/>
-          <w:szCs w:val="21"/>
-        </w:rPr>
-        <w:t xml:space="preserve">When it found something you did not expect:</w:t>
-      </w:r>
-    </w:p>
-    <w:tbl>
-      <w:tblPr>
-        <w:tblW w:type="dxa" w:w="9360"/>
-        <w:tblBorders>
-          <w:top w:val="single" w:color="auto" w:sz="4"/>
-          <w:left w:val="single" w:color="auto" w:sz="4"/>
-          <w:bottom w:val="single" w:color="auto" w:sz="4"/>
-          <w:right w:val="single" w:color="auto" w:sz="4"/>
-          <w:insideH w:val="single" w:color="auto" w:sz="4"/>
-          <w:insideV w:val="single" w:color="auto" w:sz="4"/>
-        </w:tblBorders>
-      </w:tblPr>
-      <w:tblGrid>
-        <w:gridCol w:w="9360"/>
-      </w:tblGrid>
-      <w:tr>
-        <w:tc>
-          <w:tcPr>
-            <w:tcW w:type="dxa" w:w="9360"/>
-            <w:tcBorders>
-              <w:top w:val="single" w:color="BFBFBF" w:sz="6"/>
-              <w:left w:val="single" w:color="BFBFBF" w:sz="6"/>
-              <w:bottom w:val="single" w:color="BFBFBF" w:sz="6"/>
-              <w:right w:val="single" w:color="BFBFBF" w:sz="6"/>
-            </w:tcBorders>
-            <w:shd w:fill="F2F2F2" w:color="auto" w:val="clear"/>
-            <w:tcMar>
-              <w:top w:type="dxa" w:w="100"/>
-              <w:left w:type="dxa" w:w="140"/>
-              <w:bottom w:type="dxa" w:w="100"/>
-              <w:right w:type="dxa" w:w="140"/>
-            </w:tcMar>
-          </w:tcPr>
-          <w:p>
-            <w:pPr>
-              <w:spacing w:after="0"/>
-            </w:pPr>
-            <w:r>
-              <w:rPr>
-                <w:rFonts w:ascii="Consolas" w:cs="Consolas" w:eastAsia="Consolas" w:hAnsi="Consolas"/>
-                <w:sz w:val="18"/>
-                <w:szCs w:val="18"/>
-              </w:rPr>
-              <w:t xml:space="preserve">Is this a legacy bug or a legacy issue under NORMS.md section 0? Show me the legacy cells. If unsure, treat it as an issue, replicate it and register it.</w:t>
-            </w:r>
-          </w:p>
-        </w:tc>
-      </w:tr>
-    </w:tbl>
-    <w:p>
-      <w:pPr>
-        <w:spacing w:after="80"/>
-      </w:pPr>
-    </w:p>
-    <w:p>
-      <w:pPr>
-        <w:spacing w:after="120"/>
-      </w:pPr>
-      <w:r>
-        <w:rPr>
-          <w:rFonts w:ascii="Arial" w:cs="Arial" w:eastAsia="Arial" w:hAnsi="Arial"/>
-          <w:sz w:val="21"/>
-          <w:szCs w:val="21"/>
-        </w:rPr>
-        <w:t xml:space="preserve">Stop for the day, and resume later in a new session:</w:t>
-      </w:r>
-    </w:p>
-    <w:tbl>
-      <w:tblPr>
-        <w:tblW w:type="dxa" w:w="9360"/>
-        <w:tblBorders>
-          <w:top w:val="single" w:color="auto" w:sz="4"/>
-          <w:left w:val="single" w:color="auto" w:sz="4"/>
-          <w:bottom w:val="single" w:color="auto" w:sz="4"/>
-          <w:right w:val="single" w:color="auto" w:sz="4"/>
-          <w:insideH w:val="single" w:color="auto" w:sz="4"/>
-          <w:insideV w:val="single" w:color="auto" w:sz="4"/>
-        </w:tblBorders>
-      </w:tblPr>
-      <w:tblGrid>
-        <w:gridCol w:w="9360"/>
-      </w:tblGrid>
-      <w:tr>
-        <w:tc>
-          <w:tcPr>
-            <w:tcW w:type="dxa" w:w="9360"/>
-            <w:tcBorders>
-              <w:top w:val="single" w:color="BFBFBF" w:sz="6"/>
-              <w:left w:val="single" w:color="BFBFBF" w:sz="6"/>
-              <w:bottom w:val="single" w:color="BFBFBF" w:sz="6"/>
-              <w:right w:val="single" w:color="BFBFBF" w:sz="6"/>
-            </w:tcBorders>
-            <w:shd w:fill="F2F2F2" w:color="auto" w:val="clear"/>
-            <w:tcMar>
-              <w:top w:type="dxa" w:w="100"/>
-              <w:left w:type="dxa" w:w="140"/>
-              <w:bottom w:type="dxa" w:w="100"/>
-              <w:right w:type="dxa" w:w="140"/>
-            </w:tcMar>
-          </w:tcPr>
-          <w:p>
-            <w:pPr>
-              <w:spacing w:after="0"/>
-            </w:pPr>
-            <w:r>
-              <w:rPr>
-                <w:rFonts w:ascii="Consolas" w:cs="Consolas" w:eastAsia="Consolas" w:hAnsi="Consolas"/>
-                <w:sz w:val="18"/>
-                <w:szCs w:val="18"/>
-              </w:rPr>
-              <w:t xml:space="preserve">Stop here. Add the CAVEATS.md entry and the TODO items for what is left, and tell me which phase is next.</w:t>
-            </w:r>
-          </w:p>
-        </w:tc>
-      </w:tr>
-    </w:tbl>
-    <w:p>
-      <w:pPr>
-        <w:spacing w:after="80"/>
-      </w:pPr>
-    </w:p>
-    <w:tbl>
-      <w:tblPr>
-        <w:tblW w:type="dxa" w:w="9360"/>
-        <w:tblBorders>
-          <w:top w:val="single" w:color="auto" w:sz="4"/>
-          <w:left w:val="single" w:color="auto" w:sz="4"/>
-          <w:bottom w:val="single" w:color="auto" w:sz="4"/>
-          <w:right w:val="single" w:color="auto" w:sz="4"/>
-          <w:insideH w:val="single" w:color="auto" w:sz="4"/>
-          <w:insideV w:val="single" w:color="auto" w:sz="4"/>
-        </w:tblBorders>
-      </w:tblPr>
-      <w:tblGrid>
-        <w:gridCol w:w="9360"/>
-      </w:tblGrid>
-      <w:tr>
-        <w:tc>
-          <w:tcPr>
-            <w:tcW w:type="dxa" w:w="9360"/>
-            <w:tcBorders>
-              <w:top w:val="single" w:color="BFBFBF" w:sz="6"/>
-              <w:left w:val="single" w:color="BFBFBF" w:sz="6"/>
-              <w:bottom w:val="single" w:color="BFBFBF" w:sz="6"/>
-              <w:right w:val="single" w:color="BFBFBF" w:sz="6"/>
-            </w:tcBorders>
-            <w:shd w:fill="F2F2F2" w:color="auto" w:val="clear"/>
-            <w:tcMar>
-              <w:top w:type="dxa" w:w="100"/>
-              <w:left w:type="dxa" w:w="140"/>
-              <w:bottom w:type="dxa" w:w="100"/>
-              <w:right w:type="dxa" w:w="140"/>
-            </w:tcMar>
-          </w:tcPr>
-          <w:p>
-            <w:pPr>
-              <w:spacing w:after="0"/>
-            </w:pPr>
-            <w:r>
-              <w:rPr>
-                <w:rFonts w:ascii="Consolas" w:cs="Consolas" w:eastAsia="Consolas" w:hAnsi="Consolas"/>
-                <w:sz w:val="18"/>
-                <w:szCs w:val="18"/>
-              </w:rPr>
-              <w:t xml:space="preserve">@AGENTS.md @excel_ai/plans/prompts/TCB_module_prompt.md We are at phase &lt;n&gt;. Read the bottom of CAVEATS.md and the last report, then do phase &lt;n&gt; only and stop.</w:t>
-            </w:r>
-          </w:p>
-        </w:tc>
-      </w:tr>
-    </w:tbl>
-    <w:p>
-      <w:pPr>
-        <w:spacing w:after="80"/>
-      </w:pPr>
-    </w:p>
-    <w:p>
-      <w:pPr>
-        <w:spacing w:after="120"/>
-      </w:pPr>
-      <w:r>
-        <w:rPr>
-          <w:rFonts w:ascii="Arial" w:cs="Arial" w:eastAsia="Arial" w:hAnsi="Arial"/>
-          <w:sz w:val="21"/>
-          <w:szCs w:val="21"/>
-        </w:rPr>
-        <w:t xml:space="preserve">Then save to GitHub: close the workbooks and double-click </w:t>
-      </w:r>
-      <w:r>
-        <w:rPr>
-          <w:rFonts w:ascii="Consolas" w:cs="Consolas" w:eastAsia="Consolas" w:hAnsi="Consolas"/>
-          <w:sz w:val="19"/>
-          <w:szCs w:val="19"/>
-        </w:rPr>
-        <w:t xml:space="preserve">SyncRepo.bat</w:t>
-      </w:r>
-      <w:r>
-        <w:rPr>
-          <w:rFonts w:ascii="Arial" w:cs="Arial" w:eastAsia="Arial" w:hAnsi="Arial"/>
-          <w:sz w:val="21"/>
-          <w:szCs w:val="21"/>
-        </w:rPr>
-        <w:t xml:space="preserve"> in the repo folder.</w:t>
+        <w:t xml:space="preserve">Part 2. Update to the new repos (existing users)</w:t>
+      </w:r>
+    </w:p>
+    <w:p>
+      <w:pPr>
+        <w:spacing w:after="120"/>
+      </w:pPr>
+      <w:r>
+        <w:rPr>
+          <w:rFonts w:ascii="Arial" w:cs="Arial" w:eastAsia="Arial" w:hAnsi="Arial"/>
+          <w:sz w:val="21"/>
+          <w:szCs w:val="21"/>
+        </w:rPr>
+        <w:t xml:space="preserve">The repos have moved from github.com/cpmodel to github.com/cpmodelai, and some default folder names have changed. If you set up before this, do these steps once. The new RepoDirectory.csv in Repos.zip lists the new addresses.</w:t>
+      </w:r>
+    </w:p>
+    <w:p>
+      <w:pPr>
+        <w:spacing w:after="120"/>
+      </w:pPr>
+      <w:r>
+        <w:rPr>
+          <w:rFonts w:ascii="Arial" w:cs="Arial" w:eastAsia="Arial" w:hAnsi="Arial"/>
+          <w:b/>
+          <w:bCs/>
+          <w:sz w:val="21"/>
+          <w:szCs w:val="21"/>
+        </w:rPr>
+        <w:t xml:space="preserve">Repo</w:t>
+      </w:r>
+      <w:r>
+        <w:rPr>
+          <w:rFonts w:ascii="Arial" w:cs="Arial" w:eastAsia="Arial" w:hAnsi="Arial"/>
+          <w:sz w:val="21"/>
+          <w:szCs w:val="21"/>
+        </w:rPr>
+        <w:t xml:space="preserve"> · </w:t>
+      </w:r>
+      <w:r>
+        <w:rPr>
+          <w:rFonts w:ascii="Arial" w:cs="Arial" w:eastAsia="Arial" w:hAnsi="Arial"/>
+          <w:b/>
+          <w:bCs/>
+          <w:sz w:val="21"/>
+          <w:szCs w:val="21"/>
+        </w:rPr>
+        <w:t xml:space="preserve">Old address</w:t>
+      </w:r>
+      <w:r>
+        <w:rPr>
+          <w:rFonts w:ascii="Arial" w:cs="Arial" w:eastAsia="Arial" w:hAnsi="Arial"/>
+          <w:sz w:val="21"/>
+          <w:szCs w:val="21"/>
+        </w:rPr>
+        <w:t xml:space="preserve"> · </w:t>
+      </w:r>
+      <w:r>
+        <w:rPr>
+          <w:rFonts w:ascii="Arial" w:cs="Arial" w:eastAsia="Arial" w:hAnsi="Arial"/>
+          <w:b/>
+          <w:bCs/>
+          <w:sz w:val="21"/>
+          <w:szCs w:val="21"/>
+        </w:rPr>
+        <w:t xml:space="preserve">New address (RepoName)</w:t>
+      </w:r>
+      <w:r>
+        <w:rPr>
+          <w:rFonts w:ascii="Arial" w:cs="Arial" w:eastAsia="Arial" w:hAnsi="Arial"/>
+          <w:sz w:val="21"/>
+          <w:szCs w:val="21"/>
+        </w:rPr>
+        <w:t xml:space="preserve"> · </w:t>
+      </w:r>
+      <w:r>
+        <w:rPr>
+          <w:rFonts w:ascii="Arial" w:cs="Arial" w:eastAsia="Arial" w:hAnsi="Arial"/>
+          <w:b/>
+          <w:bCs/>
+          <w:sz w:val="21"/>
+          <w:szCs w:val="21"/>
+        </w:rPr>
+        <w:t xml:space="preserve">Default folder (FolderName)</w:t>
+      </w:r>
+    </w:p>
+    <w:p>
+      <w:pPr>
+        <w:spacing w:after="120"/>
+      </w:pPr>
+      <w:r>
+        <w:rPr>
+          <w:rFonts w:ascii="Arial" w:cs="Arial" w:eastAsia="Arial" w:hAnsi="Arial"/>
+          <w:sz w:val="21"/>
+          <w:szCs w:val="21"/>
+        </w:rPr>
+        <w:t xml:space="preserve">Climate-fiscal AI tools · github.com/cpmodel/new-ai-tools · github.com/cpmodelai/climate-fiscal-ai-tools · climate-fiscal-ai-tools (was new-ai-tools)</w:t>
+      </w:r>
+    </w:p>
+    <w:p>
+      <w:pPr>
+        <w:spacing w:after="120"/>
+      </w:pPr>
+      <w:r>
+        <w:rPr>
+          <w:rFonts w:ascii="Arial" w:cs="Arial" w:eastAsia="Arial" w:hAnsi="Arial"/>
+          <w:sz w:val="21"/>
+          <w:szCs w:val="21"/>
+        </w:rPr>
+        <w:t xml:space="preserve">CPAT-AI · github.com/cpmodel/CPAT-AI · github.com/cpmodelai/cpat_ai · CPAT-AI</w:t>
+      </w:r>
+    </w:p>
+    <w:p>
+      <w:pPr>
+        <w:spacing w:after="120"/>
+      </w:pPr>
+      <w:r>
+        <w:rPr>
+          <w:rFonts w:ascii="Arial" w:cs="Arial" w:eastAsia="Arial" w:hAnsi="Arial"/>
+          <w:sz w:val="21"/>
+          <w:szCs w:val="21"/>
+        </w:rPr>
+        <w:t xml:space="preserve">Repo tools · (new) · github.com/cpmodelai/repo-tools · repo-tools</w:t>
+      </w:r>
+    </w:p>
+    <w:p>
+      <w:pPr>
+        <w:spacing w:after="120"/>
+      </w:pPr>
+      <w:r>
+        <w:rPr>
+          <w:rFonts w:ascii="Arial" w:cs="Arial" w:eastAsia="Arial" w:hAnsi="Arial"/>
+          <w:b/>
+          <w:bCs/>
+          <w:sz w:val="21"/>
+          <w:szCs w:val="21"/>
+        </w:rPr>
+        <w:t xml:space="preserve">1. Save your work first.</w:t>
+      </w:r>
+      <w:r>
+        <w:rPr>
+          <w:rFonts w:ascii="Arial" w:cs="Arial" w:eastAsia="Arial" w:hAnsi="Arial"/>
+          <w:sz w:val="21"/>
+          <w:szCs w:val="21"/>
+        </w:rPr>
+        <w:t xml:space="preserve"> Double-click SyncAllRepos.bat (or see Part 3, Step 3) so nothing is lost. If a push fails, copy the files you changed somewhere safe.</w:t>
+      </w:r>
+    </w:p>
+    <w:p>
+      <w:pPr>
+        <w:spacing w:after="120"/>
+      </w:pPr>
+      <w:r>
+        <w:rPr>
+          <w:rFonts w:ascii="Arial" w:cs="Arial" w:eastAsia="Arial" w:hAnsi="Arial"/>
+          <w:b/>
+          <w:bCs/>
+          <w:sz w:val="21"/>
+          <w:szCs w:val="21"/>
+        </w:rPr>
+        <w:t xml:space="preserve">2. Get the new files.</w:t>
+      </w:r>
+      <w:r>
+        <w:rPr>
+          <w:rFonts w:ascii="Arial" w:cs="Arial" w:eastAsia="Arial" w:hAnsi="Arial"/>
+          <w:sz w:val="21"/>
+          <w:szCs w:val="21"/>
+        </w:rPr>
+        <w:t xml:space="preserve"> Download Repos.zip (Action C) and extract it into C:\Users\WB&lt;PID&gt;\Repos. Let it replace RepoDirectory.csv, SyncAllRepos.bat and CloneRepos.bat.</w:t>
+      </w:r>
+    </w:p>
+    <w:p>
+      <w:pPr>
+        <w:spacing w:after="120"/>
+      </w:pPr>
+      <w:r>
+        <w:rPr>
+          <w:rFonts w:ascii="Arial" w:cs="Arial" w:eastAsia="Arial" w:hAnsi="Arial"/>
+          <w:b/>
+          <w:bCs/>
+          <w:sz w:val="21"/>
+          <w:szCs w:val="21"/>
+        </w:rPr>
+        <w:t xml:space="preserve">3. Check the addresses.</w:t>
+      </w:r>
+      <w:r>
+        <w:rPr>
+          <w:rFonts w:ascii="Arial" w:cs="Arial" w:eastAsia="Arial" w:hAnsi="Arial"/>
+          <w:sz w:val="21"/>
+          <w:szCs w:val="21"/>
+        </w:rPr>
+        <w:t xml:space="preserve"> Open RepoDirectory.csv in Notepad. Every RepoName must start with https://github.com/cpmodelai/ (not cpmodel).</w:t>
+      </w:r>
+    </w:p>
+    <w:p>
+      <w:pPr>
+        <w:spacing w:after="120"/>
+      </w:pPr>
+      <w:r>
+        <w:rPr>
+          <w:rFonts w:ascii="Arial" w:cs="Arial" w:eastAsia="Arial" w:hAnsi="Arial"/>
+          <w:b/>
+          <w:bCs/>
+          <w:sz w:val="21"/>
+          <w:szCs w:val="21"/>
+        </w:rPr>
+        <w:t xml:space="preserve">4. Check the folder names.</w:t>
+      </w:r>
+      <w:r>
+        <w:rPr>
+          <w:rFonts w:ascii="Arial" w:cs="Arial" w:eastAsia="Arial" w:hAnsi="Arial"/>
+          <w:sz w:val="21"/>
+          <w:szCs w:val="21"/>
+        </w:rPr>
+        <w:t xml:space="preserve"> FolderName is the folder inside Repos for each repo, and it must match exactly. The defaults have changed (table above): use the default (and move the old folder aside, step 5), or change FolderName to the name you want.</w:t>
+      </w:r>
+    </w:p>
+    <w:p>
+      <w:pPr>
+        <w:spacing w:after="120"/>
+      </w:pPr>
+      <w:r>
+        <w:rPr>
+          <w:rFonts w:ascii="Arial" w:cs="Arial" w:eastAsia="Arial" w:hAnsi="Arial"/>
+          <w:b/>
+          <w:bCs/>
+          <w:sz w:val="21"/>
+          <w:szCs w:val="21"/>
+        </w:rPr>
+        <w:t xml:space="preserve">5. Move the old folders aside.</w:t>
+      </w:r>
+      <w:r>
+        <w:rPr>
+          <w:rFonts w:ascii="Arial" w:cs="Arial" w:eastAsia="Arial" w:hAnsi="Arial"/>
+          <w:sz w:val="21"/>
+          <w:szCs w:val="21"/>
+        </w:rPr>
+        <w:t xml:space="preserve"> Rename each old folder, for example new-ai-tools to new-ai-tools_old and CPAT-AI to CPAT-AI_old. They still point to the old addresses.</w:t>
+      </w:r>
+    </w:p>
+    <w:p>
+      <w:pPr>
+        <w:spacing w:after="120"/>
+      </w:pPr>
+      <w:r>
+        <w:rPr>
+          <w:rFonts w:ascii="Arial" w:cs="Arial" w:eastAsia="Arial" w:hAnsi="Arial"/>
+          <w:b/>
+          <w:bCs/>
+          <w:sz w:val="21"/>
+          <w:szCs w:val="21"/>
+        </w:rPr>
+        <w:t xml:space="preserve">6. Download the new repos.</w:t>
+      </w:r>
+      <w:r>
+        <w:rPr>
+          <w:rFonts w:ascii="Arial" w:cs="Arial" w:eastAsia="Arial" w:hAnsi="Arial"/>
+          <w:sz w:val="21"/>
+          <w:szCs w:val="21"/>
+        </w:rPr>
+        <w:t xml:space="preserve"> Double-click CloneRepos.bat. It downloads every repo in RepoDirectory.csv whose folder is missing, and warns about any folder that points to another address. Sign in to GitHub if asked; your ID must be in cpmodelai (Action D).</w:t>
+      </w:r>
+    </w:p>
+    <w:p>
+      <w:pPr>
+        <w:spacing w:after="120"/>
+      </w:pPr>
+      <w:r>
+        <w:rPr>
+          <w:rFonts w:ascii="Arial" w:cs="Arial" w:eastAsia="Arial" w:hAnsi="Arial"/>
+          <w:b/>
+          <w:bCs/>
+          <w:sz w:val="21"/>
+          <w:szCs w:val="21"/>
+        </w:rPr>
+        <w:t xml:space="preserve">7. Copy across and check.</w:t>
+      </w:r>
+      <w:r>
+        <w:rPr>
+          <w:rFonts w:ascii="Arial" w:cs="Arial" w:eastAsia="Arial" w:hAnsi="Arial"/>
+          <w:sz w:val="21"/>
+          <w:szCs w:val="21"/>
+        </w:rPr>
+        <w:t xml:space="preserve"> Copy any unsaved files from the _old folders into the new ones. Double-click SyncAllRepos.bat: every repo shows Pulling, none shows [SKIP] Folder not found. Then delete the _old folders.</w:t>
+      </w:r>
+    </w:p>
+    <w:p>
+      <w:pPr>
+        <w:spacing w:after="120"/>
+      </w:pPr>
+      <w:r>
+        <w:rPr>
+          <w:rFonts w:ascii="Arial" w:cs="Arial" w:eastAsia="Arial" w:hAnsi="Arial"/>
+          <w:b/>
+          <w:bCs/>
+          <w:sz w:val="21"/>
+          <w:szCs w:val="21"/>
+        </w:rPr>
+        <w:t xml:space="preserve">8. Update the Copilot app.</w:t>
+      </w:r>
+      <w:r>
+        <w:rPr>
+          <w:rFonts w:ascii="Arial" w:cs="Arial" w:eastAsia="Arial" w:hAnsi="Arial"/>
+          <w:sz w:val="21"/>
+          <w:szCs w:val="21"/>
+        </w:rPr>
+        <w:t xml:space="preserve"> Add the new folders in the sidebar (Part 3, Step 1) and remove the old ones.</w:t>
+      </w:r>
+    </w:p>
+    <w:p>
+      <w:pPr>
+        <w:spacing w:after="120"/>
+      </w:pPr>
+      <w:r>
+        <w:rPr>
+          <w:rFonts w:ascii="Arial" w:cs="Arial" w:eastAsia="Arial" w:hAnsi="Arial"/>
+          <w:b/>
+          <w:bCs/>
+          <w:sz w:val="21"/>
+          <w:szCs w:val="21"/>
+        </w:rPr>
+        <w:t xml:space="preserve">Check:</w:t>
+      </w:r>
+      <w:r>
+        <w:rPr>
+          <w:rFonts w:ascii="Arial" w:cs="Arial" w:eastAsia="Arial" w:hAnsi="Arial"/>
+          <w:sz w:val="21"/>
+          <w:szCs w:val="21"/>
+        </w:rPr>
+        <w:t xml:space="preserve"> CloneRepos.bat shows [OK] for every repo. In each repo folder, git remote -v shows https://github.com/cpmodelai/...</w:t>
+      </w:r>
+    </w:p>
+    <w:p>
+      <w:pPr>
+        <w:spacing w:after="120"/>
+      </w:pPr>
+      <w:r>
+        <w:rPr>
+          <w:rFonts w:ascii="Arial" w:cs="Arial" w:eastAsia="Arial" w:hAnsi="Arial"/>
+          <w:sz w:val="21"/>
+          <w:szCs w:val="21"/>
+        </w:rPr>
+        <w:t xml:space="preserve">Download fresh rather than re-pointing the old folders: the new repos do not share all of the old history, so pulls into an old folder can fail.</w:t>
+      </w:r>
+    </w:p>
+    <w:p>
+      <w:pPr>
+        <w:pStyle w:val="Heading2"/>
+        <w:spacing w:after="100" w:before="200"/>
+      </w:pPr>
+      <w:r>
+        <w:rPr>
+          <w:rFonts w:ascii="Arial" w:cs="Arial" w:eastAsia="Arial" w:hAnsi="Arial"/>
+          <w:b/>
+          <w:bCs/>
+          <w:sz w:val="24"/>
+          <w:szCs w:val="24"/>
+        </w:rPr>
+        <w:t xml:space="preserve">Part 3. Tools (GitHub Copilot app)</w:t>
+      </w:r>
+    </w:p>
+    <w:p>
+      <w:pPr>
+        <w:spacing w:after="120"/>
+      </w:pPr>
+      <w:r>
+        <w:rPr>
+          <w:rFonts w:ascii="Arial" w:cs="Arial" w:eastAsia="Arial" w:hAnsi="Arial"/>
+          <w:sz w:val="21"/>
+          <w:szCs w:val="21"/>
+        </w:rPr>
+        <w:t xml:space="preserve">AI tools quick start: three tools, each in its own repo. The repo address is at the start of each tool.</w:t>
+      </w:r>
+    </w:p>
+    <w:p>
+      <w:pPr>
+        <w:spacing w:after="120"/>
+      </w:pPr>
+      <w:r>
+        <w:rPr>
+          <w:rFonts w:ascii="Arial" w:cs="Arial" w:eastAsia="Arial" w:hAnsi="Arial"/>
+          <w:sz w:val="21"/>
+          <w:szCs w:val="21"/>
+        </w:rPr>
+        <w:t xml:space="preserve">We assume you already have</w:t>
+      </w:r>
+    </w:p>
+    <w:p>
+      <w:pPr>
+        <w:pStyle w:val="ListParagraph"/>
+        <w:numPr>
+          <w:ilvl w:val="0"/>
+          <w:numId w:val="2"/>
+        </w:numPr>
+        <w:spacing w:after="60"/>
+      </w:pPr>
+      <w:r>
+        <w:rPr>
+          <w:rFonts w:ascii="Arial" w:cs="Arial" w:eastAsia="Arial" w:hAnsi="Arial"/>
+          <w:sz w:val="21"/>
+          <w:szCs w:val="21"/>
+        </w:rPr>
+        <w:t xml:space="preserve">The repo for your tool downloaded on your laptop (C:\Users\WB&lt;PID&gt;\Repos\folder&gt;, Part 1 or 2) and up to date.</w:t>
+      </w:r>
+    </w:p>
+    <w:p>
+      <w:pPr>
+        <w:pStyle w:val="ListParagraph"/>
+        <w:numPr>
+          <w:ilvl w:val="0"/>
+          <w:numId w:val="2"/>
+        </w:numPr>
+        <w:spacing w:after="60"/>
+      </w:pPr>
+      <w:r>
+        <w:rPr>
+          <w:rFonts w:ascii="Arial" w:cs="Arial" w:eastAsia="Arial" w:hAnsi="Arial"/>
+          <w:sz w:val="21"/>
+          <w:szCs w:val="21"/>
+        </w:rPr>
+        <w:t xml:space="preserve">The GitHub Copilot app installed (Microsoft Store) and signed in with your GitHub account.</w:t>
+      </w:r>
+    </w:p>
+    <w:p>
+      <w:pPr>
+        <w:pStyle w:val="ListParagraph"/>
+        <w:numPr>
+          <w:ilvl w:val="0"/>
+          <w:numId w:val="2"/>
+        </w:numPr>
+        <w:spacing w:after="60"/>
+      </w:pPr>
+      <w:r>
+        <w:rPr>
+          <w:rFonts w:ascii="Arial" w:cs="Arial" w:eastAsia="Arial" w:hAnsi="Arial"/>
+          <w:sz w:val="21"/>
+          <w:szCs w:val="21"/>
+        </w:rPr>
+        <w:t xml:space="preserve">Part 1 done (and Part 2 if you set up before the move). Not there yet? See Presentations/GitHub_Copilot_AI_User_Guide.pptx.</w:t>
+      </w:r>
+    </w:p>
+    <w:p>
+      <w:pPr>
+        <w:spacing w:after="120"/>
+      </w:pPr>
+      <w:r>
+        <w:rPr>
+          <w:rFonts w:ascii="Arial" w:cs="Arial" w:eastAsia="Arial" w:hAnsi="Arial"/>
+          <w:sz w:val="21"/>
+          <w:szCs w:val="21"/>
+        </w:rPr>
+        <w:t xml:space="preserve">Steps 1-2 set up a session. Then do Tool 1, 2 or 3. Step 3 saves your work.</w:t>
+      </w:r>
+    </w:p>
+    <w:p>
+      <w:pPr>
+        <w:pStyle w:val="Heading2"/>
+        <w:spacing w:after="100" w:before="200"/>
+      </w:pPr>
+      <w:r>
+        <w:rPr>
+          <w:rFonts w:ascii="Arial" w:cs="Arial" w:eastAsia="Arial" w:hAnsi="Arial"/>
+          <w:b/>
+          <w:bCs/>
+          <w:sz w:val="24"/>
+          <w:szCs w:val="24"/>
+        </w:rPr>
+        <w:t xml:space="preserve">Step 1. Open the repo and start a session (once per task)</w:t>
+      </w:r>
+    </w:p>
+    <w:p>
+      <w:pPr>
+        <w:spacing w:after="120"/>
+      </w:pPr>
+      <w:r>
+        <w:rPr>
+          <w:rFonts w:ascii="Arial" w:cs="Arial" w:eastAsia="Arial" w:hAnsi="Arial"/>
+          <w:b/>
+          <w:bCs/>
+          <w:sz w:val="21"/>
+          <w:szCs w:val="21"/>
+        </w:rPr>
+        <w:t xml:space="preserve">1. Add the repo (first time only).</w:t>
+      </w:r>
+      <w:r>
+        <w:rPr>
+          <w:rFonts w:ascii="Arial" w:cs="Arial" w:eastAsia="Arial" w:hAnsi="Arial"/>
+          <w:sz w:val="21"/>
+          <w:szCs w:val="21"/>
+        </w:rPr>
+        <w:t xml:space="preserve"> In the sidebar, click + next to Projects, then Open folder. Pick the tool’s repo folder, for example Repos\climate-fiscal-ai-tools. It stays in the sidebar.</w:t>
+      </w:r>
+    </w:p>
+    <w:p>
+      <w:pPr>
+        <w:spacing w:after="120"/>
+      </w:pPr>
+      <w:r>
+        <w:rPr>
+          <w:rFonts w:ascii="Arial" w:cs="Arial" w:eastAsia="Arial" w:hAnsi="Arial"/>
+          <w:b/>
+          <w:bCs/>
+          <w:sz w:val="21"/>
+          <w:szCs w:val="21"/>
+        </w:rPr>
+        <w:t xml:space="preserve">2. Start a session.</w:t>
+      </w:r>
+      <w:r>
+        <w:rPr>
+          <w:rFonts w:ascii="Arial" w:cs="Arial" w:eastAsia="Arial" w:hAnsi="Arial"/>
+          <w:sz w:val="21"/>
+          <w:szCs w:val="21"/>
+        </w:rPr>
+        <w:t xml:space="preserve"> Point at the repo in the sidebar and click the + next to it.</w:t>
+      </w:r>
+    </w:p>
+    <w:p>
+      <w:pPr>
+        <w:spacing w:after="120"/>
+      </w:pPr>
+      <w:r>
+        <w:rPr>
+          <w:rFonts w:ascii="Arial" w:cs="Arial" w:eastAsia="Arial" w:hAnsi="Arial"/>
+          <w:b/>
+          <w:bCs/>
+          <w:sz w:val="21"/>
+          <w:szCs w:val="21"/>
+        </w:rPr>
+        <w:t xml:space="preserve">3. Work in your folder.</w:t>
+      </w:r>
+      <w:r>
+        <w:rPr>
+          <w:rFonts w:ascii="Arial" w:cs="Arial" w:eastAsia="Arial" w:hAnsi="Arial"/>
+          <w:sz w:val="21"/>
+          <w:szCs w:val="21"/>
+        </w:rPr>
+        <w:t xml:space="preserve"> Under the prompt box, open the workspace selector and choose Current checkout. Copilot then edits the repo folder on your laptop.</w:t>
+      </w:r>
+    </w:p>
+    <w:p>
+      <w:pPr>
+        <w:pStyle w:val="Heading2"/>
+        <w:spacing w:after="100" w:before="200"/>
+      </w:pPr>
+      <w:r>
+        <w:rPr>
+          <w:rFonts w:ascii="Arial" w:cs="Arial" w:eastAsia="Arial" w:hAnsi="Arial"/>
+          <w:b/>
+          <w:bCs/>
+          <w:sz w:val="24"/>
+          <w:szCs w:val="24"/>
+        </w:rPr>
+        <w:t xml:space="preserve">Step 2. Pick the model and the mode (every session)</w:t>
+      </w:r>
+    </w:p>
+    <w:p>
+      <w:pPr>
+        <w:spacing w:after="120"/>
+      </w:pPr>
+      <w:r>
+        <w:rPr>
+          <w:rFonts w:ascii="Arial" w:cs="Arial" w:eastAsia="Arial" w:hAnsi="Arial"/>
+          <w:b/>
+          <w:bCs/>
+          <w:sz w:val="21"/>
+          <w:szCs w:val="21"/>
+        </w:rPr>
+        <w:t xml:space="preserve">1. Model.</w:t>
+      </w:r>
+      <w:r>
+        <w:rPr>
+          <w:rFonts w:ascii="Arial" w:cs="Arial" w:eastAsia="Arial" w:hAnsi="Arial"/>
+          <w:sz w:val="21"/>
+          <w:szCs w:val="21"/>
+        </w:rPr>
+        <w:t xml:space="preserve"> Click the model chip under the prompt box. Switch Auto off, then pick Claude Sonnet for everyday work, Claude Opus for the excise research.</w:t>
+      </w:r>
+    </w:p>
+    <w:p>
+      <w:pPr>
+        <w:spacing w:after="120"/>
+      </w:pPr>
+      <w:r>
+        <w:rPr>
+          <w:rFonts w:ascii="Arial" w:cs="Arial" w:eastAsia="Arial" w:hAnsi="Arial"/>
+          <w:b/>
+          <w:bCs/>
+          <w:sz w:val="21"/>
+          <w:szCs w:val="21"/>
+        </w:rPr>
+        <w:t xml:space="preserve">2. Mode.</w:t>
+      </w:r>
+      <w:r>
+        <w:rPr>
+          <w:rFonts w:ascii="Arial" w:cs="Arial" w:eastAsia="Arial" w:hAnsi="Arial"/>
+          <w:sz w:val="21"/>
+          <w:szCs w:val="21"/>
+        </w:rPr>
+        <w:t xml:space="preserve"> Click the mode chip and pick Interactive: Copilot asks before it acts.</w:t>
+      </w:r>
+    </w:p>
+    <w:p>
+      <w:pPr>
+        <w:spacing w:after="120"/>
+      </w:pPr>
+      <w:r>
+        <w:rPr>
+          <w:rFonts w:ascii="Arial" w:cs="Arial" w:eastAsia="Arial" w:hAnsi="Arial"/>
+          <w:b/>
+          <w:bCs/>
+          <w:sz w:val="21"/>
+          <w:szCs w:val="21"/>
+        </w:rPr>
+        <w:t xml:space="preserve">3. Credits.</w:t>
+      </w:r>
+      <w:r>
+        <w:rPr>
+          <w:rFonts w:ascii="Arial" w:cs="Arial" w:eastAsia="Arial" w:hAnsi="Arial"/>
+          <w:sz w:val="21"/>
+          <w:szCs w:val="21"/>
+        </w:rPr>
+        <w:t xml:space="preserve"> Type /context at any time to see the AI credits the session has used.</w:t>
+      </w:r>
+    </w:p>
+    <w:p>
+      <w:pPr>
+        <w:pStyle w:val="Heading2"/>
+        <w:spacing w:after="100" w:before="200"/>
+      </w:pPr>
+      <w:r>
+        <w:rPr>
+          <w:rFonts w:ascii="Arial" w:cs="Arial" w:eastAsia="Arial" w:hAnsi="Arial"/>
+          <w:b/>
+          <w:bCs/>
+          <w:sz w:val="24"/>
+          <w:szCs w:val="24"/>
+        </w:rPr>
+        <w:t xml:space="preserve">Tool 1. Excise diagnostic for Indonesia (Claude Opus · Interactive)</w:t>
+      </w:r>
+    </w:p>
+    <w:p>
+      <w:pPr>
+        <w:spacing w:after="120"/>
+      </w:pPr>
+      <w:r>
+        <w:rPr>
+          <w:rFonts w:ascii="Arial" w:cs="Arial" w:eastAsia="Arial" w:hAnsi="Arial"/>
+          <w:b/>
+          <w:bCs/>
+          <w:sz w:val="21"/>
+          <w:szCs w:val="21"/>
+        </w:rPr>
+        <w:t xml:space="preserve">Repo:</w:t>
+      </w:r>
+      <w:r>
+        <w:rPr>
+          <w:rFonts w:ascii="Arial" w:cs="Arial" w:eastAsia="Arial" w:hAnsi="Arial"/>
+          <w:sz w:val="21"/>
+          <w:szCs w:val="21"/>
+        </w:rPr>
+        <w:t xml:space="preserve"> https://github.com/cpmodelai/climate-fiscal-ai-tools · </w:t>
+      </w:r>
+      <w:r>
+        <w:rPr>
+          <w:rFonts w:ascii="Arial" w:cs="Arial" w:eastAsia="Arial" w:hAnsi="Arial"/>
+          <w:b/>
+          <w:bCs/>
+          <w:sz w:val="21"/>
+          <w:szCs w:val="21"/>
+        </w:rPr>
+        <w:t xml:space="preserve">Folder:</w:t>
+      </w:r>
+      <w:r>
+        <w:rPr>
+          <w:rFonts w:ascii="Arial" w:cs="Arial" w:eastAsia="Arial" w:hAnsi="Arial"/>
+          <w:sz w:val="21"/>
+          <w:szCs w:val="21"/>
+        </w:rPr>
+        <w:t xml:space="preserve"> Repos\climate-fiscal-ai-tools</w:t>
+      </w:r>
+    </w:p>
+    <w:p>
+      <w:pPr>
+        <w:spacing w:after="120"/>
+      </w:pPr>
+      <w:r>
+        <w:rPr>
+          <w:rFonts w:ascii="Arial" w:cs="Arial" w:eastAsia="Arial" w:hAnsi="Arial"/>
+          <w:b/>
+          <w:bCs/>
+          <w:sz w:val="21"/>
+          <w:szCs w:val="21"/>
+        </w:rPr>
+        <w:t xml:space="preserve">⚠ Deep research uses a lot of credits. Send one prompt, read the answer, then send the next. Check /context as you go. Stop and fix anything wrong before going on.</w:t>
+      </w:r>
+    </w:p>
+    <w:p>
+      <w:pPr>
+        <w:spacing w:after="120"/>
+      </w:pPr>
+      <w:r>
+        <w:rPr>
+          <w:rFonts w:ascii="Arial" w:cs="Arial" w:eastAsia="Arial" w:hAnsi="Arial"/>
+          <w:sz w:val="21"/>
+          <w:szCs w:val="21"/>
+        </w:rPr>
+        <w:t xml:space="preserve">Attach the instructions: type @ and pick user_guide/excise_diagnostic_process.md (or drag the file onto the prompt box).</w:t>
+      </w:r>
+    </w:p>
+    <w:p>
+      <w:pPr>
+        <w:spacing w:after="120"/>
+      </w:pPr>
+      <w:r>
+        <w:rPr>
+          <w:rFonts w:ascii="Arial" w:cs="Arial" w:eastAsia="Arial" w:hAnsi="Arial"/>
+          <w:b/>
+          <w:bCs/>
+          <w:sz w:val="21"/>
+          <w:szCs w:val="21"/>
+        </w:rPr>
+        <w:t xml:space="preserve">Paste:</w:t>
+      </w:r>
+      <w:r>
+        <w:rPr>
+          <w:rFonts w:ascii="Arial" w:cs="Arial" w:eastAsia="Arial" w:hAnsi="Arial"/>
+          <w:sz w:val="21"/>
+          <w:szCs w:val="21"/>
+        </w:rPr>
+        <w:t xml:space="preserve"> @user_guide/excise_diagnostic_process.md Follow this file. Run stage A1 for Indonesia, 2020 to 2026-09-30. Search the web for the laws. Stop after A1.</w:t>
+      </w:r>
+    </w:p>
+    <w:p>
+      <w:pPr>
+        <w:spacing w:after="120"/>
+      </w:pPr>
+      <w:r>
+        <w:rPr>
+          <w:rFonts w:ascii="Arial" w:cs="Arial" w:eastAsia="Arial" w:hAnsi="Arial"/>
+          <w:b/>
+          <w:bCs/>
+          <w:sz w:val="21"/>
+          <w:szCs w:val="21"/>
+        </w:rPr>
+        <w:t xml:space="preserve">Then, one at a time:</w:t>
+      </w:r>
+      <w:r>
+        <w:rPr>
+          <w:rFonts w:ascii="Arial" w:cs="Arial" w:eastAsia="Arial" w:hAnsi="Arial"/>
+          <w:sz w:val="21"/>
+          <w:szCs w:val="21"/>
+        </w:rPr>
+        <w:t xml:space="preserve"> Run stage A2. · Run stage A3. · Run stage A4. · Run stage A5. · Run stage A6. Save the Word report and Excel workbook in ExciseDiagnostic/country_results/Indonesia/.</w:t>
+      </w:r>
+    </w:p>
+    <w:p>
+      <w:pPr>
+        <w:spacing w:after="120"/>
+      </w:pPr>
+      <w:r>
+        <w:rPr>
+          <w:rFonts w:ascii="Arial" w:cs="Arial" w:eastAsia="Arial" w:hAnsi="Arial"/>
+          <w:b/>
+          <w:bCs/>
+          <w:sz w:val="21"/>
+          <w:szCs w:val="21"/>
+        </w:rPr>
+        <w:t xml:space="preserve">Check:</w:t>
+      </w:r>
+      <w:r>
+        <w:rPr>
+          <w:rFonts w:ascii="Arial" w:cs="Arial" w:eastAsia="Arial" w:hAnsi="Arial"/>
+          <w:sz w:val="21"/>
+          <w:szCs w:val="21"/>
+        </w:rPr>
+        <w:t xml:space="preserve"> every rate quoted with its date and a source link; missing data says data_gap.</w:t>
+      </w:r>
+    </w:p>
+    <w:p>
+      <w:pPr>
+        <w:pStyle w:val="Heading2"/>
+        <w:spacing w:after="100" w:before="200"/>
+      </w:pPr>
+      <w:r>
+        <w:rPr>
+          <w:rFonts w:ascii="Arial" w:cs="Arial" w:eastAsia="Arial" w:hAnsi="Arial"/>
+          <w:b/>
+          <w:bCs/>
+          <w:sz w:val="24"/>
+          <w:szCs w:val="24"/>
+        </w:rPr>
+        <w:t xml:space="preserve">Tool 2. Add tax indicators to the dashboard (Claude Sonnet · Interactive)</w:t>
+      </w:r>
+    </w:p>
+    <w:p>
+      <w:pPr>
+        <w:spacing w:after="120"/>
+      </w:pPr>
+      <w:r>
+        <w:rPr>
+          <w:rFonts w:ascii="Arial" w:cs="Arial" w:eastAsia="Arial" w:hAnsi="Arial"/>
+          <w:b/>
+          <w:bCs/>
+          <w:sz w:val="21"/>
+          <w:szCs w:val="21"/>
+        </w:rPr>
+        <w:t xml:space="preserve">Repo:</w:t>
+      </w:r>
+      <w:r>
+        <w:rPr>
+          <w:rFonts w:ascii="Arial" w:cs="Arial" w:eastAsia="Arial" w:hAnsi="Arial"/>
+          <w:sz w:val="21"/>
+          <w:szCs w:val="21"/>
+        </w:rPr>
+        <w:t xml:space="preserve"> https://github.com/cpmodelai/climate-fiscal-ai-tools · </w:t>
+      </w:r>
+      <w:r>
+        <w:rPr>
+          <w:rFonts w:ascii="Arial" w:cs="Arial" w:eastAsia="Arial" w:hAnsi="Arial"/>
+          <w:b/>
+          <w:bCs/>
+          <w:sz w:val="21"/>
+          <w:szCs w:val="21"/>
+        </w:rPr>
+        <w:t xml:space="preserve">Folder:</w:t>
+      </w:r>
+      <w:r>
+        <w:rPr>
+          <w:rFonts w:ascii="Arial" w:cs="Arial" w:eastAsia="Arial" w:hAnsi="Arial"/>
+          <w:sz w:val="21"/>
+          <w:szCs w:val="21"/>
+        </w:rPr>
+        <w:t xml:space="preserve"> Repos\climate-fiscal-ai-tools</w:t>
+      </w:r>
+    </w:p>
+    <w:p>
+      <w:pPr>
+        <w:spacing w:after="120"/>
+      </w:pPr>
+      <w:r>
+        <w:rPr>
+          <w:rFonts w:ascii="Arial" w:cs="Arial" w:eastAsia="Arial" w:hAnsi="Arial"/>
+          <w:b/>
+          <w:bCs/>
+          <w:sz w:val="21"/>
+          <w:szCs w:val="21"/>
+        </w:rPr>
+        <w:t xml:space="preserve">Paste:</w:t>
+      </w:r>
+      <w:r>
+        <w:rPr>
+          <w:rFonts w:ascii="Arial" w:cs="Arial" w:eastAsia="Arial" w:hAnsi="Arial"/>
+          <w:sz w:val="21"/>
+          <w:szCs w:val="21"/>
+        </w:rPr>
+        <w:t xml:space="preserve"> Add VAT, personal income tax, corporate income tax and excises (% of GDP) to the dashboard, under Tax revenue, from the IMF WoRLD file already in raw_data. Follow TaxMacroFiscalDashboard/build/README.md. Do not change anything else. Then rebuild and show me Indonesia.</w:t>
+      </w:r>
+    </w:p>
+    <w:p>
+      <w:pPr>
+        <w:spacing w:after="120"/>
+      </w:pPr>
+      <w:r>
+        <w:rPr>
+          <w:rFonts w:ascii="Arial" w:cs="Arial" w:eastAsia="Arial" w:hAnsi="Arial"/>
+          <w:b/>
+          <w:bCs/>
+          <w:sz w:val="21"/>
+          <w:szCs w:val="21"/>
+        </w:rPr>
+        <w:t xml:space="preserve">Then:</w:t>
+      </w:r>
+      <w:r>
+        <w:rPr>
+          <w:rFonts w:ascii="Arial" w:cs="Arial" w:eastAsia="Arial" w:hAnsi="Arial"/>
+          <w:sz w:val="21"/>
+          <w:szCs w:val="21"/>
+        </w:rPr>
+        <w:t xml:space="preserve"> Commit and push with a clear message.</w:t>
+      </w:r>
+    </w:p>
+    <w:p>
+      <w:pPr>
+        <w:spacing w:after="120"/>
+      </w:pPr>
+      <w:r>
+        <w:rPr>
+          <w:rFonts w:ascii="Arial" w:cs="Arial" w:eastAsia="Arial" w:hAnsi="Arial"/>
+          <w:b/>
+          <w:bCs/>
+          <w:sz w:val="21"/>
+          <w:szCs w:val="21"/>
+        </w:rPr>
+        <w:t xml:space="preserve">Check:</w:t>
+      </w:r>
+      <w:r>
+        <w:rPr>
+          <w:rFonts w:ascii="Arial" w:cs="Arial" w:eastAsia="Arial" w:hAnsi="Arial"/>
+          <w:sz w:val="21"/>
+          <w:szCs w:val="21"/>
+        </w:rPr>
+        <w:t xml:space="preserve"> Indonesia, % of GDP: tax 10.08 · VAT 3.52 · corporate 2.65 · personal 1.79 · excises 1.11</w:t>
+      </w:r>
+    </w:p>
+    <w:p>
+      <w:pPr>
+        <w:pStyle w:val="Heading2"/>
+        <w:spacing w:after="100" w:before="200"/>
+      </w:pPr>
+      <w:r>
+        <w:rPr>
+          <w:rFonts w:ascii="Arial" w:cs="Arial" w:eastAsia="Arial" w:hAnsi="Arial"/>
+          <w:b/>
+          <w:bCs/>
+          <w:sz w:val="24"/>
+          <w:szCs w:val="24"/>
+        </w:rPr>
+        <w:t xml:space="preserve">Tool 3. Make an update to CPAT-AI (Claude Opus · Interactive)</w:t>
+      </w:r>
+    </w:p>
+    <w:p>
+      <w:pPr>
+        <w:spacing w:after="120"/>
+      </w:pPr>
+      <w:r>
+        <w:rPr>
+          <w:rFonts w:ascii="Arial" w:cs="Arial" w:eastAsia="Arial" w:hAnsi="Arial"/>
+          <w:b/>
+          <w:bCs/>
+          <w:sz w:val="21"/>
+          <w:szCs w:val="21"/>
+        </w:rPr>
+        <w:t xml:space="preserve">Repo:</w:t>
+      </w:r>
+      <w:r>
+        <w:rPr>
+          <w:rFonts w:ascii="Arial" w:cs="Arial" w:eastAsia="Arial" w:hAnsi="Arial"/>
+          <w:sz w:val="21"/>
+          <w:szCs w:val="21"/>
+        </w:rPr>
+        <w:t xml:space="preserve"> https://github.com/cpmodelai/cpat_ai · </w:t>
+      </w:r>
+      <w:r>
+        <w:rPr>
+          <w:rFonts w:ascii="Arial" w:cs="Arial" w:eastAsia="Arial" w:hAnsi="Arial"/>
+          <w:b/>
+          <w:bCs/>
+          <w:sz w:val="21"/>
+          <w:szCs w:val="21"/>
+        </w:rPr>
+        <w:t xml:space="preserve">Folder:</w:t>
+      </w:r>
+      <w:r>
+        <w:rPr>
+          <w:rFonts w:ascii="Arial" w:cs="Arial" w:eastAsia="Arial" w:hAnsi="Arial"/>
+          <w:sz w:val="21"/>
+          <w:szCs w:val="21"/>
+        </w:rPr>
+        <w:t xml:space="preserve"> Repos\CPAT-AI</w:t>
+      </w:r>
+    </w:p>
+    <w:p>
+      <w:pPr>
+        <w:spacing w:after="120"/>
+      </w:pPr>
+      <w:r>
+        <w:rPr>
+          <w:rFonts w:ascii="Arial" w:cs="Arial" w:eastAsia="Arial" w:hAnsi="Arial"/>
+          <w:sz w:val="21"/>
+          <w:szCs w:val="21"/>
+        </w:rPr>
+        <w:t xml:space="preserve">Attach the rules: type @ and pick AGENTS.md (or drag the file onto the prompt box). It points Copilot to NORMS.md, CAVEATS.md and the to-do lists, so it follows the repo’s rules.</w:t>
+      </w:r>
+    </w:p>
+    <w:p>
+      <w:pPr>
+        <w:spacing w:after="120"/>
+      </w:pPr>
+      <w:r>
+        <w:rPr>
+          <w:rFonts w:ascii="Arial" w:cs="Arial" w:eastAsia="Arial" w:hAnsi="Arial"/>
+          <w:b/>
+          <w:bCs/>
+          <w:sz w:val="21"/>
+          <w:szCs w:val="21"/>
+        </w:rPr>
+        <w:t xml:space="preserve">Paste (fill in your change):</w:t>
+      </w:r>
+      <w:r>
+        <w:rPr>
+          <w:rFonts w:ascii="Arial" w:cs="Arial" w:eastAsia="Arial" w:hAnsi="Arial"/>
+          <w:sz w:val="21"/>
+          <w:szCs w:val="21"/>
+        </w:rPr>
+        <w:t xml:space="preserve"> @AGENTS.md Follow this file and the documents it points to. In the mitigation prototype, &lt;describe your change&gt;. Never replicate a legacy bug; replicate legacy issues and register them. Rebuild, run excel_ai/mitigation/check_quick.py and show me the result. Then add the entry at the bottom of CAVEATS.md and update excel_ai/plans/TODO.md.</w:t>
+      </w:r>
+    </w:p>
+    <w:p>
+      <w:pPr>
+        <w:spacing w:after="120"/>
+      </w:pPr>
+      <w:r>
+        <w:rPr>
+          <w:rFonts w:ascii="Arial" w:cs="Arial" w:eastAsia="Arial" w:hAnsi="Arial"/>
+          <w:b/>
+          <w:bCs/>
+          <w:sz w:val="21"/>
+          <w:szCs w:val="21"/>
+        </w:rPr>
+        <w:t xml:space="preserve">Then, one at a time:</w:t>
+      </w:r>
+      <w:r>
+        <w:rPr>
+          <w:rFonts w:ascii="Arial" w:cs="Arial" w:eastAsia="Arial" w:hAnsi="Arial"/>
+          <w:sz w:val="21"/>
+          <w:szCs w:val="21"/>
+        </w:rPr>
+        <w:t xml:space="preserve"> Show me the changes before you save them. · Commit and push with a clear message.</w:t>
+      </w:r>
+    </w:p>
+    <w:p>
+      <w:pPr>
+        <w:spacing w:after="120"/>
+      </w:pPr>
+      <w:r>
+        <w:rPr>
+          <w:rFonts w:ascii="Arial" w:cs="Arial" w:eastAsia="Arial" w:hAnsi="Arial"/>
+          <w:b/>
+          <w:bCs/>
+          <w:sz w:val="21"/>
+          <w:szCs w:val="21"/>
+        </w:rPr>
+        <w:t xml:space="preserve">Rules the repo sets (AGENTS.md):</w:t>
+      </w:r>
+    </w:p>
+    <w:p>
+      <w:pPr>
+        <w:pStyle w:val="ListParagraph"/>
+        <w:numPr>
+          <w:ilvl w:val="0"/>
+          <w:numId w:val="2"/>
+        </w:numPr>
+        <w:spacing w:after="60"/>
+      </w:pPr>
+      <w:r>
+        <w:rPr>
+          <w:rFonts w:ascii="Arial" w:cs="Arial" w:eastAsia="Arial" w:hAnsi="Arial"/>
+          <w:sz w:val="21"/>
+          <w:szCs w:val="21"/>
+        </w:rPr>
+        <w:t xml:space="preserve">Never edit a released workbook: the build writes a new version.</w:t>
+      </w:r>
+    </w:p>
+    <w:p>
+      <w:pPr>
+        <w:pStyle w:val="ListParagraph"/>
+        <w:numPr>
+          <w:ilvl w:val="0"/>
+          <w:numId w:val="2"/>
+        </w:numPr>
+        <w:spacing w:after="60"/>
+      </w:pPr>
+      <w:r>
+        <w:rPr>
+          <w:rFonts w:ascii="Arial" w:cs="Arial" w:eastAsia="Arial" w:hAnsi="Arial"/>
+          <w:sz w:val="21"/>
+          <w:szCs w:val="21"/>
+        </w:rPr>
+        <w:t xml:space="preserve">All data go in data/, with the script that converts them.</w:t>
+      </w:r>
+    </w:p>
+    <w:p>
+      <w:pPr>
+        <w:pStyle w:val="ListParagraph"/>
+        <w:numPr>
+          <w:ilvl w:val="0"/>
+          <w:numId w:val="2"/>
+        </w:numPr>
+        <w:spacing w:after="60"/>
+      </w:pPr>
+      <w:r>
+        <w:rPr>
+          <w:rFonts w:ascii="Arial" w:cs="Arial" w:eastAsia="Arial" w:hAnsi="Arial"/>
+          <w:sz w:val="21"/>
+          <w:szCs w:val="21"/>
+        </w:rPr>
+        <w:t xml:space="preserve">Every finished task ends with an entry at the bottom of CAVEATS.md.</w:t>
+      </w:r>
+    </w:p>
+    <w:p>
+      <w:pPr>
+        <w:pStyle w:val="ListParagraph"/>
+        <w:numPr>
+          <w:ilvl w:val="0"/>
+          <w:numId w:val="2"/>
+        </w:numPr>
+        <w:spacing w:after="60"/>
+      </w:pPr>
+      <w:r>
+        <w:rPr>
+          <w:rFonts w:ascii="Arial" w:cs="Arial" w:eastAsia="Arial" w:hAnsi="Arial"/>
+          <w:sz w:val="21"/>
+          <w:szCs w:val="21"/>
+        </w:rPr>
+        <w:t xml:space="preserve">Copilot does not commit unless you ask.</w:t>
+      </w:r>
+    </w:p>
+    <w:p>
+      <w:pPr>
+        <w:pStyle w:val="ListParagraph"/>
+        <w:numPr>
+          <w:ilvl w:val="0"/>
+          <w:numId w:val="2"/>
+        </w:numPr>
+        <w:spacing w:after="60"/>
+      </w:pPr>
+      <w:r>
+        <w:rPr>
+          <w:rFonts w:ascii="Arial" w:cs="Arial" w:eastAsia="Arial" w:hAnsi="Arial"/>
+          <w:sz w:val="21"/>
+          <w:szCs w:val="21"/>
+        </w:rPr>
+        <w:t xml:space="preserve">The checks need Python 3, openpyxl and LibreOffice. Use Claude Sonnet for text-only edits.</w:t>
+      </w:r>
+    </w:p>
+    <w:p>
+      <w:pPr>
+        <w:spacing w:after="120"/>
+      </w:pPr>
+      <w:r>
+        <w:rPr>
+          <w:rFonts w:ascii="Arial" w:cs="Arial" w:eastAsia="Arial" w:hAnsi="Arial"/>
+          <w:b/>
+          <w:bCs/>
+          <w:sz w:val="21"/>
+          <w:szCs w:val="21"/>
+        </w:rPr>
+        <w:t xml:space="preserve">Check:</w:t>
+      </w:r>
+      <w:r>
+        <w:rPr>
+          <w:rFonts w:ascii="Arial" w:cs="Arial" w:eastAsia="Arial" w:hAnsi="Arial"/>
+          <w:sz w:val="21"/>
+          <w:szCs w:val="21"/>
+        </w:rPr>
+        <w:t xml:space="preserve"> check_quick.py says PASS; a new entry at the bottom of CAVEATS.md; the change shows on github.com/cpmodelai/cpat_ai.</w:t>
+      </w:r>
+    </w:p>
+    <w:p>
+      <w:pPr>
+        <w:pStyle w:val="Heading2"/>
+        <w:spacing w:after="100" w:before="200"/>
+      </w:pPr>
+      <w:r>
+        <w:rPr>
+          <w:rFonts w:ascii="Arial" w:cs="Arial" w:eastAsia="Arial" w:hAnsi="Arial"/>
+          <w:b/>
+          <w:bCs/>
+          <w:sz w:val="24"/>
+          <w:szCs w:val="24"/>
+        </w:rPr>
+        <w:t xml:space="preserve">Step 3. Save your work to GitHub</w:t>
+      </w:r>
+    </w:p>
+    <w:p>
+      <w:pPr>
+        <w:spacing w:after="120"/>
+      </w:pPr>
+      <w:r>
+        <w:rPr>
+          <w:rFonts w:ascii="Arial" w:cs="Arial" w:eastAsia="Arial" w:hAnsi="Arial"/>
+          <w:b/>
+          <w:bCs/>
+          <w:sz w:val="21"/>
+          <w:szCs w:val="21"/>
+        </w:rPr>
+        <w:t xml:space="preserve">1. Ask Copilot.</w:t>
+      </w:r>
+      <w:r>
+        <w:rPr>
+          <w:rFonts w:ascii="Arial" w:cs="Arial" w:eastAsia="Arial" w:hAnsi="Arial"/>
+          <w:sz w:val="21"/>
+          <w:szCs w:val="21"/>
+        </w:rPr>
+        <w:t xml:space="preserve"> Type: Commit and push with a clear message. Approve what it shows.</w:t>
+      </w:r>
+    </w:p>
+    <w:p>
+      <w:pPr>
+        <w:spacing w:after="120"/>
+      </w:pPr>
+      <w:r>
+        <w:rPr>
+          <w:rFonts w:ascii="Arial" w:cs="Arial" w:eastAsia="Arial" w:hAnsi="Arial"/>
+          <w:b/>
+          <w:bCs/>
+          <w:sz w:val="21"/>
+          <w:szCs w:val="21"/>
+        </w:rPr>
+        <w:t xml:space="preserve">2. Or use the script.</w:t>
+      </w:r>
+      <w:r>
+        <w:rPr>
+          <w:rFonts w:ascii="Arial" w:cs="Arial" w:eastAsia="Arial" w:hAnsi="Arial"/>
+          <w:sz w:val="21"/>
+          <w:szCs w:val="21"/>
+        </w:rPr>
+        <w:t xml:space="preserve"> Double-click SyncAllRepos.bat in your Repos folder (all repos at once), or SyncRepo.bat in the repo folder where there is one.</w:t>
+      </w:r>
+    </w:p>
+    <w:p>
+      <w:pPr>
+        <w:spacing w:after="120"/>
+      </w:pPr>
+      <w:r>
+        <w:rPr>
+          <w:rFonts w:ascii="Arial" w:cs="Arial" w:eastAsia="Arial" w:hAnsi="Arial"/>
+          <w:b/>
+          <w:bCs/>
+          <w:sz w:val="21"/>
+          <w:szCs w:val="21"/>
+        </w:rPr>
+        <w:t xml:space="preserve">3. Check.</w:t>
+      </w:r>
+      <w:r>
+        <w:rPr>
+          <w:rFonts w:ascii="Arial" w:cs="Arial" w:eastAsia="Arial" w:hAnsi="Arial"/>
+          <w:sz w:val="21"/>
+          <w:szCs w:val="21"/>
+        </w:rPr>
+        <w:t xml:space="preserve"> On github.com/cpmodelai/climate-fiscal-ai-tools (Tools 1-2) or github.com/cpmodelai/cpat_ai (Tool 3), your change shows as the latest commit.</w:t>
+      </w:r>
+    </w:p>
+    <w:p>
+      <w:pPr>
+        <w:spacing w:after="120"/>
+      </w:pPr>
+      <w:r>
+        <w:rPr>
+          <w:rFonts w:ascii="Arial" w:cs="Arial" w:eastAsia="Arial" w:hAnsi="Arial"/>
+          <w:sz w:val="21"/>
+          <w:szCs w:val="21"/>
+        </w:rPr>
+        <w:t xml:space="preserve">With Claude instead: on claude.ai make a Project, add excise_diagnostic_process.md, switch on Research, and paste the same prompts.</w:t>
+      </w:r>
+    </w:p>
+    <w:p>
+      <w:pPr>
+        <w:pStyle w:val="Heading2"/>
+        <w:spacing w:after="100" w:before="200"/>
+      </w:pPr>
+      <w:r>
+        <w:rPr>
+          <w:rFonts w:ascii="Arial" w:cs="Arial" w:eastAsia="Arial" w:hAnsi="Arial"/>
+          <w:b/>
+          <w:bCs/>
+          <w:sz w:val="24"/>
+          <w:szCs w:val="24"/>
+        </w:rPr>
+        <w:t xml:space="preserve">Part 4. Git in brief</w:t>
+      </w:r>
+    </w:p>
+    <w:p>
+      <w:pPr>
+        <w:spacing w:after="120"/>
+      </w:pPr>
+      <w:r>
+        <w:rPr>
+          <w:rFonts w:ascii="Arial" w:cs="Arial" w:eastAsia="Arial" w:hAnsi="Arial"/>
+          <w:sz w:val="21"/>
+          <w:szCs w:val="21"/>
+        </w:rPr>
+        <w:t xml:space="preserve">Git keeps every version of every file in a repo. Your Repos folder holds a local copy of each repo; GitHub holds the shared copy. The scripts in </w:t>
+      </w:r>
+      <w:r>
+        <w:rPr>
+          <w:rFonts w:ascii="Arial" w:cs="Arial" w:eastAsia="Arial" w:hAnsi="Arial"/>
+          <w:b/>
+          <w:bCs/>
+          <w:sz w:val="21"/>
+          <w:szCs w:val="21"/>
+        </w:rPr>
+        <w:t xml:space="preserve">repo-tools</w:t>
+      </w:r>
+      <w:r>
+        <w:rPr>
+          <w:rFonts w:ascii="Arial" w:cs="Arial" w:eastAsia="Arial" w:hAnsi="Arial"/>
+          <w:sz w:val="21"/>
+          <w:szCs w:val="21"/>
+        </w:rPr>
+        <w:t xml:space="preserve"> (CloneRepos.bat, SyncRepo.bat, SyncAllRepos.bat) do the usual steps for you.</w:t>
+      </w:r>
+    </w:p>
+    <w:p>
+      <w:pPr>
+        <w:spacing w:after="120"/>
+      </w:pPr>
+      <w:r>
+        <w:rPr>
+          <w:rFonts w:ascii="Arial" w:cs="Arial" w:eastAsia="Arial" w:hAnsi="Arial"/>
+          <w:b/>
+          <w:bCs/>
+          <w:sz w:val="21"/>
+          <w:szCs w:val="21"/>
+        </w:rPr>
+        <w:t xml:space="preserve">Word</w:t>
+      </w:r>
+      <w:r>
+        <w:rPr>
+          <w:rFonts w:ascii="Arial" w:cs="Arial" w:eastAsia="Arial" w:hAnsi="Arial"/>
+          <w:sz w:val="21"/>
+          <w:szCs w:val="21"/>
+        </w:rPr>
+        <w:t xml:space="preserve"> · </w:t>
+      </w:r>
+      <w:r>
+        <w:rPr>
+          <w:rFonts w:ascii="Arial" w:cs="Arial" w:eastAsia="Arial" w:hAnsi="Arial"/>
+          <w:b/>
+          <w:bCs/>
+          <w:sz w:val="21"/>
+          <w:szCs w:val="21"/>
+        </w:rPr>
+        <w:t xml:space="preserve">What it means</w:t>
+      </w:r>
+    </w:p>
+    <w:p>
+      <w:pPr>
+        <w:spacing w:after="120"/>
+      </w:pPr>
+      <w:r>
+        <w:rPr>
+          <w:rFonts w:ascii="Arial" w:cs="Arial" w:eastAsia="Arial" w:hAnsi="Arial"/>
+          <w:sz w:val="21"/>
+          <w:szCs w:val="21"/>
+        </w:rPr>
+        <w:t xml:space="preserve">clone · Download a repo to your laptop, once (CloneRepos.bat).</w:t>
+      </w:r>
+    </w:p>
+    <w:p>
+      <w:pPr>
+        <w:spacing w:after="120"/>
+      </w:pPr>
+      <w:r>
+        <w:rPr>
+          <w:rFonts w:ascii="Arial" w:cs="Arial" w:eastAsia="Arial" w:hAnsi="Arial"/>
+          <w:sz w:val="21"/>
+          <w:szCs w:val="21"/>
+        </w:rPr>
+        <w:t xml:space="preserve">pull · Get everyone else’s changes from GitHub.</w:t>
+      </w:r>
+    </w:p>
+    <w:p>
+      <w:pPr>
+        <w:spacing w:after="120"/>
+      </w:pPr>
+      <w:r>
+        <w:rPr>
+          <w:rFonts w:ascii="Arial" w:cs="Arial" w:eastAsia="Arial" w:hAnsi="Arial"/>
+          <w:sz w:val="21"/>
+          <w:szCs w:val="21"/>
+        </w:rPr>
+        <w:t xml:space="preserve">commit · Save a snapshot of your changes, with a one-line message.</w:t>
+      </w:r>
+    </w:p>
+    <w:p>
+      <w:pPr>
+        <w:spacing w:after="120"/>
+      </w:pPr>
+      <w:r>
+        <w:rPr>
+          <w:rFonts w:ascii="Arial" w:cs="Arial" w:eastAsia="Arial" w:hAnsi="Arial"/>
+          <w:sz w:val="21"/>
+          <w:szCs w:val="21"/>
+        </w:rPr>
+        <w:t xml:space="preserve">push · Send your commits to GitHub so others get them.</w:t>
+      </w:r>
+    </w:p>
+    <w:p>
+      <w:pPr>
+        <w:spacing w:after="120"/>
+      </w:pPr>
+      <w:r>
+        <w:rPr>
+          <w:rFonts w:ascii="Arial" w:cs="Arial" w:eastAsia="Arial" w:hAnsi="Arial"/>
+          <w:sz w:val="21"/>
+          <w:szCs w:val="21"/>
+        </w:rPr>
+        <w:t xml:space="preserve">branch · A parallel line of work. main is the shared one; AI sessions often work on their own branch.</w:t>
+      </w:r>
+    </w:p>
+    <w:p>
+      <w:pPr>
+        <w:spacing w:after="120"/>
+      </w:pPr>
+      <w:r>
+        <w:rPr>
+          <w:rFonts w:ascii="Arial" w:cs="Arial" w:eastAsia="Arial" w:hAnsi="Arial"/>
+          <w:sz w:val="21"/>
+          <w:szCs w:val="21"/>
+        </w:rPr>
+        <w:t xml:space="preserve">pull request (PR) · A request to merge a branch into main, reviewed on github.com.</w:t>
+      </w:r>
+    </w:p>
+    <w:p>
+      <w:pPr>
+        <w:spacing w:after="120"/>
+      </w:pPr>
+      <w:r>
+        <w:rPr>
+          <w:rFonts w:ascii="Arial" w:cs="Arial" w:eastAsia="Arial" w:hAnsi="Arial"/>
+          <w:sz w:val="21"/>
+          <w:szCs w:val="21"/>
+        </w:rPr>
+        <w:t xml:space="preserve">merge conflict · You and someone else changed the same lines; git asks which version to keep.</w:t>
+      </w:r>
+    </w:p>
+    <w:p>
+      <w:pPr>
+        <w:spacing w:after="120"/>
+      </w:pPr>
+      <w:r>
+        <w:rPr>
+          <w:rFonts w:ascii="Arial" w:cs="Arial" w:eastAsia="Arial" w:hAnsi="Arial"/>
+          <w:b/>
+          <w:bCs/>
+          <w:sz w:val="21"/>
+          <w:szCs w:val="21"/>
+        </w:rPr>
+        <w:t xml:space="preserve">Every day:</w:t>
+      </w:r>
+      <w:r>
+        <w:rPr>
+          <w:rFonts w:ascii="Arial" w:cs="Arial" w:eastAsia="Arial" w:hAnsi="Arial"/>
+          <w:sz w:val="21"/>
+          <w:szCs w:val="21"/>
+        </w:rPr>
+        <w:t xml:space="preserve"> double-click SyncAllRepos.bat (or SyncRepo.bat in one repo). It switches to main, pulls, then commits and pushes your changes with the message you type.</w:t>
+      </w:r>
+    </w:p>
+    <w:p>
+      <w:pPr>
+        <w:spacing w:after="120"/>
+      </w:pPr>
+      <w:r>
+        <w:rPr>
+          <w:rFonts w:ascii="Arial" w:cs="Arial" w:eastAsia="Arial" w:hAnsi="Arial"/>
+          <w:b/>
+          <w:bCs/>
+          <w:sz w:val="21"/>
+          <w:szCs w:val="21"/>
+        </w:rPr>
+        <w:t xml:space="preserve">If the sync stops with a conflict or a failed push, use GitHub Desktop.</w:t>
+      </w:r>
+      <w:r>
+        <w:rPr>
+          <w:rFonts w:ascii="Arial" w:cs="Arial" w:eastAsia="Arial" w:hAnsi="Arial"/>
+          <w:sz w:val="21"/>
+          <w:szCs w:val="21"/>
+        </w:rPr>
+        <w:t xml:space="preserve"> File → Add local repository, pick the repo folder. It lists the files in conflict; for each one choose Open in editor (or “Use mine” / “Use theirs”), keep the right text, then click Continue merge, then Push origin. For a binary file (Excel, Word) pick one whole version and copy your changes into it by hand. If in doubt, copy your changed files somewhere safe first, or ask an AI session to resolve the merge.</w:t>
+      </w:r>
+    </w:p>
+    <w:p>
+      <w:pPr>
+        <w:spacing w:after="120"/>
+      </w:pPr>
+      <w:r>
+        <w:rPr>
+          <w:rFonts w:ascii="Arial" w:cs="Arial" w:eastAsia="Arial" w:hAnsi="Arial"/>
+          <w:b/>
+          <w:bCs/>
+          <w:sz w:val="21"/>
+          <w:szCs w:val="21"/>
+        </w:rPr>
+        <w:t xml:space="preserve">Never commit real data.</w:t>
+      </w:r>
+      <w:r>
+        <w:rPr>
+          <w:rFonts w:ascii="Arial" w:cs="Arial" w:eastAsia="Arial" w:hAnsi="Arial"/>
+          <w:sz w:val="21"/>
+          <w:szCs w:val="21"/>
+        </w:rPr>
+        <w:t xml:space="preserve"> Before every sync, check the list of changed files: no CPAT workbook or export holding proprietary data (see the CPAT-AI quick start, section 4).</w:t>
       </w:r>
     </w:p>
     <w:sectPr>

</xml_diff>